<commit_message>
Unify manager report Word templates and cover layout
</commit_message>
<xml_diff>
--- a/assets/report-templates/manager-reports/academic-achievement-committee.docx
+++ b/assets/report-templates/manager-reports/academic-achievement-committee.docx
@@ -1,7 +1,1489 @@
 
 <file path=word/document.xml><?xml version="1.0" encoding="utf-8"?>
-<w:document xmlns:wpc="http://schemas.microsoft.com/office/word/2010/wordprocessingCanvas" xmlns:cx="http://schemas.microsoft.com/office/drawing/2014/chartex" xmlns:cx1="http://schemas.microsoft.com/office/drawing/2015/9/8/chartex" xmlns:cx2="http://schemas.microsoft.com/office/drawing/2015/10/21/chartex" xmlns:cx3="http://schemas.microsoft.com/office/drawing/2016/5/9/chartex" xmlns:cx4="http://schemas.microsoft.com/office/drawing/2016/5/10/chartex" xmlns:cx5="http://schemas.microsoft.com/office/drawing/2016/5/11/chartex" xmlns:cx6="http://schemas.microsoft.com/office/drawing/2016/5/12/chartex" xmlns:cx7="http://schemas.microsoft.com/office/drawing/2016/5/13/chartex" xmlns:cx8="http://schemas.microsoft.com/office/drawing/2016/5/14/chartex" xmlns:mc="http://schemas.openxmlformats.org/markup-compatibility/2006" xmlns:aink="http://schemas.microsoft.com/office/drawing/2016/ink" xmlns:am3d="http://schemas.microsoft.com/office/drawing/2017/model3d" xmlns:o="urn:schemas-microsoft-com:office:office" xmlns:oel="http://schemas.microsoft.com/office/2019/extlst" xmlns:r="http://schemas.openxmlformats.org/officeDocument/2006/relationships" xmlns:m="http://schemas.openxmlformats.org/officeDocument/2006/math" xmlns:v="urn:schemas-microsoft-com:vml" xmlns:wp14="http://schemas.microsoft.com/office/word/2010/wordprocessingDrawing" xmlns:wp="http://schemas.openxmlformats.org/drawingml/2006/wordprocessingDrawing" xmlns:w10="urn:schemas-microsoft-com:office:word" xmlns:w="http://schemas.openxmlformats.org/wordprocessingml/2006/main" xmlns:w14="http://schemas.microsoft.com/office/word/2010/wordml" xmlns:w15="http://schemas.microsoft.com/office/word/2012/wordml" xmlns:w16cex="http://schemas.microsoft.com/office/word/2018/wordml/cex" xmlns:w16cid="http://schemas.microsoft.com/office/word/2016/wordml/cid" xmlns:w16="http://schemas.microsoft.com/office/word/2018/wordml" xmlns:w16du="http://schemas.microsoft.com/office/word/2023/wordml/word16du" xmlns:w16sdtdh="http://schemas.microsoft.com/office/word/2020/wordml/sdtdatahash" xmlns:w16sdtfl="http://schemas.microsoft.com/office/word/2024/wordml/sdtformatlock" xmlns:w16se="http://schemas.microsoft.com/office/word/2015/wordml/symex" xmlns:wpg="http://schemas.microsoft.com/office/word/2010/wordprocessingGroup" xmlns:wpi="http://schemas.microsoft.com/office/word/2010/wordprocessingInk" xmlns:wne="http://schemas.microsoft.com/office/word/2006/wordml" xmlns:wps="http://schemas.microsoft.com/office/word/2010/wordprocessingShape" mc:Ignorable="w14 w15 w16se w16cid w16 w16cex w16sdtdh w16sdtfl w16du wp14">
+<w:document xmlns:wpc="http://schemas.microsoft.com/office/word/2010/wordprocessingCanvas" xmlns:cx="http://schemas.microsoft.com/office/drawing/2014/chartex" xmlns:cx1="http://schemas.microsoft.com/office/drawing/2015/9/8/chartex" xmlns:cx2="http://schemas.microsoft.com/office/drawing/2015/10/21/chartex" xmlns:cx3="http://schemas.microsoft.com/office/drawing/2016/5/9/chartex" xmlns:cx4="http://schemas.microsoft.com/office/drawing/2016/5/10/chartex" xmlns:cx5="http://schemas.microsoft.com/office/drawing/2016/5/11/chartex" xmlns:cx6="http://schemas.microsoft.com/office/drawing/2016/5/12/chartex" xmlns:cx7="http://schemas.microsoft.com/office/drawing/2016/5/13/chartex" xmlns:cx8="http://schemas.microsoft.com/office/drawing/2016/5/14/chartex" xmlns:mc="http://schemas.openxmlformats.org/markup-compatibility/2006" xmlns:aink="http://schemas.microsoft.com/office/drawing/2016/ink" xmlns:am3d="http://schemas.microsoft.com/office/drawing/2017/model3d" xmlns:o="urn:schemas-microsoft-com:office:office" xmlns:oel="http://schemas.microsoft.com/office/2019/extlst" xmlns:r="http://schemas.openxmlformats.org/officeDocument/2006/relationships" xmlns:m="http://schemas.openxmlformats.org/officeDocument/2006/math" xmlns:v="urn:schemas-microsoft-com:vml" xmlns:wp14="http://schemas.microsoft.com/office/word/2010/wordprocessingDrawing" xmlns:wp="http://schemas.openxmlformats.org/drawingml/2006/wordprocessingDrawing" xmlns:w10="urn:schemas-microsoft-com:office:word" xmlns:w="http://schemas.openxmlformats.org/wordprocessingml/2006/main" xmlns:w14="http://schemas.microsoft.com/office/word/2010/wordml" xmlns:w15="http://schemas.microsoft.com/office/word/2012/wordml" xmlns:w16cei="http://schemas.microsoft.com/office/word/2026/wordml/cei" xmlns:w16cex="http://schemas.microsoft.com/office/word/2018/wordml/cex" xmlns:w16cid="http://schemas.microsoft.com/office/word/2016/wordml/cid" xmlns:w16="http://schemas.microsoft.com/office/word/2018/wordml" xmlns:w16du="http://schemas.microsoft.com/office/word/2023/wordml/word16du" xmlns:w16sdtdh="http://schemas.microsoft.com/office/word/2020/wordml/sdtdatahash" xmlns:w16sdtfl="http://schemas.microsoft.com/office/word/2024/wordml/sdtformatlock" xmlns:w16se="http://schemas.microsoft.com/office/word/2015/wordml/symex" xmlns:wpg="http://schemas.microsoft.com/office/word/2010/wordprocessingGroup" xmlns:wpi="http://schemas.microsoft.com/office/word/2010/wordprocessingInk" xmlns:wne="http://schemas.microsoft.com/office/word/2006/wordml" xmlns:wps="http://schemas.microsoft.com/office/word/2010/wordprocessingShape" mc:Ignorable="w14 w15 w16se w16cid w16 w16cex w16sdtdh w16sdtfl w16du wp14">
   <w:body>
+    <w:p>
+      <w:pPr>
+        <w:rPr>
+          <w:rtl/>
+        </w:rPr>
+      </w:pPr>
+      <w:r>
+        <w:rPr>
+          <w:noProof/>
+        </w:rPr>
+        <mc:AlternateContent>
+          <mc:Choice Requires="wps">
+            <w:drawing>
+              <wp:anchor distT="0" distB="0" distL="114300" distR="114300" simplePos="0" relativeHeight="251652096" behindDoc="1" locked="0" layoutInCell="1" allowOverlap="1" wp14:anchorId="2EF45EF2" wp14:editId="4B047213">
+                <wp:simplePos x="0" y="0"/>
+                <wp:positionH relativeFrom="margin">
+                  <wp:posOffset>1393190</wp:posOffset>
+                </wp:positionH>
+                <wp:positionV relativeFrom="margin">
+                  <wp:posOffset>-2952115</wp:posOffset>
+                </wp:positionV>
+                <wp:extent cx="2239200" cy="1036800"/>
+                <wp:effectExtent l="0" t="0" r="0" b="0"/>
+                <wp:wrapTight wrapText="bothSides">
+                  <wp:wrapPolygon edited="0">
+                    <wp:start x="551" y="0"/>
+                    <wp:lineTo x="551" y="21044"/>
+                    <wp:lineTo x="20951" y="21044"/>
+                    <wp:lineTo x="20951" y="0"/>
+                    <wp:lineTo x="551" y="0"/>
+                  </wp:wrapPolygon>
+                </wp:wrapTight>
+                <wp:docPr id="693259080" name="مربع نص 255"/>
+                <wp:cNvGraphicFramePr/>
+                <a:graphic xmlns:a="http://schemas.openxmlformats.org/drawingml/2006/main">
+                  <a:graphicData uri="http://schemas.microsoft.com/office/word/2010/wordprocessingShape">
+                    <wps:wsp>
+                      <wps:cNvSpPr txBox="1"/>
+                      <wps:spPr>
+                        <a:xfrm flipH="1">
+                          <a:off x="0" y="0"/>
+                          <a:ext cx="2239200" cy="1036800"/>
+                        </a:xfrm>
+                        <a:prstGeom prst="rect">
+                          <a:avLst/>
+                        </a:prstGeom>
+                        <a:noFill/>
+                        <a:ln w="6350">
+                          <a:noFill/>
+                        </a:ln>
+                        <a:effectLst/>
+                      </wps:spPr>
+                      <wps:txbx>
+                        <w:txbxContent>
+                          <w:p>
+                            <w:pPr>
+                              <w:spacing w:after="0" w:line="240" w:lineRule="auto"/>
+                              <w:rPr>
+                                <w:rFonts w:ascii="Helvetica Neue W23 for SKY Reg" w:hAnsi="Helvetica Neue W23 for SKY Reg"/>
+                                <w:b/>
+                                <w:bCs/>
+                                <w:sz w:val="32"/>
+                                <w:szCs w:val="32"/>
+                                <w:rtl/>
+                              </w:rPr>
+                            </w:pPr>
+                            <w:r>
+                              <w:rPr>
+                                <w:rFonts w:ascii="Helvetica Neue W23 for SKY Reg" w:hAnsi="Helvetica Neue W23 for SKY Reg"/>
+                                <w:b/>
+                                <w:bCs/>
+                                <w:sz w:val="28"/>
+                                <w:szCs w:val="28"/>
+                                <w:rtl/>
+                              </w:rPr>
+                              <w:t>{{educationDepartmentPrefix}}</w:t>
+                            </w:r>
+                          </w:p>
+                          <w:p>
+                            <w:pPr>
+                              <w:spacing w:after="0" w:line="240" w:lineRule="auto"/>
+                              <w:rPr>
+                                <w:rFonts w:ascii="Helvetica Neue W23 for SKY Reg" w:hAnsi="Helvetica Neue W23 for SKY Reg"/>
+                                <w:color w:val="04A9A6"/>
+                                <w:sz w:val="32"/>
+                                <w:szCs w:val="32"/>
+                              </w:rPr>
+                            </w:pPr>
+                            <w:r>
+                              <w:rPr>
+                                <w:rFonts w:ascii="Helvetica Neue W23 for SKY Reg" w:hAnsi="Helvetica Neue W23 for SKY Reg"/>
+                                <w:color w:val="04A9A6"/>
+                                <w:sz w:val="28"/>
+                                <w:szCs w:val="28"/>
+                                <w:rtl/>
+                              </w:rPr>
+                              <w:t>{{educationDepartmentName}}</w:t>
+                            </w:r>
+                          </w:p>
+                          <w:p>
+                            <w:pPr>
+                              <w:spacing w:after="0" w:line="240" w:lineRule="auto"/>
+                              <w:rPr>
+                                <w:rFonts w:ascii="Helvetica Neue W23 for SKY Reg" w:hAnsi="Helvetica Neue W23 for SKY Reg"/>
+                                <w:sz w:val="32"/>
+                                <w:szCs w:val="32"/>
+                              </w:rPr>
+                            </w:pPr>
+                            <w:r>
+                              <w:rPr>
+                                <w:rFonts w:ascii="Helvetica Neue W23 for SKY Reg" w:hAnsi="Helvetica Neue W23 for SKY Reg"/>
+                                <w:sz w:val="28"/>
+                                <w:szCs w:val="28"/>
+                                <w:rtl/>
+                              </w:rPr>
+                              <w:t>{{schoolDisplayName}}</w:t>
+                            </w:r>
+                          </w:p>
+                        </w:txbxContent>
+                      </wps:txbx>
+                      <wps:bodyPr rot="0" spcFirstLastPara="0" vertOverflow="overflow" horzOverflow="overflow" vert="horz" wrap="square" lIns="91440" tIns="45720" rIns="91440" bIns="45720" numCol="1" spcCol="0" rtlCol="0" fromWordArt="0" anchor="b" anchorCtr="0" forceAA="0" compatLnSpc="1">
+                        <a:prstTxWarp prst="textNoShape">
+                          <a:avLst/>
+                        </a:prstTxWarp>
+                        <a:noAutofit/>
+                      </wps:bodyPr>
+                    </wps:wsp>
+                  </a:graphicData>
+                </a:graphic>
+                <wp14:sizeRelH relativeFrom="page">
+                  <wp14:pctWidth>0</wp14:pctWidth>
+                </wp14:sizeRelH>
+                <wp14:sizeRelV relativeFrom="margin">
+                  <wp14:pctHeight>0</wp14:pctHeight>
+                </wp14:sizeRelV>
+              </wp:anchor>
+            </w:drawing>
+          </mc:Choice>
+          <mc:Fallback>
+            <w:pict>
+              <v:shapetype w14:anchorId="2EF45EF2" id="_x0000_t202" coordsize="21600,21600" o:spt="202" path="m,l,21600r21600,l21600,xe">
+                <v:stroke joinstyle="miter"/>
+                <v:path gradientshapeok="t" o:connecttype="rect"/>
+              </v:shapetype>
+              <v:shape id="مربع نص 255" o:spid="_x0000_s1026" type="#_x0000_t202" style="position:absolute;left:0;text-align:left;margin-left:109.7pt;margin-top:-232.45pt;width:176.3pt;height:81.65pt;flip:x;z-index:-251664384;visibility:visible;mso-wrap-style:square;mso-width-percent:0;mso-height-percent:0;mso-wrap-distance-left:9pt;mso-wrap-distance-top:0;mso-wrap-distance-right:9pt;mso-wrap-distance-bottom:0;mso-position-horizontal:absolute;mso-position-horizontal-relative:margin;mso-position-vertical:absolute;mso-position-vertical-relative:margin;mso-width-percent:0;mso-height-percent:0;mso-width-relative:page;mso-height-relative:margin;v-text-anchor:bottom" o:gfxdata="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" filled="f" stroked="f" strokeweight=".5pt">
+                <v:textbox>
+                  <w:txbxContent>
+                    <w:p>
+                      <w:pPr>
+                        <w:spacing w:after="0" w:line="240" w:lineRule="auto"/>
+                        <w:rPr>
+                          <w:rFonts w:ascii="Helvetica Neue W23 for SKY Reg" w:hAnsi="Helvetica Neue W23 for SKY Reg"/>
+                          <w:b/>
+                          <w:bCs/>
+                          <w:sz w:val="32"/>
+                          <w:szCs w:val="32"/>
+                          <w:rtl/>
+                        </w:rPr>
+                      </w:pPr>
+                      <w:r>
+                        <w:rPr>
+                          <w:rFonts w:ascii="Helvetica Neue W23 for SKY Reg" w:hAnsi="Helvetica Neue W23 for SKY Reg"/>
+                          <w:b/>
+                          <w:bCs/>
+                          <w:sz w:val="28"/>
+                          <w:szCs w:val="28"/>
+                          <w:rtl/>
+                        </w:rPr>
+                        <w:t>{{educationDepartmentPrefix}}</w:t>
+                      </w:r>
+                    </w:p>
+                    <w:p>
+                      <w:pPr>
+                        <w:spacing w:after="0" w:line="240" w:lineRule="auto"/>
+                        <w:rPr>
+                          <w:rFonts w:ascii="Helvetica Neue W23 for SKY Reg" w:hAnsi="Helvetica Neue W23 for SKY Reg"/>
+                          <w:color w:val="04A9A6"/>
+                          <w:sz w:val="32"/>
+                          <w:szCs w:val="32"/>
+                        </w:rPr>
+                      </w:pPr>
+                      <w:r>
+                        <w:rPr>
+                          <w:rFonts w:ascii="Helvetica Neue W23 for SKY Reg" w:hAnsi="Helvetica Neue W23 for SKY Reg"/>
+                          <w:color w:val="04A9A6"/>
+                          <w:sz w:val="28"/>
+                          <w:szCs w:val="28"/>
+                          <w:rtl/>
+                        </w:rPr>
+                        <w:t>{{educationDepartmentName}}</w:t>
+                      </w:r>
+                    </w:p>
+                    <w:p>
+                      <w:pPr>
+                        <w:spacing w:after="0" w:line="240" w:lineRule="auto"/>
+                        <w:rPr>
+                          <w:rFonts w:ascii="Helvetica Neue W23 for SKY Reg" w:hAnsi="Helvetica Neue W23 for SKY Reg"/>
+                          <w:sz w:val="32"/>
+                          <w:szCs w:val="32"/>
+                        </w:rPr>
+                      </w:pPr>
+                      <w:r>
+                        <w:rPr>
+                          <w:rFonts w:ascii="Helvetica Neue W23 for SKY Reg" w:hAnsi="Helvetica Neue W23 for SKY Reg"/>
+                          <w:sz w:val="28"/>
+                          <w:szCs w:val="28"/>
+                          <w:rtl/>
+                        </w:rPr>
+                        <w:t>{{schoolDisplayName}}</w:t>
+                      </w:r>
+                    </w:p>
+                  </w:txbxContent>
+                </v:textbox>
+                <w10:wrap type="tight" anchorx="margin" anchory="margin"/>
+              </v:shape>
+            </w:pict>
+          </mc:Fallback>
+        </mc:AlternateContent>
+      </w:r>
+      <w:r>
+        <w:rPr>
+          <w:rFonts w:hint="cs"/>
+          <w:noProof/>
+          <w:color w:val="7030A0"/>
+          <w:rtl/>
+        </w:rPr>
+        <w:drawing>
+          <wp:anchor distT="0" distB="0" distL="114300" distR="114300" simplePos="0" relativeHeight="251648000" behindDoc="1" locked="0" layoutInCell="1" allowOverlap="1" wp14:anchorId="6DF6F85F" wp14:editId="61845CFD">
+            <wp:simplePos x="0" y="0"/>
+            <wp:positionH relativeFrom="margin">
+              <wp:posOffset>3665220</wp:posOffset>
+            </wp:positionH>
+            <wp:positionV relativeFrom="paragraph">
+              <wp:posOffset>-2048510</wp:posOffset>
+            </wp:positionV>
+            <wp:extent cx="1447200" cy="82800"/>
+            <wp:effectExtent l="0" t="0" r="635" b="0"/>
+            <wp:wrapNone/>
+            <wp:docPr id="2138136227" name="صورة 9"/>
+            <wp:cNvGraphicFramePr>
+              <a:graphicFrameLocks xmlns:a="http://schemas.openxmlformats.org/drawingml/2006/main" noChangeAspect="1"/>
+            </wp:cNvGraphicFramePr>
+            <a:graphic xmlns:a="http://schemas.openxmlformats.org/drawingml/2006/main">
+              <a:graphicData uri="http://schemas.openxmlformats.org/drawingml/2006/picture">
+                <pic:pic xmlns:pic="http://schemas.openxmlformats.org/drawingml/2006/picture">
+                  <pic:nvPicPr>
+                    <pic:cNvPr id="2138136227" name="صورة 2138136227"/>
+                    <pic:cNvPicPr/>
+                  </pic:nvPicPr>
+                  <pic:blipFill rotWithShape="1">
+                    <a:blip r:embed="rId8" cstate="print">
+                      <a:clrChange>
+                        <a:clrFrom>
+                          <a:srgbClr val="EFEFEF"/>
+                        </a:clrFrom>
+                        <a:clrTo>
+                          <a:srgbClr val="EFEFEF">
+                            <a:alpha val="0"/>
+                          </a:srgbClr>
+                        </a:clrTo>
+                      </a:clrChange>
+                      <a:extLst>
+                        <a:ext uri="{28A0092B-C50C-407E-A947-70E740481C1C}">
+                          <a14:useLocalDpi xmlns:a14="http://schemas.microsoft.com/office/drawing/2010/main" val="0"/>
+                        </a:ext>
+                      </a:extLst>
+                    </a:blip>
+                    <a:srcRect t="91720"/>
+                    <a:stretch/>
+                  </pic:blipFill>
+                  <pic:spPr bwMode="auto">
+                    <a:xfrm>
+                      <a:off x="0" y="0"/>
+                      <a:ext cx="1447200" cy="82800"/>
+                    </a:xfrm>
+                    <a:prstGeom prst="rect">
+                      <a:avLst/>
+                    </a:prstGeom>
+                    <a:ln>
+                      <a:noFill/>
+                    </a:ln>
+                    <a:extLst>
+                      <a:ext uri="{53640926-AAD7-44D8-BBD7-CCE9431645EC}">
+                        <a14:shadowObscured xmlns:a14="http://schemas.microsoft.com/office/drawing/2010/main"/>
+                      </a:ext>
+                    </a:extLst>
+                  </pic:spPr>
+                </pic:pic>
+              </a:graphicData>
+            </a:graphic>
+            <wp14:sizeRelH relativeFrom="margin">
+              <wp14:pctWidth>0</wp14:pctWidth>
+            </wp14:sizeRelH>
+            <wp14:sizeRelV relativeFrom="margin">
+              <wp14:pctHeight>0</wp14:pctHeight>
+            </wp14:sizeRelV>
+          </wp:anchor>
+        </w:drawing>
+      </w:r>
+      <w:r>
+        <w:rPr>
+          <w:noProof/>
+          <w:color w:val="D9D9D9" w:themeColor="background1" w:themeShade="D9"/>
+        </w:rPr>
+        <w:drawing>
+          <wp:anchor distT="0" distB="0" distL="114300" distR="114300" simplePos="0" relativeHeight="251656192" behindDoc="0" locked="0" layoutInCell="1" allowOverlap="1" wp14:anchorId="583E3673" wp14:editId="3BCCF800">
+            <wp:simplePos x="0" y="0"/>
+            <wp:positionH relativeFrom="column">
+              <wp:posOffset>3665220</wp:posOffset>
+            </wp:positionH>
+            <wp:positionV relativeFrom="paragraph">
+              <wp:posOffset>-3002915</wp:posOffset>
+            </wp:positionV>
+            <wp:extent cx="46800" cy="946800"/>
+            <wp:effectExtent l="0" t="0" r="0" b="0"/>
+            <wp:wrapNone/>
+            <wp:docPr id="1650910912" name="Google Shape;87;p13"/>
+            <wp:cNvGraphicFramePr/>
+            <a:graphic xmlns:a="http://schemas.openxmlformats.org/drawingml/2006/main">
+              <a:graphicData uri="http://schemas.openxmlformats.org/drawingml/2006/picture">
+                <pic:pic xmlns:pic="http://schemas.openxmlformats.org/drawingml/2006/picture">
+                  <pic:nvPicPr>
+                    <pic:cNvPr id="87" name="Google Shape;87;p13"/>
+                    <pic:cNvPicPr preferRelativeResize="0"/>
+                  </pic:nvPicPr>
+                  <pic:blipFill rotWithShape="1">
+                    <a:blip r:embed="rId9">
+                      <a:alphaModFix/>
+                      <a:extLst>
+                        <a:ext uri="{28A0092B-C50C-407E-A947-70E740481C1C}">
+                          <a14:useLocalDpi xmlns:a14="http://schemas.microsoft.com/office/drawing/2010/main" val="0"/>
+                        </a:ext>
+                      </a:extLst>
+                    </a:blip>
+                    <a:srcRect/>
+                    <a:stretch/>
+                  </pic:blipFill>
+                  <pic:spPr>
+                    <a:xfrm flipH="1">
+                      <a:off x="0" y="0"/>
+                      <a:ext cx="46800" cy="946800"/>
+                    </a:xfrm>
+                    <a:prstGeom prst="rect">
+                      <a:avLst/>
+                    </a:prstGeom>
+                    <a:noFill/>
+                    <a:ln>
+                      <a:noFill/>
+                    </a:ln>
+                  </pic:spPr>
+                </pic:pic>
+              </a:graphicData>
+            </a:graphic>
+            <wp14:sizeRelH relativeFrom="margin">
+              <wp14:pctWidth>0</wp14:pctWidth>
+            </wp14:sizeRelH>
+            <wp14:sizeRelV relativeFrom="margin">
+              <wp14:pctHeight>0</wp14:pctHeight>
+            </wp14:sizeRelV>
+          </wp:anchor>
+        </w:drawing>
+      </w:r>
+      <w:r>
+        <w:rPr>
+          <w:noProof/>
+          <w:color w:val="D9D9D9" w:themeColor="background1" w:themeShade="D9"/>
+        </w:rPr>
+        <mc:AlternateContent>
+          <mc:Choice Requires="wps">
+            <w:drawing>
+              <wp:anchor distT="0" distB="0" distL="114300" distR="114300" simplePos="0" relativeHeight="251668480" behindDoc="1" locked="0" layoutInCell="1" allowOverlap="1" wp14:anchorId="1B973026" wp14:editId="7CF8CBF9">
+                <wp:simplePos x="0" y="0"/>
+                <wp:positionH relativeFrom="page">
+                  <wp:posOffset>0</wp:posOffset>
+                </wp:positionH>
+                <wp:positionV relativeFrom="page">
+                  <wp:posOffset>0</wp:posOffset>
+                </wp:positionV>
+                <wp:extent cx="7819200" cy="388800"/>
+                <wp:effectExtent l="0" t="0" r="0" b="0"/>
+                <wp:wrapNone/>
+                <wp:docPr id="9" name="مستطيل 4"/>
+                <wp:cNvGraphicFramePr/>
+                <a:graphic xmlns:a="http://schemas.openxmlformats.org/drawingml/2006/main">
+                  <a:graphicData uri="http://schemas.microsoft.com/office/word/2010/wordprocessingShape">
+                    <wps:wsp>
+                      <wps:cNvSpPr/>
+                      <wps:spPr>
+                        <a:xfrm flipV="1">
+                          <a:off x="0" y="0"/>
+                          <a:ext cx="7819200" cy="388800"/>
+                        </a:xfrm>
+                        <a:prstGeom prst="rect">
+                          <a:avLst/>
+                        </a:prstGeom>
+                        <a:solidFill>
+                          <a:srgbClr val="16445B"/>
+                        </a:solidFill>
+                        <a:ln w="12700" cap="flat" cmpd="sng" algn="ctr">
+                          <a:noFill/>
+                          <a:prstDash val="solid"/>
+                          <a:miter lim="800000"/>
+                        </a:ln>
+                        <a:effectLst/>
+                      </wps:spPr>
+                      <wps:bodyPr rtlCol="1" anchor="ctr"/>
+                    </wps:wsp>
+                  </a:graphicData>
+                </a:graphic>
+                <wp14:sizeRelH relativeFrom="margin">
+                  <wp14:pctWidth>0</wp14:pctWidth>
+                </wp14:sizeRelH>
+                <wp14:sizeRelV relativeFrom="margin">
+                  <wp14:pctHeight>0</wp14:pctHeight>
+                </wp14:sizeRelV>
+              </wp:anchor>
+            </w:drawing>
+          </mc:Choice>
+          <mc:Fallback>
+            <w:pict>
+              <v:rect w14:anchorId="1C716CEE" id="مستطيل 4" o:spid="_x0000_s1026" style="position:absolute;left:0;text-align:left;margin-left:0;margin-top:0;width:615.7pt;height:30.6pt;flip:y;z-index:-251648000;visibility:visible;mso-wrap-style:square;mso-width-percent:0;mso-height-percent:0;mso-wrap-distance-left:9pt;mso-wrap-distance-top:0;mso-wrap-distance-right:9pt;mso-wrap-distance-bottom:0;mso-position-horizontal:absolute;mso-position-horizontal-relative:page;mso-position-vertical:absolute;mso-position-vertical-relative:page;mso-width-percent:0;mso-height-percent:0;mso-width-relative:margin;mso-height-relative:margin;v-text-anchor:middle" o:gfxdata="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" fillcolor="#16445b" stroked="f" strokeweight="1pt">
+                <w10:wrap anchorx="page" anchory="page"/>
+              </v:rect>
+            </w:pict>
+          </mc:Fallback>
+        </mc:AlternateContent>
+      </w:r>
+    </w:p>
+    <w:p>
+      <w:pPr>
+        <w:rPr>
+          <w:rtl/>
+        </w:rPr>
+      </w:pPr>
+    </w:p>
+    <w:p>
+      <w:pPr>
+        <w:jc w:val="center"/>
+        <w:rPr>
+          <w:rtl/>
+        </w:rPr>
+      </w:pPr>
+      <w:r>
+        <w:rPr>
+          <w:rFonts w:cs="Arial" w:hint="cs"/>
+          <w:noProof/>
+          <w:color w:val="7030A0"/>
+          <w:rtl/>
+        </w:rPr>
+        <w:drawing>
+          <wp:anchor distT="0" distB="0" distL="114300" distR="114300" simplePos="0" relativeHeight="251664384" behindDoc="0" locked="0" layoutInCell="1" allowOverlap="1" wp14:anchorId="571ABA96" wp14:editId="321952D9">
+            <wp:simplePos x="0" y="0"/>
+            <wp:positionH relativeFrom="column">
+              <wp:posOffset>714578</wp:posOffset>
+            </wp:positionH>
+            <wp:positionV relativeFrom="paragraph">
+              <wp:posOffset>273685</wp:posOffset>
+            </wp:positionV>
+            <wp:extent cx="5232400" cy="165100"/>
+            <wp:effectExtent l="0" t="0" r="6350" b="6350"/>
+            <wp:wrapNone/>
+            <wp:docPr id="1658321187" name="صورة 33"/>
+            <wp:cNvGraphicFramePr>
+              <a:graphicFrameLocks xmlns:a="http://schemas.openxmlformats.org/drawingml/2006/main" noChangeAspect="1"/>
+            </wp:cNvGraphicFramePr>
+            <a:graphic xmlns:a="http://schemas.openxmlformats.org/drawingml/2006/main">
+              <a:graphicData uri="http://schemas.openxmlformats.org/drawingml/2006/picture">
+                <pic:pic xmlns:pic="http://schemas.openxmlformats.org/drawingml/2006/picture">
+                  <pic:nvPicPr>
+                    <pic:cNvPr id="0" name="Picture 2"/>
+                    <pic:cNvPicPr>
+                      <a:picLocks noChangeAspect="1" noChangeArrowheads="1"/>
+                    </pic:cNvPicPr>
+                  </pic:nvPicPr>
+                  <pic:blipFill>
+                    <a:blip r:embed="rId10">
+                      <a:extLst>
+                        <a:ext uri="{28A0092B-C50C-407E-A947-70E740481C1C}">
+                          <a14:useLocalDpi xmlns:a14="http://schemas.microsoft.com/office/drawing/2010/main" val="0"/>
+                        </a:ext>
+                      </a:extLst>
+                    </a:blip>
+                    <a:srcRect/>
+                    <a:stretch>
+                      <a:fillRect/>
+                    </a:stretch>
+                  </pic:blipFill>
+                  <pic:spPr bwMode="auto">
+                    <a:xfrm flipH="1">
+                      <a:off x="0" y="0"/>
+                      <a:ext cx="5232400" cy="165100"/>
+                    </a:xfrm>
+                    <a:prstGeom prst="rect">
+                      <a:avLst/>
+                    </a:prstGeom>
+                    <a:noFill/>
+                    <a:ln>
+                      <a:noFill/>
+                    </a:ln>
+                  </pic:spPr>
+                </pic:pic>
+              </a:graphicData>
+            </a:graphic>
+          </wp:anchor>
+        </w:drawing>
+      </w:r>
+    </w:p>
+    <w:sdt>
+      <w:sdtPr>
+        <w:rPr>
+          <w:rtl/>
+        </w:rPr>
+        <w:id w:val="34852936"/>
+        <w:docPartObj>
+          <w:docPartGallery w:val="Cover Pages"/>
+          <w:docPartUnique/>
+        </w:docPartObj>
+      </w:sdtPr>
+      <w:sdtEndPr>
+        <w:rPr>
+          <w:rFonts w:cs="GE SS Two Medium"/>
+        </w:rPr>
+      </w:sdtEndPr>
+      <w:sdtContent>
+        <w:p>
+          <w:pPr>
+            <w:jc w:val="center"/>
+          </w:pPr>
+          <w:r>
+            <w:rPr>
+              <w:rFonts w:cs="Arial" w:hint="cs"/>
+              <w:noProof/>
+              <w:color w:val="7030A0"/>
+              <w:rtl/>
+            </w:rPr>
+            <w:drawing>
+              <wp:anchor distT="0" distB="0" distL="114300" distR="114300" simplePos="0" relativeHeight="251654144" behindDoc="1" locked="0" layoutInCell="1" allowOverlap="1" wp14:anchorId="2FF3467D" wp14:editId="0E2C615F">
+                <wp:simplePos x="0" y="0"/>
+                <wp:positionH relativeFrom="margin">
+                  <wp:posOffset>726885</wp:posOffset>
+                </wp:positionH>
+                <wp:positionV relativeFrom="paragraph">
+                  <wp:posOffset>175895</wp:posOffset>
+                </wp:positionV>
+                <wp:extent cx="5232400" cy="3136900"/>
+                <wp:effectExtent l="0" t="0" r="6350" b="6350"/>
+                <wp:wrapTight wrapText="bothSides">
+                  <wp:wrapPolygon edited="0">
+                    <wp:start x="0" y="0"/>
+                    <wp:lineTo x="0" y="21513"/>
+                    <wp:lineTo x="20132" y="21513"/>
+                    <wp:lineTo x="20604" y="20988"/>
+                    <wp:lineTo x="21469" y="18889"/>
+                    <wp:lineTo x="21548" y="17315"/>
+                    <wp:lineTo x="21548" y="0"/>
+                    <wp:lineTo x="0" y="0"/>
+                  </wp:wrapPolygon>
+                </wp:wrapTight>
+                <wp:docPr id="1719740038" name="صورة 32"/>
+                <wp:cNvGraphicFramePr>
+                  <a:graphicFrameLocks xmlns:a="http://schemas.openxmlformats.org/drawingml/2006/main" noChangeAspect="1"/>
+                </wp:cNvGraphicFramePr>
+                <a:graphic xmlns:a="http://schemas.openxmlformats.org/drawingml/2006/main">
+                  <a:graphicData uri="http://schemas.openxmlformats.org/drawingml/2006/picture">
+                    <pic:pic xmlns:pic="http://schemas.openxmlformats.org/drawingml/2006/picture">
+                      <pic:nvPicPr>
+                        <pic:cNvPr id="0" name="Picture 1"/>
+                        <pic:cNvPicPr>
+                          <a:picLocks noChangeAspect="1" noChangeArrowheads="1"/>
+                        </pic:cNvPicPr>
+                      </pic:nvPicPr>
+                      <pic:blipFill>
+                        <a:blip r:embed="rId11">
+                          <a:extLst>
+                            <a:ext uri="{28A0092B-C50C-407E-A947-70E740481C1C}">
+                              <a14:useLocalDpi xmlns:a14="http://schemas.microsoft.com/office/drawing/2010/main" val="0"/>
+                            </a:ext>
+                          </a:extLst>
+                        </a:blip>
+                        <a:srcRect/>
+                        <a:stretch>
+                          <a:fillRect/>
+                        </a:stretch>
+                      </pic:blipFill>
+                      <pic:spPr bwMode="auto">
+                        <a:xfrm>
+                          <a:off x="0" y="0"/>
+                          <a:ext cx="5232400" cy="3136900"/>
+                        </a:xfrm>
+                        <a:prstGeom prst="rect">
+                          <a:avLst/>
+                        </a:prstGeom>
+                        <a:noFill/>
+                        <a:ln>
+                          <a:noFill/>
+                        </a:ln>
+                      </pic:spPr>
+                    </pic:pic>
+                  </a:graphicData>
+                </a:graphic>
+                <wp14:sizeRelV relativeFrom="margin">
+                  <wp14:pctHeight>0</wp14:pctHeight>
+                </wp14:sizeRelV>
+              </wp:anchor>
+            </w:drawing>
+          </w:r>
+        </w:p>
+        <w:p>
+          <w:pPr>
+            <w:rPr>
+              <w:rtl/>
+            </w:rPr>
+          </w:pPr>
+          <w:r>
+            <w:rPr>
+              <w:noProof/>
+              <w:color w:val="D9D9D9" w:themeColor="background1" w:themeShade="D9"/>
+            </w:rPr>
+            <mc:AlternateContent>
+              <mc:Choice Requires="wps">
+                <w:drawing>
+                  <wp:anchor distT="0" distB="0" distL="114300" distR="114300" simplePos="0" relativeHeight="251658240" behindDoc="0" locked="0" layoutInCell="1" allowOverlap="1" wp14:anchorId="64942310" wp14:editId="0C2976A2">
+                    <wp:simplePos x="0" y="0"/>
+                    <wp:positionH relativeFrom="margin">
+                      <wp:align>center</wp:align>
+                    </wp:positionH>
+                    <wp:positionV relativeFrom="paragraph">
+                      <wp:posOffset>28966</wp:posOffset>
+                    </wp:positionV>
+                    <wp:extent cx="5172075" cy="2850906"/>
+                    <wp:effectExtent l="0" t="0" r="0" b="0"/>
+                    <wp:wrapNone/>
+                    <wp:docPr id="1817198830" name="مستطيل 4"/>
+                    <wp:cNvGraphicFramePr/>
+                    <a:graphic xmlns:a="http://schemas.openxmlformats.org/drawingml/2006/main">
+                      <a:graphicData uri="http://schemas.microsoft.com/office/word/2010/wordprocessingShape">
+                        <wps:wsp>
+                          <wps:cNvSpPr/>
+                          <wps:spPr>
+                            <a:xfrm>
+                              <a:off x="0" y="0"/>
+                              <a:ext cx="5172075" cy="2850906"/>
+                            </a:xfrm>
+                            <a:prstGeom prst="rect">
+                              <a:avLst/>
+                            </a:prstGeom>
+                          </wps:spPr>
+                          <wps:txbx>
+                            <w:txbxContent>
+                              <w:p>
+                                <w:pPr>
+                                  <w:pStyle w:val="MOE-Cover-Title"/>
+                                  <w:rPr>
+                                    <w:rtl/>
+                                  </w:rPr>
+                                </w:pPr>
+                                <w:r>
+                                  <w:rPr>
+                                    <w:rtl/>
+                                  </w:rPr>
+                                  <w:t>{{reportTitle}}</w:t>
+                                </w:r>
+                              </w:p>
+                              <w:p>
+                                <w:pPr>
+                                  <w:spacing w:after="0" w:line="240" w:lineRule="auto"/>
+                                  <w:jc w:val="center"/>
+                                  <w:rPr>
+                                    <w:rFonts w:ascii="Helvetica Neue W23 for SKY Reg" w:hAnsi="Helvetica Neue W23 for SKY Reg"/>
+                                    <w:b/>
+                                    <w:bCs/>
+                                    <w:color w:val="C5B487"/>
+                                    <w:sz w:val="48"/>
+                                    <w:szCs w:val="48"/>
+                                    <w:rtl/>
+                                  </w:rPr>
+                                </w:pPr>
+                              </w:p>
+                              <w:p>
+                                <w:pPr>
+                                  <w:pStyle w:val="MOE-Cover-Subtitle"/>
+                                  <w:rPr>
+                                    <w:color w:val="FFFFFF" w:themeColor="background1"/>
+                                  </w:rPr>
+                                </w:pPr>
+                                <w:r>
+                                  <w:rPr>
+                                    <w:rFonts w:hint="cs"/>
+                                    <w:rtl/>
+                                  </w:rPr>
+                                  <w:t>ل</w:t>
+                                </w:r>
+                                <w:r>
+                                  <w:rPr>
+                                    <w:rtl/>
+                                  </w:rPr>
+                                  <w:t xml:space="preserve">لفصل </w:t>
+                                </w:r>
+                                <w:r>
+                                  <w:rPr>
+                                    <w:rFonts w:hint="cs"/>
+                                    <w:rtl/>
+                                  </w:rPr>
+                                  <w:t xml:space="preserve">الدراسي </w:t>
+                                </w:r>
+                                <w:r>
+                                  <w:rPr>
+                                    <w:rFonts w:hint="cs"/>
+                                    <w:rtl/>
+                                  </w:rPr>
+                                  <w:t>الثاني لعام</w:t>
+                                </w:r>
+                                <w:r>
+                                  <w:rPr>
+                                    <w:rtl/>
+                                  </w:rPr>
+                                  <w:t xml:space="preserve"> 1</w:t>
+                                </w:r>
+                                <w:r>
+                                  <w:rPr>
+                                    <w:rFonts w:hint="cs"/>
+                                    <w:rtl/>
+                                  </w:rPr>
+                                  <w:t>446</w:t>
+                                </w:r>
+                                <w:r>
+                                  <w:rPr>
+                                    <w:rtl/>
+                                  </w:rPr>
+                                  <w:t>هـ</w:t>
+                                </w:r>
+                              </w:p>
+                            </w:txbxContent>
+                          </wps:txbx>
+                          <wps:bodyPr wrap="square">
+                            <a:noAutofit/>
+                          </wps:bodyPr>
+                        </wps:wsp>
+                      </a:graphicData>
+                    </a:graphic>
+                    <wp14:sizeRelH relativeFrom="margin">
+                      <wp14:pctWidth>0</wp14:pctWidth>
+                    </wp14:sizeRelH>
+                    <wp14:sizeRelV relativeFrom="margin">
+                      <wp14:pctHeight>0</wp14:pctHeight>
+                    </wp14:sizeRelV>
+                  </wp:anchor>
+                </w:drawing>
+              </mc:Choice>
+              <mc:Fallback>
+                <w:pict>
+                  <v:rect w14:anchorId="64942310" id="مستطيل 4" o:spid="_x0000_s1027" style="position:absolute;left:0;text-align:left;margin-left:0;margin-top:2.3pt;width:407.25pt;height:224.5pt;z-index:251658240;visibility:visible;mso-wrap-style:square;mso-width-percent:0;mso-height-percent:0;mso-wrap-distance-left:9pt;mso-wrap-distance-top:0;mso-wrap-distance-right:9pt;mso-wrap-distance-bottom:0;mso-position-horizontal:center;mso-position-horizontal-relative:margin;mso-position-vertical:absolute;mso-position-vertical-relative:text;mso-width-percent:0;mso-height-percent:0;mso-width-relative:margin;mso-height-relative:margin;v-text-anchor:top" o:gfxdata="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" filled="f" stroked="f">
+                    <v:textbox>
+                      <w:txbxContent>
+                        <w:p>
+                          <w:pPr>
+                            <w:pStyle w:val="MOE-Cover-Title"/>
+                            <w:rPr>
+                              <w:rtl/>
+                            </w:rPr>
+                          </w:pPr>
+                          <w:r>
+                            <w:rPr>
+                              <w:rtl/>
+                            </w:rPr>
+                            <w:t>{{reportTitle}}</w:t>
+                          </w:r>
+                        </w:p>
+                        <w:p>
+                          <w:pPr>
+                            <w:spacing w:after="0" w:line="240" w:lineRule="auto"/>
+                            <w:jc w:val="center"/>
+                            <w:rPr>
+                              <w:rFonts w:ascii="Helvetica Neue W23 for SKY Reg" w:hAnsi="Helvetica Neue W23 for SKY Reg"/>
+                              <w:b/>
+                              <w:bCs/>
+                              <w:color w:val="C5B487"/>
+                              <w:sz w:val="48"/>
+                              <w:szCs w:val="48"/>
+                              <w:rtl/>
+                            </w:rPr>
+                          </w:pPr>
+                        </w:p>
+                        <w:p>
+                          <w:pPr>
+                            <w:pStyle w:val="MOE-Cover-Subtitle"/>
+                            <w:rPr>
+                              <w:color w:val="FFFFFF" w:themeColor="background1"/>
+                            </w:rPr>
+                          </w:pPr>
+                          <w:r>
+                            <w:rPr>
+                              <w:rFonts w:hint="cs"/>
+                              <w:rtl/>
+                            </w:rPr>
+                            <w:t>ل</w:t>
+                          </w:r>
+                          <w:r>
+                            <w:rPr>
+                              <w:rtl/>
+                            </w:rPr>
+                            <w:t xml:space="preserve">لفصل </w:t>
+                          </w:r>
+                          <w:r>
+                            <w:rPr>
+                              <w:rFonts w:hint="cs"/>
+                              <w:rtl/>
+                            </w:rPr>
+                            <w:t xml:space="preserve">الدراسي </w:t>
+                          </w:r>
+                          <w:r>
+                            <w:rPr>
+                              <w:rFonts w:hint="cs"/>
+                              <w:rtl/>
+                            </w:rPr>
+                            <w:t>الثاني لعام</w:t>
+                          </w:r>
+                          <w:r>
+                            <w:rPr>
+                              <w:rtl/>
+                            </w:rPr>
+                            <w:t xml:space="preserve"> 1</w:t>
+                          </w:r>
+                          <w:r>
+                            <w:rPr>
+                              <w:rFonts w:hint="cs"/>
+                              <w:rtl/>
+                            </w:rPr>
+                            <w:t>446</w:t>
+                          </w:r>
+                          <w:r>
+                            <w:rPr>
+                              <w:rtl/>
+                            </w:rPr>
+                            <w:t>هـ</w:t>
+                          </w:r>
+                        </w:p>
+                      </w:txbxContent>
+                    </v:textbox>
+                    <w10:wrap anchorx="margin"/>
+                  </v:rect>
+                </w:pict>
+              </mc:Fallback>
+            </mc:AlternateContent>
+          </w:r>
+          <w:r>
+            <w:rPr>
+              <w:noProof/>
+              <w:color w:val="D9D9D9" w:themeColor="background1" w:themeShade="D9"/>
+            </w:rPr>
+            <mc:AlternateContent>
+              <mc:Choice Requires="wps">
+                <w:drawing>
+                  <wp:anchor distT="0" distB="0" distL="114300" distR="114300" simplePos="0" relativeHeight="251666432" behindDoc="1" locked="0" layoutInCell="1" allowOverlap="1" wp14:anchorId="47A523D6" wp14:editId="13D90F2C">
+                    <wp:simplePos x="0" y="0"/>
+                    <wp:positionH relativeFrom="page">
+                      <wp:posOffset>0</wp:posOffset>
+                    </wp:positionH>
+                    <wp:positionV relativeFrom="paragraph">
+                      <wp:posOffset>7086168</wp:posOffset>
+                    </wp:positionV>
+                    <wp:extent cx="7778750" cy="139700"/>
+                    <wp:effectExtent l="0" t="0" r="0" b="0"/>
+                    <wp:wrapNone/>
+                    <wp:docPr id="242521845" name="مستطيل 4"/>
+                    <wp:cNvGraphicFramePr/>
+                    <a:graphic xmlns:a="http://schemas.openxmlformats.org/drawingml/2006/main">
+                      <a:graphicData uri="http://schemas.microsoft.com/office/word/2010/wordprocessingShape">
+                        <wps:wsp>
+                          <wps:cNvSpPr/>
+                          <wps:spPr>
+                            <a:xfrm flipV="1">
+                              <a:off x="0" y="0"/>
+                              <a:ext cx="7778750" cy="139700"/>
+                            </a:xfrm>
+                            <a:prstGeom prst="rect">
+                              <a:avLst/>
+                            </a:prstGeom>
+                            <a:solidFill>
+                              <a:srgbClr val="16445B"/>
+                            </a:solidFill>
+                            <a:ln w="12700" cap="flat" cmpd="sng" algn="ctr">
+                              <a:noFill/>
+                              <a:prstDash val="solid"/>
+                              <a:miter lim="800000"/>
+                            </a:ln>
+                            <a:effectLst/>
+                          </wps:spPr>
+                          <wps:bodyPr rtlCol="1" anchor="ctr"/>
+                        </wps:wsp>
+                      </a:graphicData>
+                    </a:graphic>
+                    <wp14:sizeRelH relativeFrom="margin">
+                      <wp14:pctWidth>0</wp14:pctWidth>
+                    </wp14:sizeRelH>
+                    <wp14:sizeRelV relativeFrom="margin">
+                      <wp14:pctHeight>0</wp14:pctHeight>
+                    </wp14:sizeRelV>
+                  </wp:anchor>
+                </w:drawing>
+              </mc:Choice>
+              <mc:Fallback xmlns:a="http://schemas.openxmlformats.org/drawingml/2006/main" xmlns:pic="http://schemas.openxmlformats.org/drawingml/2006/picture" xmlns:a14="http://schemas.microsoft.com/office/drawing/2010/main">
+                <w:pict>
+                  <v:rect id="مستطيل 4" style="position:absolute;left:0;text-align:left;margin-left:0;margin-top:557.95pt;width:612.5pt;height:11pt;flip:y;z-index:-251612160;visibility:visible;mso-wrap-style:square;mso-width-percent:0;mso-height-percent:0;mso-wrap-distance-left:9pt;mso-wrap-distance-top:0;mso-wrap-distance-right:9pt;mso-wrap-distance-bottom:0;mso-position-horizontal:absolute;mso-position-horizontal-relative:page;mso-position-vertical:absolute;mso-position-vertical-relative:text;mso-width-percent:0;mso-height-percent:0;mso-width-relative:margin;mso-height-relative:margin;v-text-anchor:middle" o:spid="_x0000_s1026" fillcolor="#16445b" stroked="f" strokeweight="1pt" o:gfxdata="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" w14:anchorId="7CFC423F">
+                    <w10:wrap anchorx="page"/>
+                  </v:rect>
+                </w:pict>
+              </mc:Fallback>
+            </mc:AlternateContent>
+          </w:r>
+          <w:r>
+            <w:rPr>
+              <w:noProof/>
+              <w:color w:val="D9D9D9" w:themeColor="background1" w:themeShade="D9"/>
+            </w:rPr>
+            <mc:AlternateContent>
+              <mc:Choice Requires="wps">
+                <w:drawing>
+                  <wp:anchor distT="0" distB="0" distL="114300" distR="114300" simplePos="0" relativeHeight="251660288" behindDoc="1" locked="0" layoutInCell="1" allowOverlap="1" wp14:anchorId="227BC471" wp14:editId="10973C8F">
+                    <wp:simplePos x="0" y="0"/>
+                    <wp:positionH relativeFrom="page">
+                      <wp:align>left</wp:align>
+                    </wp:positionH>
+                    <wp:positionV relativeFrom="paragraph">
+                      <wp:posOffset>7219328</wp:posOffset>
+                    </wp:positionV>
+                    <wp:extent cx="7594600" cy="520700"/>
+                    <wp:effectExtent l="0" t="0" r="6350" b="0"/>
+                    <wp:wrapNone/>
+                    <wp:docPr id="1384896416" name="مستطيل 4"/>
+                    <wp:cNvGraphicFramePr/>
+                    <a:graphic xmlns:a="http://schemas.openxmlformats.org/drawingml/2006/main">
+                      <a:graphicData uri="http://schemas.microsoft.com/office/word/2010/wordprocessingShape">
+                        <wps:wsp>
+                          <wps:cNvSpPr/>
+                          <wps:spPr>
+                            <a:xfrm flipH="1" flipV="1">
+                              <a:off x="0" y="0"/>
+                              <a:ext cx="7594600" cy="520700"/>
+                            </a:xfrm>
+                            <a:prstGeom prst="rect">
+                              <a:avLst/>
+                            </a:prstGeom>
+                            <a:gradFill flip="none" rotWithShape="1">
+                              <a:gsLst>
+                                <a:gs pos="0">
+                                  <a:srgbClr val="08A86A"/>
+                                </a:gs>
+                                <a:gs pos="100000">
+                                  <a:srgbClr val="3D7DBA"/>
+                                </a:gs>
+                              </a:gsLst>
+                              <a:lin ang="0" scaled="1"/>
+                              <a:tileRect/>
+                            </a:gradFill>
+                            <a:ln w="12700" cap="flat" cmpd="sng" algn="ctr">
+                              <a:noFill/>
+                              <a:prstDash val="solid"/>
+                              <a:miter lim="800000"/>
+                            </a:ln>
+                            <a:effectLst/>
+                          </wps:spPr>
+                          <wps:bodyPr rtlCol="1" anchor="ctr"/>
+                        </wps:wsp>
+                      </a:graphicData>
+                    </a:graphic>
+                    <wp14:sizeRelH relativeFrom="margin">
+                      <wp14:pctWidth>0</wp14:pctWidth>
+                    </wp14:sizeRelH>
+                    <wp14:sizeRelV relativeFrom="margin">
+                      <wp14:pctHeight>0</wp14:pctHeight>
+                    </wp14:sizeRelV>
+                  </wp:anchor>
+                </w:drawing>
+              </mc:Choice>
+              <mc:Fallback xmlns:a="http://schemas.openxmlformats.org/drawingml/2006/main" xmlns:pic="http://schemas.openxmlformats.org/drawingml/2006/picture" xmlns:a14="http://schemas.microsoft.com/office/drawing/2010/main">
+                <w:pict>
+                  <v:rect id="مستطيل 4" style="position:absolute;left:0;text-align:left;margin-left:0;margin-top:568.45pt;width:598pt;height:41pt;flip:x y;z-index:-251617280;visibility:visible;mso-wrap-style:square;mso-width-percent:0;mso-height-percent:0;mso-wrap-distance-left:9pt;mso-wrap-distance-top:0;mso-wrap-distance-right:9pt;mso-wrap-distance-bottom:0;mso-position-horizontal:left;mso-position-horizontal-relative:page;mso-position-vertical:absolute;mso-position-vertical-relative:text;mso-width-percent:0;mso-height-percent:0;mso-width-relative:margin;mso-height-relative:margin;v-text-anchor:middle" o:spid="_x0000_s1026" fillcolor="#08a86a" stroked="f" strokeweight="1pt" o:gfxdata="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" w14:anchorId="1C868B2A">
+                    <v:fill type="gradient" color2="#3d7dba" angle="90" focus="100%" rotate="t"/>
+                    <w10:wrap anchorx="page"/>
+                  </v:rect>
+                </w:pict>
+              </mc:Fallback>
+            </mc:AlternateContent>
+          </w:r>
+          <w:r>
+            <w:rPr>
+              <w:noProof/>
+            </w:rPr>
+            <mc:AlternateContent>
+              <mc:Choice Requires="wps">
+                <w:drawing>
+                  <wp:anchor distT="0" distB="0" distL="114300" distR="114300" simplePos="0" relativeHeight="251645952" behindDoc="0" locked="0" layoutInCell="1" allowOverlap="1" wp14:anchorId="648B1DF9" wp14:editId="5D6F112C">
+                    <wp:simplePos x="0" y="0"/>
+                    <wp:positionH relativeFrom="margin">
+                      <wp:posOffset>0</wp:posOffset>
+                    </wp:positionH>
+                    <wp:positionV relativeFrom="page">
+                      <wp:posOffset>8743315</wp:posOffset>
+                    </wp:positionV>
+                    <wp:extent cx="1712595" cy="1000125"/>
+                    <wp:effectExtent l="0" t="0" r="0" b="0"/>
+                    <wp:wrapSquare wrapText="bothSides"/>
+                    <wp:docPr id="465" name="مربع نص 255"/>
+                    <wp:cNvGraphicFramePr/>
+                    <a:graphic xmlns:a="http://schemas.openxmlformats.org/drawingml/2006/main">
+                      <a:graphicData uri="http://schemas.microsoft.com/office/word/2010/wordprocessingShape">
+                        <wps:wsp>
+                          <wps:cNvSpPr txBox="1"/>
+                          <wps:spPr>
+                            <a:xfrm flipH="1">
+                              <a:off x="0" y="0"/>
+                              <a:ext cx="1712595" cy="1000125"/>
+                            </a:xfrm>
+                            <a:prstGeom prst="rect">
+                              <a:avLst/>
+                            </a:prstGeom>
+                            <a:noFill/>
+                            <a:ln w="6350">
+                              <a:noFill/>
+                            </a:ln>
+                            <a:effectLst/>
+                          </wps:spPr>
+                          <wps:txbx>
+                            <w:txbxContent>
+                              <w:p>
+                                <w:pPr>
+                                  <w:pStyle w:val="MOE-Cover-NoSpacing"/>
+                                  <w:jc w:val="center"/>
+                                  <w:rPr>
+                                    <w:rFonts w:ascii="Helvetica Neue W23 for SKY Reg" w:hAnsi="Helvetica Neue W23 for SKY Reg" w:cs="Helvetica Neue W23 for SKY Reg"/>
+                                    <w:b/>
+                                    <w:bCs/>
+                                    <w:color w:val="387FBC"/>
+                                    <w:sz w:val="28"/>
+                                    <w:szCs w:val="28"/>
+                                    <w:rtl/>
+                                  </w:rPr>
+                                </w:pPr>
+                                <w:r>
+                                  <w:rPr>
+                                    <w:rFonts w:ascii="Helvetica Neue W23 for SKY Reg" w:hAnsi="Helvetica Neue W23 for SKY Reg" w:cs="Helvetica Neue W23 for SKY Reg"/>
+                                    <w:b/>
+                                    <w:bCs/>
+                                    <w:color w:val="387FBC"/>
+                                    <w:sz w:val="28"/>
+                                    <w:szCs w:val="28"/>
+                                    <w:rtl/>
+                                  </w:rPr>
+                                  <w:t>{{signatureLeftRole}}</w:t>
+                                </w:r>
+                              </w:p>
+                              <w:p>
+                                <w:pPr>
+                                  <w:pStyle w:val="MOE-Cover-NoSpacing"/>
+                                  <w:jc w:val="center"/>
+                                  <w:rPr>
+                                    <w:rFonts w:ascii="Helvetica Neue W23 for SKY Reg" w:hAnsi="Helvetica Neue W23 for SKY Reg" w:cs="Helvetica Neue W23 for SKY Reg"/>
+                                    <w:b/>
+                                    <w:bCs/>
+                                    <w:color w:val="0B3946"/>
+                                    <w:rtl/>
+                                  </w:rPr>
+                                </w:pPr>
+                              </w:p>
+                              <w:p>
+                                <w:pPr>
+                                  <w:pStyle w:val="MOE-Cover-NoSpacing"/>
+                                  <w:jc w:val="center"/>
+                                  <w:rPr>
+                                    <w:rFonts w:ascii="Helvetica Neue W23 for SKY Reg" w:hAnsi="Helvetica Neue W23 for SKY Reg" w:cs="Helvetica Neue W23 for SKY Reg"/>
+                                    <w:b/>
+                                    <w:bCs/>
+                                    <w:color w:val="0DA9A6"/>
+                                  </w:rPr>
+                                </w:pPr>
+                                <w:r>
+                                  <w:rPr>
+                                    <w:rFonts w:ascii="Helvetica Neue W23 for SKY Reg" w:hAnsi="Helvetica Neue W23 for SKY Reg" w:cs="Helvetica Neue W23 for SKY Reg" w:hint="cs"/>
+                                    <w:b/>
+                                    <w:bCs/>
+                                    <w:color w:val="0DA9A6"/>
+                                    <w:rtl/>
+                                  </w:rPr>
+                                  <w:t>{{signatureLeftName}}</w:t>
+                                </w:r>
+                              </w:p>
+                            </w:txbxContent>
+                          </wps:txbx>
+                          <wps:bodyPr rot="0" spcFirstLastPara="0" vertOverflow="overflow" horzOverflow="overflow" vert="horz" wrap="square" lIns="91440" tIns="45720" rIns="91440" bIns="45720" numCol="1" spcCol="0" rtlCol="0" fromWordArt="0" anchor="b" anchorCtr="0" forceAA="0" compatLnSpc="1">
+                            <a:prstTxWarp prst="textNoShape">
+                              <a:avLst/>
+                            </a:prstTxWarp>
+                            <a:noAutofit/>
+                          </wps:bodyPr>
+                        </wps:wsp>
+                      </a:graphicData>
+                    </a:graphic>
+                    <wp14:sizeRelH relativeFrom="page">
+                      <wp14:pctWidth>0</wp14:pctWidth>
+                    </wp14:sizeRelH>
+                    <wp14:sizeRelV relativeFrom="margin">
+                      <wp14:pctHeight>0</wp14:pctHeight>
+                    </wp14:sizeRelV>
+                  </wp:anchor>
+                </w:drawing>
+              </mc:Choice>
+              <mc:Fallback>
+                <w:pict>
+                  <v:shape w14:anchorId="648B1DF9" id="_x0000_s1028" type="#_x0000_t202" style="position:absolute;left:0;text-align:left;margin-left:0;margin-top:688.45pt;width:134.85pt;height:78.75pt;flip:x;z-index:251645952;visibility:visible;mso-wrap-style:square;mso-width-percent:0;mso-height-percent:0;mso-wrap-distance-left:9pt;mso-wrap-distance-top:0;mso-wrap-distance-right:9pt;mso-wrap-distance-bottom:0;mso-position-horizontal:absolute;mso-position-horizontal-relative:margin;mso-position-vertical:absolute;mso-position-vertical-relative:page;mso-width-percent:0;mso-height-percent:0;mso-width-relative:page;mso-height-relative:margin;v-text-anchor:bottom" o:gfxdata="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" filled="f" stroked="f" strokeweight=".5pt">
+                    <v:textbox>
+                      <w:txbxContent>
+                        <w:p>
+                          <w:pPr>
+                            <w:pStyle w:val="MOE-Cover-NoSpacing"/>
+                            <w:jc w:val="center"/>
+                            <w:rPr>
+                              <w:rFonts w:ascii="Helvetica Neue W23 for SKY Reg" w:hAnsi="Helvetica Neue W23 for SKY Reg" w:cs="Helvetica Neue W23 for SKY Reg"/>
+                              <w:b/>
+                              <w:bCs/>
+                              <w:color w:val="387FBC"/>
+                              <w:sz w:val="28"/>
+                              <w:szCs w:val="28"/>
+                              <w:rtl/>
+                            </w:rPr>
+                          </w:pPr>
+                          <w:r>
+                            <w:rPr>
+                              <w:rFonts w:ascii="Helvetica Neue W23 for SKY Reg" w:hAnsi="Helvetica Neue W23 for SKY Reg" w:cs="Helvetica Neue W23 for SKY Reg"/>
+                              <w:b/>
+                              <w:bCs/>
+                              <w:color w:val="387FBC"/>
+                              <w:sz w:val="28"/>
+                              <w:szCs w:val="28"/>
+                              <w:rtl/>
+                            </w:rPr>
+                            <w:t>{{signatureLeftRole}}</w:t>
+                          </w:r>
+                        </w:p>
+                        <w:p>
+                          <w:pPr>
+                            <w:pStyle w:val="MOE-Cover-NoSpacing"/>
+                            <w:jc w:val="center"/>
+                            <w:rPr>
+                              <w:rFonts w:ascii="Helvetica Neue W23 for SKY Reg" w:hAnsi="Helvetica Neue W23 for SKY Reg" w:cs="Helvetica Neue W23 for SKY Reg"/>
+                              <w:b/>
+                              <w:bCs/>
+                              <w:color w:val="0B3946"/>
+                              <w:rtl/>
+                            </w:rPr>
+                          </w:pPr>
+                        </w:p>
+                        <w:p>
+                          <w:pPr>
+                            <w:pStyle w:val="MOE-Cover-NoSpacing"/>
+                            <w:jc w:val="center"/>
+                            <w:rPr>
+                              <w:rFonts w:ascii="Helvetica Neue W23 for SKY Reg" w:hAnsi="Helvetica Neue W23 for SKY Reg" w:cs="Helvetica Neue W23 for SKY Reg"/>
+                              <w:b/>
+                              <w:bCs/>
+                              <w:color w:val="0DA9A6"/>
+                            </w:rPr>
+                          </w:pPr>
+                          <w:r>
+                            <w:rPr>
+                              <w:rFonts w:ascii="Helvetica Neue W23 for SKY Reg" w:hAnsi="Helvetica Neue W23 for SKY Reg" w:cs="Helvetica Neue W23 for SKY Reg" w:hint="cs"/>
+                              <w:b/>
+                              <w:bCs/>
+                              <w:color w:val="0DA9A6"/>
+                              <w:rtl/>
+                            </w:rPr>
+                            <w:t>{{signatureLeftName}}</w:t>
+                          </w:r>
+                        </w:p>
+                      </w:txbxContent>
+                    </v:textbox>
+                    <w10:wrap type="square" anchorx="margin" anchory="page"/>
+                  </v:shape>
+                </w:pict>
+              </mc:Fallback>
+            </mc:AlternateContent>
+          </w:r>
+          <w:r>
+            <w:rPr>
+              <w:noProof/>
+            </w:rPr>
+            <mc:AlternateContent>
+              <mc:Choice Requires="wps">
+                <w:drawing>
+                  <wp:anchor distT="0" distB="0" distL="114300" distR="114300" simplePos="0" relativeHeight="251662336" behindDoc="0" locked="0" layoutInCell="1" allowOverlap="1" wp14:anchorId="21B150A3" wp14:editId="7E13415D">
+                    <wp:simplePos x="0" y="0"/>
+                    <wp:positionH relativeFrom="margin">
+                      <wp:posOffset>4530725</wp:posOffset>
+                    </wp:positionH>
+                    <wp:positionV relativeFrom="page">
+                      <wp:posOffset>8723198</wp:posOffset>
+                    </wp:positionV>
+                    <wp:extent cx="2115185" cy="1014095"/>
+                    <wp:effectExtent l="0" t="0" r="0" b="0"/>
+                    <wp:wrapSquare wrapText="bothSides"/>
+                    <wp:docPr id="1" name="مربع نص 255"/>
+                    <wp:cNvGraphicFramePr/>
+                    <a:graphic xmlns:a="http://schemas.openxmlformats.org/drawingml/2006/main">
+                      <a:graphicData uri="http://schemas.microsoft.com/office/word/2010/wordprocessingShape">
+                        <wps:wsp>
+                          <wps:cNvSpPr txBox="1"/>
+                          <wps:spPr>
+                            <a:xfrm flipH="1">
+                              <a:off x="0" y="0"/>
+                              <a:ext cx="2115185" cy="1014095"/>
+                            </a:xfrm>
+                            <a:prstGeom prst="rect">
+                              <a:avLst/>
+                            </a:prstGeom>
+                            <a:noFill/>
+                            <a:ln w="6350">
+                              <a:noFill/>
+                            </a:ln>
+                            <a:effectLst/>
+                          </wps:spPr>
+                          <wps:txbx>
+                            <w:txbxContent>
+                              <w:p>
+                                <w:pPr>
+                                  <w:pStyle w:val="MOE-Cover-NoSpacing"/>
+                                  <w:jc w:val="center"/>
+                                  <w:rPr>
+                                    <w:rFonts w:ascii="Helvetica Neue W23 for SKY Reg" w:hAnsi="Helvetica Neue W23 for SKY Reg" w:cs="Helvetica Neue W23 for SKY Reg"/>
+                                    <w:b/>
+                                    <w:bCs/>
+                                    <w:color w:val="387FBC"/>
+                                    <w:sz w:val="28"/>
+                                    <w:szCs w:val="28"/>
+                                    <w:rtl/>
+                                  </w:rPr>
+                                </w:pPr>
+                                <w:r>
+                                  <w:rPr>
+                                    <w:rFonts w:ascii="Helvetica Neue W23 for SKY Reg" w:hAnsi="Helvetica Neue W23 for SKY Reg" w:cs="Helvetica Neue W23 for SKY Reg" w:hint="cs"/>
+                                    <w:b/>
+                                    <w:bCs/>
+                                    <w:color w:val="387FBC"/>
+                                    <w:sz w:val="28"/>
+                                    <w:szCs w:val="28"/>
+                                    <w:rtl/>
+                                  </w:rPr>
+                                  <w:t>{{signatureRightRole}}</w:t>
+                                </w:r>
+                              </w:p>
+                              <w:p>
+                                <w:pPr>
+                                  <w:pStyle w:val="MOE-Cover-NoSpacing"/>
+                                  <w:jc w:val="center"/>
+                                  <w:rPr>
+                                    <w:rFonts w:ascii="Helvetica Neue W23 for SKY Reg" w:hAnsi="Helvetica Neue W23 for SKY Reg" w:cs="Helvetica Neue W23 for SKY Reg"/>
+                                    <w:b/>
+                                    <w:bCs/>
+                                    <w:color w:val="0B3946"/>
+                                    <w:rtl/>
+                                  </w:rPr>
+                                </w:pPr>
+                              </w:p>
+                              <w:p>
+                                <w:pPr>
+                                  <w:pStyle w:val="MOE-Cover-NoSpacing"/>
+                                  <w:jc w:val="center"/>
+                                  <w:rPr>
+                                    <w:rFonts w:ascii="Helvetica Neue W23 for SKY Reg" w:hAnsi="Helvetica Neue W23 for SKY Reg" w:cs="Helvetica Neue W23 for SKY Reg"/>
+                                    <w:b/>
+                                    <w:bCs/>
+                                    <w:color w:val="0DA9A6"/>
+                                    <w:sz w:val="28"/>
+                                    <w:szCs w:val="28"/>
+                                  </w:rPr>
+                                </w:pPr>
+                                <w:r>
+                                  <w:rPr>
+                                    <w:rFonts w:ascii="Helvetica Neue W23 for SKY Reg" w:hAnsi="Helvetica Neue W23 for SKY Reg" w:cs="Helvetica Neue W23 for SKY Reg" w:hint="cs"/>
+                                    <w:b/>
+                                    <w:bCs/>
+                                    <w:color w:val="0DA9A6"/>
+                                    <w:rtl/>
+                                  </w:rPr>
+                                  <w:t>{{signatureRightName}}</w:t>
+                                </w:r>
+                              </w:p>
+                            </w:txbxContent>
+                          </wps:txbx>
+                          <wps:bodyPr rot="0" spcFirstLastPara="0" vertOverflow="overflow" horzOverflow="overflow" vert="horz" wrap="square" lIns="91440" tIns="45720" rIns="91440" bIns="45720" numCol="1" spcCol="0" rtlCol="0" fromWordArt="0" anchor="b" anchorCtr="0" forceAA="0" compatLnSpc="1">
+                            <a:prstTxWarp prst="textNoShape">
+                              <a:avLst/>
+                            </a:prstTxWarp>
+                            <a:noAutofit/>
+                          </wps:bodyPr>
+                        </wps:wsp>
+                      </a:graphicData>
+                    </a:graphic>
+                    <wp14:sizeRelH relativeFrom="page">
+                      <wp14:pctWidth>0</wp14:pctWidth>
+                    </wp14:sizeRelH>
+                    <wp14:sizeRelV relativeFrom="margin">
+                      <wp14:pctHeight>0</wp14:pctHeight>
+                    </wp14:sizeRelV>
+                  </wp:anchor>
+                </w:drawing>
+              </mc:Choice>
+              <mc:Fallback>
+                <w:pict>
+                  <v:shape w14:anchorId="21B150A3" id="_x0000_s1029" type="#_x0000_t202" style="position:absolute;left:0;text-align:left;margin-left:356.75pt;margin-top:686.85pt;width:166.55pt;height:79.85pt;flip:x;z-index:251662336;visibility:visible;mso-wrap-style:square;mso-width-percent:0;mso-height-percent:0;mso-wrap-distance-left:9pt;mso-wrap-distance-top:0;mso-wrap-distance-right:9pt;mso-wrap-distance-bottom:0;mso-position-horizontal:absolute;mso-position-horizontal-relative:margin;mso-position-vertical:absolute;mso-position-vertical-relative:page;mso-width-percent:0;mso-height-percent:0;mso-width-relative:page;mso-height-relative:margin;v-text-anchor:bottom" o:gfxdata="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" filled="f" stroked="f" strokeweight=".5pt">
+                    <v:textbox>
+                      <w:txbxContent>
+                        <w:p>
+                          <w:pPr>
+                            <w:pStyle w:val="MOE-Cover-NoSpacing"/>
+                            <w:jc w:val="center"/>
+                            <w:rPr>
+                              <w:rFonts w:ascii="Helvetica Neue W23 for SKY Reg" w:hAnsi="Helvetica Neue W23 for SKY Reg" w:cs="Helvetica Neue W23 for SKY Reg"/>
+                              <w:b/>
+                              <w:bCs/>
+                              <w:color w:val="387FBC"/>
+                              <w:sz w:val="28"/>
+                              <w:szCs w:val="28"/>
+                              <w:rtl/>
+                            </w:rPr>
+                          </w:pPr>
+                          <w:r>
+                            <w:rPr>
+                              <w:rFonts w:ascii="Helvetica Neue W23 for SKY Reg" w:hAnsi="Helvetica Neue W23 for SKY Reg" w:cs="Helvetica Neue W23 for SKY Reg" w:hint="cs"/>
+                              <w:b/>
+                              <w:bCs/>
+                              <w:color w:val="387FBC"/>
+                              <w:sz w:val="28"/>
+                              <w:szCs w:val="28"/>
+                              <w:rtl/>
+                            </w:rPr>
+                            <w:t>{{signatureRightRole}}</w:t>
+                          </w:r>
+                        </w:p>
+                        <w:p>
+                          <w:pPr>
+                            <w:pStyle w:val="MOE-Cover-NoSpacing"/>
+                            <w:jc w:val="center"/>
+                            <w:rPr>
+                              <w:rFonts w:ascii="Helvetica Neue W23 for SKY Reg" w:hAnsi="Helvetica Neue W23 for SKY Reg" w:cs="Helvetica Neue W23 for SKY Reg"/>
+                              <w:b/>
+                              <w:bCs/>
+                              <w:color w:val="0B3946"/>
+                              <w:rtl/>
+                            </w:rPr>
+                          </w:pPr>
+                        </w:p>
+                        <w:p>
+                          <w:pPr>
+                            <w:pStyle w:val="MOE-Cover-NoSpacing"/>
+                            <w:jc w:val="center"/>
+                            <w:rPr>
+                              <w:rFonts w:ascii="Helvetica Neue W23 for SKY Reg" w:hAnsi="Helvetica Neue W23 for SKY Reg" w:cs="Helvetica Neue W23 for SKY Reg"/>
+                              <w:b/>
+                              <w:bCs/>
+                              <w:color w:val="0DA9A6"/>
+                              <w:sz w:val="28"/>
+                              <w:szCs w:val="28"/>
+                            </w:rPr>
+                          </w:pPr>
+                          <w:r>
+                            <w:rPr>
+                              <w:rFonts w:ascii="Helvetica Neue W23 for SKY Reg" w:hAnsi="Helvetica Neue W23 for SKY Reg" w:cs="Helvetica Neue W23 for SKY Reg" w:hint="cs"/>
+                              <w:b/>
+                              <w:bCs/>
+                              <w:color w:val="0DA9A6"/>
+                              <w:rtl/>
+                            </w:rPr>
+                            <w:t>{{signatureRightName}}</w:t>
+                          </w:r>
+                        </w:p>
+                      </w:txbxContent>
+                    </v:textbox>
+                    <w10:wrap type="square" anchorx="margin" anchory="page"/>
+                  </v:shape>
+                </w:pict>
+              </mc:Fallback>
+            </mc:AlternateContent>
+          </w:r>
+          <w:r>
+            <w:rPr>
+              <w:noProof/>
+              <w:color w:val="D9D9D9" w:themeColor="background1" w:themeShade="D9"/>
+            </w:rPr>
+            <mc:AlternateContent>
+              <mc:Choice Requires="wps">
+                <w:drawing>
+                  <wp:anchor distT="0" distB="0" distL="114300" distR="114300" simplePos="0" relativeHeight="251650048" behindDoc="0" locked="0" layoutInCell="1" allowOverlap="1" wp14:anchorId="3135C431" wp14:editId="0B363D81">
+                    <wp:simplePos x="0" y="0"/>
+                    <wp:positionH relativeFrom="page">
+                      <wp:posOffset>1184910</wp:posOffset>
+                    </wp:positionH>
+                    <wp:positionV relativeFrom="paragraph">
+                      <wp:posOffset>3038510</wp:posOffset>
+                    </wp:positionV>
+                    <wp:extent cx="2711450" cy="133350"/>
+                    <wp:effectExtent l="0" t="0" r="0" b="0"/>
+                    <wp:wrapNone/>
+                    <wp:docPr id="1358706951" name="مستطيل 4"/>
+                    <wp:cNvGraphicFramePr/>
+                    <a:graphic xmlns:a="http://schemas.openxmlformats.org/drawingml/2006/main">
+                      <a:graphicData uri="http://schemas.microsoft.com/office/word/2010/wordprocessingShape">
+                        <wps:wsp>
+                          <wps:cNvSpPr/>
+                          <wps:spPr>
+                            <a:xfrm flipH="1" flipV="1">
+                              <a:off x="0" y="0"/>
+                              <a:ext cx="2711450" cy="133350"/>
+                            </a:xfrm>
+                            <a:prstGeom prst="rect">
+                              <a:avLst/>
+                            </a:prstGeom>
+                            <a:gradFill flip="none" rotWithShape="1">
+                              <a:gsLst>
+                                <a:gs pos="0">
+                                  <a:srgbClr val="08A86A"/>
+                                </a:gs>
+                                <a:gs pos="100000">
+                                  <a:srgbClr val="3D7DBA"/>
+                                </a:gs>
+                              </a:gsLst>
+                              <a:lin ang="0" scaled="1"/>
+                              <a:tileRect/>
+                            </a:gradFill>
+                            <a:ln w="12700" cap="flat" cmpd="sng" algn="ctr">
+                              <a:noFill/>
+                              <a:prstDash val="solid"/>
+                              <a:miter lim="800000"/>
+                            </a:ln>
+                            <a:effectLst/>
+                          </wps:spPr>
+                          <wps:bodyPr rtlCol="1" anchor="ctr"/>
+                        </wps:wsp>
+                      </a:graphicData>
+                    </a:graphic>
+                    <wp14:sizeRelH relativeFrom="margin">
+                      <wp14:pctWidth>0</wp14:pctWidth>
+                    </wp14:sizeRelH>
+                    <wp14:sizeRelV relativeFrom="margin">
+                      <wp14:pctHeight>0</wp14:pctHeight>
+                    </wp14:sizeRelV>
+                  </wp:anchor>
+                </w:drawing>
+              </mc:Choice>
+              <mc:Fallback xmlns:a="http://schemas.openxmlformats.org/drawingml/2006/main" xmlns:pic="http://schemas.openxmlformats.org/drawingml/2006/picture" xmlns:a14="http://schemas.microsoft.com/office/drawing/2010/main">
+                <w:pict>
+                  <v:rect id="مستطيل 4" style="position:absolute;left:0;text-align:left;margin-left:93.3pt;margin-top:239.25pt;width:213.5pt;height:10.5pt;flip:x y;z-index:251671552;visibility:visible;mso-wrap-style:square;mso-width-percent:0;mso-height-percent:0;mso-wrap-distance-left:9pt;mso-wrap-distance-top:0;mso-wrap-distance-right:9pt;mso-wrap-distance-bottom:0;mso-position-horizontal:absolute;mso-position-horizontal-relative:page;mso-position-vertical:absolute;mso-position-vertical-relative:text;mso-width-percent:0;mso-height-percent:0;mso-width-relative:margin;mso-height-relative:margin;v-text-anchor:middle" o:spid="_x0000_s1026" fillcolor="#08a86a" stroked="f" strokeweight="1pt" o:gfxdata="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" w14:anchorId="25F2B31E">
+                    <v:fill type="gradient" color2="#3d7dba" angle="90" focus="100%" rotate="t"/>
+                    <w10:wrap anchorx="page"/>
+                  </v:rect>
+                </w:pict>
+              </mc:Fallback>
+            </mc:AlternateContent>
+          </w:r>
+        </w:p>
+      </w:sdtContent>
+    </w:sdt>
+    <w:p>
+      <w:pPr>
+        <w:spacing w:after="0" w:line="20" w:lineRule="exact"/>
+        <w:sectPr>
+          <w:headerReference w:type="even" r:id="rId12"/>
+          <w:headerReference w:type="default" r:id="rId13"/>
+          <w:footerReference w:type="even" r:id="rId14"/>
+          <w:footerReference w:type="default" r:id="rId15"/>
+          <w:headerReference w:type="first" r:id="rId16"/>
+          <w:footerReference w:type="first" r:id="rId17"/>
+          <w:pgSz w:w="11906" w:h="16838"/>
+          <w:pgMar w:top="720" w:right="720" w:bottom="720" w:left="720" w:header="1418" w:footer="1134" w:gutter="0"/>
+          <w:pgNumType w:start="0"/>
+          <w:cols w:space="708"/>
+          <w:titlePg/>
+          <w:bidi/>
+          <w:rtlGutter/>
+          <w:docGrid w:linePitch="360"/>
+        </w:sectPr>
+      </w:pPr>
+    </w:p>
     <w:p>
       <w:pPr>
         <w:rPr>
@@ -1828,11 +3310,7 @@
           </mc:Choice>
           <mc:Fallback>
             <w:pict>
-              <v:shapetype w14:anchorId="0831379A" id="_x0000_t202" coordsize="21600,21600" o:spt="202" path="m,l,21600r21600,l21600,xe">
-                <v:stroke joinstyle="miter"/>
-                <v:path gradientshapeok="t" o:connecttype="rect"/>
-              </v:shapetype>
-              <v:shape id="مربع نص 2" o:spid="_x0000_s1026" type="#_x0000_t202" style="position:absolute;left:0;text-align:left;margin-left:95.9pt;margin-top:99.7pt;width:147.1pt;height:99.75pt;flip:x;z-index:251659264;visibility:visible;mso-wrap-style:square;mso-width-percent:0;mso-height-percent:0;mso-wrap-distance-left:9pt;mso-wrap-distance-top:3.6pt;mso-wrap-distance-right:9pt;mso-wrap-distance-bottom:3.6pt;mso-position-horizontal:right;mso-position-horizontal-relative:margin;mso-position-vertical:absolute;mso-position-vertical-relative:text;mso-width-percent:0;mso-height-percent:0;mso-width-relative:margin;mso-height-relative:margin;v-text-anchor:top" o:gfxdata="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" filled="f" stroked="f">
+              <v:shape w14:anchorId="0831379A" id="مربع نص 2" o:spid="_x0000_s1030" type="#_x0000_t202" style="position:absolute;left:0;text-align:left;margin-left:95.9pt;margin-top:99.7pt;width:147.1pt;height:99.75pt;flip:x;z-index:251659264;visibility:visible;mso-wrap-style:square;mso-width-percent:0;mso-height-percent:0;mso-wrap-distance-left:9pt;mso-wrap-distance-top:3.6pt;mso-wrap-distance-right:9pt;mso-wrap-distance-bottom:3.6pt;mso-position-horizontal:right;mso-position-horizontal-relative:margin;mso-position-vertical:absolute;mso-position-vertical-relative:text;mso-width-percent:0;mso-height-percent:0;mso-width-relative:margin;mso-height-relative:margin;v-text-anchor:top" o:gfxdata="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" filled="f" stroked="f">
                 <v:textbox>
                   <w:txbxContent>
                     <w:p>
@@ -2010,6 +3488,14 @@
                                 <w:sz w:val="24"/>
                               </w:rPr>
                               <w:t>}}</w:t>
+                            </w:r>
+                            <w:r>
+                              <w:rPr>
+                                <w:rFonts w:ascii="Helvetica Neue W23 for SKY Reg" w:hAnsi="Helvetica Neue W23 for SKY Reg"/>
+                                <w:b/>
+                                <w:bCs/>
+                                <w:sz w:val="24"/>
+                              </w:rPr>
                               <w:br/>
                               <w:t>{{</w:t>
                             </w:r>
@@ -2021,25 +3507,7 @@
                                 <w:bCs/>
                                 <w:sz w:val="24"/>
                               </w:rPr>
-                              <w:t>sig</w:t>
-                            </w:r>
-                            <w:r>
-                              <w:rPr>
-                                <w:rFonts w:ascii="Helvetica Neue W23 for SKY Reg" w:hAnsi="Helvetica Neue W23 for SKY Reg"/>
-                                <w:b/>
-                                <w:bCs/>
-                                <w:sz w:val="24"/>
-                              </w:rPr>
-                              <w:t/>
-                            </w:r>
-                            <w:r>
-                              <w:rPr>
-                                <w:rFonts w:ascii="Helvetica Neue W23 for SKY Reg" w:hAnsi="Helvetica Neue W23 for SKY Reg"/>
-                                <w:b/>
-                                <w:bCs/>
-                                <w:sz w:val="24"/>
-                              </w:rPr>
-                              <w:t>natureLeftName</w:t>
+                              <w:t>signatureLeftName</w:t>
                             </w:r>
                             <w:proofErr w:type="spellEnd"/>
                             <w:r>
@@ -2071,7 +3539,7 @@
           </mc:Choice>
           <mc:Fallback>
             <w:pict>
-              <v:shape w14:anchorId="4D0DA98A" id="_x0000_s1027" type="#_x0000_t202" style="position:absolute;left:0;text-align:left;margin-left:0;margin-top:99.7pt;width:147.1pt;height:99.75pt;flip:x;z-index:251661312;visibility:visible;mso-wrap-style:square;mso-width-percent:0;mso-height-percent:0;mso-wrap-distance-left:9pt;mso-wrap-distance-top:3.6pt;mso-wrap-distance-right:9pt;mso-wrap-distance-bottom:3.6pt;mso-position-horizontal:left;mso-position-horizontal-relative:margin;mso-position-vertical:absolute;mso-position-vertical-relative:text;mso-width-percent:0;mso-height-percent:0;mso-width-relative:margin;mso-height-relative:margin;v-text-anchor:top" o:gfxdata="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" filled="f" stroked="f">
+              <v:shape w14:anchorId="4D0DA98A" id="_x0000_s1031" type="#_x0000_t202" style="position:absolute;left:0;text-align:left;margin-left:0;margin-top:99.7pt;width:147.1pt;height:99.75pt;flip:x;z-index:251661312;visibility:visible;mso-wrap-style:square;mso-width-percent:0;mso-height-percent:0;mso-wrap-distance-left:9pt;mso-wrap-distance-top:3.6pt;mso-wrap-distance-right:9pt;mso-wrap-distance-bottom:3.6pt;mso-position-horizontal:left;mso-position-horizontal-relative:margin;mso-position-vertical:absolute;mso-position-vertical-relative:text;mso-width-percent:0;mso-height-percent:0;mso-width-relative:margin;mso-height-relative:margin;v-text-anchor:top" o:gfxdata="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" filled="f" stroked="f">
                 <v:textbox>
                   <w:txbxContent>
                     <w:p>
@@ -2112,6 +3580,14 @@
                           <w:sz w:val="24"/>
                         </w:rPr>
                         <w:t>}}</w:t>
+                      </w:r>
+                      <w:r>
+                        <w:rPr>
+                          <w:rFonts w:ascii="Helvetica Neue W23 for SKY Reg" w:hAnsi="Helvetica Neue W23 for SKY Reg"/>
+                          <w:b/>
+                          <w:bCs/>
+                          <w:sz w:val="24"/>
+                        </w:rPr>
                         <w:br/>
                         <w:t>{{</w:t>
                       </w:r>
@@ -2123,25 +3599,7 @@
                           <w:bCs/>
                           <w:sz w:val="24"/>
                         </w:rPr>
-                        <w:t>sig</w:t>
-                      </w:r>
-                      <w:r>
-                        <w:rPr>
-                          <w:rFonts w:ascii="Helvetica Neue W23 for SKY Reg" w:hAnsi="Helvetica Neue W23 for SKY Reg"/>
-                          <w:b/>
-                          <w:bCs/>
-                          <w:sz w:val="24"/>
-                        </w:rPr>
-                        <w:t/>
-                      </w:r>
-                      <w:r>
-                        <w:rPr>
-                          <w:rFonts w:ascii="Helvetica Neue W23 for SKY Reg" w:hAnsi="Helvetica Neue W23 for SKY Reg"/>
-                          <w:b/>
-                          <w:bCs/>
-                          <w:sz w:val="24"/>
-                        </w:rPr>
-                        <w:t>natureLeftName</w:t>
+                        <w:t>signatureLeftName</w:t>
                       </w:r>
                       <w:proofErr w:type="spellEnd"/>
                       <w:r>
@@ -2164,8 +3622,8 @@
       </w:r>
     </w:p>
     <w:sectPr>
-      <w:headerReference w:type="default" r:id="rId8"/>
-      <w:footerReference w:type="default" r:id="rId9"/>
+      <w:headerReference w:type="default" r:id="rId18"/>
+      <w:footerReference w:type="default" r:id="rId19"/>
       <w:pgSz w:w="11906" w:h="16838"/>
       <w:pgMar w:top="1418" w:right="1418" w:bottom="1418" w:left="1418" w:header="709" w:footer="709" w:gutter="0"/>
       <w:cols w:space="708"/>
@@ -2178,7 +3636,7 @@
 </file>
 
 <file path=word/endnotes.xml><?xml version="1.0" encoding="utf-8"?>
-<w:endnotes xmlns:wpc="http://schemas.microsoft.com/office/word/2010/wordprocessingCanvas" xmlns:cx="http://schemas.microsoft.com/office/drawing/2014/chartex" xmlns:cx1="http://schemas.microsoft.com/office/drawing/2015/9/8/chartex" xmlns:cx2="http://schemas.microsoft.com/office/drawing/2015/10/21/chartex" xmlns:cx3="http://schemas.microsoft.com/office/drawing/2016/5/9/chartex" xmlns:cx4="http://schemas.microsoft.com/office/drawing/2016/5/10/chartex" xmlns:cx5="http://schemas.microsoft.com/office/drawing/2016/5/11/chartex" xmlns:cx6="http://schemas.microsoft.com/office/drawing/2016/5/12/chartex" xmlns:cx7="http://schemas.microsoft.com/office/drawing/2016/5/13/chartex" xmlns:cx8="http://schemas.microsoft.com/office/drawing/2016/5/14/chartex" xmlns:mc="http://schemas.openxmlformats.org/markup-compatibility/2006" xmlns:aink="http://schemas.microsoft.com/office/drawing/2016/ink" xmlns:am3d="http://schemas.microsoft.com/office/drawing/2017/model3d" xmlns:o="urn:schemas-microsoft-com:office:office" xmlns:oel="http://schemas.microsoft.com/office/2019/extlst" xmlns:r="http://schemas.openxmlformats.org/officeDocument/2006/relationships" xmlns:m="http://schemas.openxmlformats.org/officeDocument/2006/math" xmlns:v="urn:schemas-microsoft-com:vml" xmlns:wp14="http://schemas.microsoft.com/office/word/2010/wordprocessingDrawing" xmlns:wp="http://schemas.openxmlformats.org/drawingml/2006/wordprocessingDrawing" xmlns:w10="urn:schemas-microsoft-com:office:word" xmlns:w="http://schemas.openxmlformats.org/wordprocessingml/2006/main" xmlns:w14="http://schemas.microsoft.com/office/word/2010/wordml" xmlns:w15="http://schemas.microsoft.com/office/word/2012/wordml" xmlns:w16cex="http://schemas.microsoft.com/office/word/2018/wordml/cex" xmlns:w16cid="http://schemas.microsoft.com/office/word/2016/wordml/cid" xmlns:w16="http://schemas.microsoft.com/office/word/2018/wordml" xmlns:w16du="http://schemas.microsoft.com/office/word/2023/wordml/word16du" xmlns:w16sdtdh="http://schemas.microsoft.com/office/word/2020/wordml/sdtdatahash" xmlns:w16sdtfl="http://schemas.microsoft.com/office/word/2024/wordml/sdtformatlock" xmlns:w16se="http://schemas.microsoft.com/office/word/2015/wordml/symex" xmlns:wpg="http://schemas.microsoft.com/office/word/2010/wordprocessingGroup" xmlns:wpi="http://schemas.microsoft.com/office/word/2010/wordprocessingInk" xmlns:wne="http://schemas.microsoft.com/office/word/2006/wordml" xmlns:wps="http://schemas.microsoft.com/office/word/2010/wordprocessingShape" mc:Ignorable="w14 w15 w16se w16cid w16 w16cex w16sdtdh w16sdtfl w16du wp14">
+<w:endnotes xmlns:wpc="http://schemas.microsoft.com/office/word/2010/wordprocessingCanvas" xmlns:cx="http://schemas.microsoft.com/office/drawing/2014/chartex" xmlns:cx1="http://schemas.microsoft.com/office/drawing/2015/9/8/chartex" xmlns:cx2="http://schemas.microsoft.com/office/drawing/2015/10/21/chartex" xmlns:cx3="http://schemas.microsoft.com/office/drawing/2016/5/9/chartex" xmlns:cx4="http://schemas.microsoft.com/office/drawing/2016/5/10/chartex" xmlns:cx5="http://schemas.microsoft.com/office/drawing/2016/5/11/chartex" xmlns:cx6="http://schemas.microsoft.com/office/drawing/2016/5/12/chartex" xmlns:cx7="http://schemas.microsoft.com/office/drawing/2016/5/13/chartex" xmlns:cx8="http://schemas.microsoft.com/office/drawing/2016/5/14/chartex" xmlns:mc="http://schemas.openxmlformats.org/markup-compatibility/2006" xmlns:aink="http://schemas.microsoft.com/office/drawing/2016/ink" xmlns:am3d="http://schemas.microsoft.com/office/drawing/2017/model3d" xmlns:o="urn:schemas-microsoft-com:office:office" xmlns:oel="http://schemas.microsoft.com/office/2019/extlst" xmlns:r="http://schemas.openxmlformats.org/officeDocument/2006/relationships" xmlns:m="http://schemas.openxmlformats.org/officeDocument/2006/math" xmlns:v="urn:schemas-microsoft-com:vml" xmlns:wp14="http://schemas.microsoft.com/office/word/2010/wordprocessingDrawing" xmlns:wp="http://schemas.openxmlformats.org/drawingml/2006/wordprocessingDrawing" xmlns:w10="urn:schemas-microsoft-com:office:word" xmlns:w="http://schemas.openxmlformats.org/wordprocessingml/2006/main" xmlns:w14="http://schemas.microsoft.com/office/word/2010/wordml" xmlns:w15="http://schemas.microsoft.com/office/word/2012/wordml" xmlns:w16cei="http://schemas.microsoft.com/office/word/2026/wordml/cei" xmlns:w16cex="http://schemas.microsoft.com/office/word/2018/wordml/cex" xmlns:w16cid="http://schemas.microsoft.com/office/word/2016/wordml/cid" xmlns:w16="http://schemas.microsoft.com/office/word/2018/wordml" xmlns:w16du="http://schemas.microsoft.com/office/word/2023/wordml/word16du" xmlns:w16sdtdh="http://schemas.microsoft.com/office/word/2020/wordml/sdtdatahash" xmlns:w16sdtfl="http://schemas.microsoft.com/office/word/2024/wordml/sdtformatlock" xmlns:w16se="http://schemas.microsoft.com/office/word/2015/wordml/symex" xmlns:wpg="http://schemas.microsoft.com/office/word/2010/wordprocessingGroup" xmlns:wpi="http://schemas.microsoft.com/office/word/2010/wordprocessingInk" xmlns:wne="http://schemas.microsoft.com/office/word/2006/wordml" xmlns:wps="http://schemas.microsoft.com/office/word/2010/wordprocessingShape" mc:Ignorable="w14 w15 w16se w16cid w16 w16cex w16sdtdh w16sdtfl w16du wp14">
   <w:endnote w:type="separator" w:id="-1">
     <w:p>
       <w:pPr>
@@ -2203,7 +3661,364 @@
 </file>
 
 <file path=word/footer1.xml><?xml version="1.0" encoding="utf-8"?>
-<w:ftr xmlns:wpc="http://schemas.microsoft.com/office/word/2010/wordprocessingCanvas" xmlns:cx="http://schemas.microsoft.com/office/drawing/2014/chartex" xmlns:cx1="http://schemas.microsoft.com/office/drawing/2015/9/8/chartex" xmlns:cx2="http://schemas.microsoft.com/office/drawing/2015/10/21/chartex" xmlns:cx3="http://schemas.microsoft.com/office/drawing/2016/5/9/chartex" xmlns:cx4="http://schemas.microsoft.com/office/drawing/2016/5/10/chartex" xmlns:cx5="http://schemas.microsoft.com/office/drawing/2016/5/11/chartex" xmlns:cx6="http://schemas.microsoft.com/office/drawing/2016/5/12/chartex" xmlns:cx7="http://schemas.microsoft.com/office/drawing/2016/5/13/chartex" xmlns:cx8="http://schemas.microsoft.com/office/drawing/2016/5/14/chartex" xmlns:mc="http://schemas.openxmlformats.org/markup-compatibility/2006" xmlns:aink="http://schemas.microsoft.com/office/drawing/2016/ink" xmlns:am3d="http://schemas.microsoft.com/office/drawing/2017/model3d" xmlns:o="urn:schemas-microsoft-com:office:office" xmlns:oel="http://schemas.microsoft.com/office/2019/extlst" xmlns:r="http://schemas.openxmlformats.org/officeDocument/2006/relationships" xmlns:m="http://schemas.openxmlformats.org/officeDocument/2006/math" xmlns:v="urn:schemas-microsoft-com:vml" xmlns:wp14="http://schemas.microsoft.com/office/word/2010/wordprocessingDrawing" xmlns:wp="http://schemas.openxmlformats.org/drawingml/2006/wordprocessingDrawing" xmlns:w10="urn:schemas-microsoft-com:office:word" xmlns:w="http://schemas.openxmlformats.org/wordprocessingml/2006/main" xmlns:w14="http://schemas.microsoft.com/office/word/2010/wordml" xmlns:w15="http://schemas.microsoft.com/office/word/2012/wordml" xmlns:w16cex="http://schemas.microsoft.com/office/word/2018/wordml/cex" xmlns:w16cid="http://schemas.microsoft.com/office/word/2016/wordml/cid" xmlns:w16="http://schemas.microsoft.com/office/word/2018/wordml" xmlns:w16du="http://schemas.microsoft.com/office/word/2023/wordml/word16du" xmlns:w16sdtdh="http://schemas.microsoft.com/office/word/2020/wordml/sdtdatahash" xmlns:w16sdtfl="http://schemas.microsoft.com/office/word/2024/wordml/sdtformatlock" xmlns:w16se="http://schemas.microsoft.com/office/word/2015/wordml/symex" xmlns:wpg="http://schemas.microsoft.com/office/word/2010/wordprocessingGroup" xmlns:wpi="http://schemas.microsoft.com/office/word/2010/wordprocessingInk" xmlns:wne="http://schemas.microsoft.com/office/word/2006/wordml" xmlns:wps="http://schemas.microsoft.com/office/word/2010/wordprocessingShape" mc:Ignorable="w14 w15 w16se w16cid w16 w16cex w16sdtdh w16sdtfl w16du wp14">
+<w:ftr xmlns:wpc="http://schemas.microsoft.com/office/word/2010/wordprocessingCanvas" xmlns:cx="http://schemas.microsoft.com/office/drawing/2014/chartex" xmlns:cx1="http://schemas.microsoft.com/office/drawing/2015/9/8/chartex" xmlns:cx2="http://schemas.microsoft.com/office/drawing/2015/10/21/chartex" xmlns:cx3="http://schemas.microsoft.com/office/drawing/2016/5/9/chartex" xmlns:cx4="http://schemas.microsoft.com/office/drawing/2016/5/10/chartex" xmlns:cx5="http://schemas.microsoft.com/office/drawing/2016/5/11/chartex" xmlns:cx6="http://schemas.microsoft.com/office/drawing/2016/5/12/chartex" xmlns:cx7="http://schemas.microsoft.com/office/drawing/2016/5/13/chartex" xmlns:cx8="http://schemas.microsoft.com/office/drawing/2016/5/14/chartex" xmlns:mc="http://schemas.openxmlformats.org/markup-compatibility/2006" xmlns:aink="http://schemas.microsoft.com/office/drawing/2016/ink" xmlns:am3d="http://schemas.microsoft.com/office/drawing/2017/model3d" xmlns:o="urn:schemas-microsoft-com:office:office" xmlns:oel="http://schemas.microsoft.com/office/2019/extlst" xmlns:r="http://schemas.openxmlformats.org/officeDocument/2006/relationships" xmlns:m="http://schemas.openxmlformats.org/officeDocument/2006/math" xmlns:v="urn:schemas-microsoft-com:vml" xmlns:wp14="http://schemas.microsoft.com/office/word/2010/wordprocessingDrawing" xmlns:wp="http://schemas.openxmlformats.org/drawingml/2006/wordprocessingDrawing" xmlns:w10="urn:schemas-microsoft-com:office:word" xmlns:w="http://schemas.openxmlformats.org/wordprocessingml/2006/main" xmlns:w14="http://schemas.microsoft.com/office/word/2010/wordml" xmlns:w15="http://schemas.microsoft.com/office/word/2012/wordml" xmlns:w16cei="http://schemas.microsoft.com/office/word/2026/wordml/cei" xmlns:w16cex="http://schemas.microsoft.com/office/word/2018/wordml/cex" xmlns:w16cid="http://schemas.microsoft.com/office/word/2016/wordml/cid" xmlns:w16="http://schemas.microsoft.com/office/word/2018/wordml" xmlns:w16du="http://schemas.microsoft.com/office/word/2023/wordml/word16du" xmlns:w16sdtdh="http://schemas.microsoft.com/office/word/2020/wordml/sdtdatahash" xmlns:w16sdtfl="http://schemas.microsoft.com/office/word/2024/wordml/sdtformatlock" xmlns:w16se="http://schemas.microsoft.com/office/word/2015/wordml/symex" xmlns:wpg="http://schemas.microsoft.com/office/word/2010/wordprocessingGroup" xmlns:wpi="http://schemas.microsoft.com/office/word/2010/wordprocessingInk" xmlns:wne="http://schemas.microsoft.com/office/word/2006/wordml" xmlns:wps="http://schemas.microsoft.com/office/word/2010/wordprocessingShape" mc:Ignorable="w14 w15 w16se w16cid w16 w16cex w16sdtdh w16sdtfl w16du wp14">
+  <w:p>
+    <w:pPr>
+      <w:pStyle w:val="a4"/>
+    </w:pPr>
+  </w:p>
+</w:ftr>
+</file>
+
+<file path=word/footer2.xml><?xml version="1.0" encoding="utf-8"?>
+<w:ftr xmlns:wpc="http://schemas.microsoft.com/office/word/2010/wordprocessingCanvas" xmlns:cx="http://schemas.microsoft.com/office/drawing/2014/chartex" xmlns:cx1="http://schemas.microsoft.com/office/drawing/2015/9/8/chartex" xmlns:cx2="http://schemas.microsoft.com/office/drawing/2015/10/21/chartex" xmlns:cx3="http://schemas.microsoft.com/office/drawing/2016/5/9/chartex" xmlns:cx4="http://schemas.microsoft.com/office/drawing/2016/5/10/chartex" xmlns:cx5="http://schemas.microsoft.com/office/drawing/2016/5/11/chartex" xmlns:cx6="http://schemas.microsoft.com/office/drawing/2016/5/12/chartex" xmlns:cx7="http://schemas.microsoft.com/office/drawing/2016/5/13/chartex" xmlns:cx8="http://schemas.microsoft.com/office/drawing/2016/5/14/chartex" xmlns:mc="http://schemas.openxmlformats.org/markup-compatibility/2006" xmlns:aink="http://schemas.microsoft.com/office/drawing/2016/ink" xmlns:am3d="http://schemas.microsoft.com/office/drawing/2017/model3d" xmlns:o="urn:schemas-microsoft-com:office:office" xmlns:oel="http://schemas.microsoft.com/office/2019/extlst" xmlns:r="http://schemas.openxmlformats.org/officeDocument/2006/relationships" xmlns:m="http://schemas.openxmlformats.org/officeDocument/2006/math" xmlns:v="urn:schemas-microsoft-com:vml" xmlns:wp14="http://schemas.microsoft.com/office/word/2010/wordprocessingDrawing" xmlns:wp="http://schemas.openxmlformats.org/drawingml/2006/wordprocessingDrawing" xmlns:w10="urn:schemas-microsoft-com:office:word" xmlns:w="http://schemas.openxmlformats.org/wordprocessingml/2006/main" xmlns:w14="http://schemas.microsoft.com/office/word/2010/wordml" xmlns:w15="http://schemas.microsoft.com/office/word/2012/wordml" xmlns:w16cei="http://schemas.microsoft.com/office/word/2026/wordml/cei" xmlns:w16cex="http://schemas.microsoft.com/office/word/2018/wordml/cex" xmlns:w16cid="http://schemas.microsoft.com/office/word/2016/wordml/cid" xmlns:w16="http://schemas.microsoft.com/office/word/2018/wordml" xmlns:w16du="http://schemas.microsoft.com/office/word/2023/wordml/word16du" xmlns:w16sdtdh="http://schemas.microsoft.com/office/word/2020/wordml/sdtdatahash" xmlns:w16sdtfl="http://schemas.microsoft.com/office/word/2024/wordml/sdtformatlock" xmlns:w16se="http://schemas.microsoft.com/office/word/2015/wordml/symex" xmlns:wpg="http://schemas.microsoft.com/office/word/2010/wordprocessingGroup" xmlns:wpi="http://schemas.microsoft.com/office/word/2010/wordprocessingInk" xmlns:wne="http://schemas.microsoft.com/office/word/2006/wordml" xmlns:wps="http://schemas.microsoft.com/office/word/2010/wordprocessingShape" mc:Ignorable="w14 w15 w16se w16cid w16 w16cex w16sdtdh w16sdtfl w16du wp14">
+  <w:p>
+    <w:pPr>
+      <w:pStyle w:val="a4"/>
+      <w:rPr>
+        <w:rtl/>
+      </w:rPr>
+    </w:pPr>
+    <w:r>
+      <w:rPr>
+        <w:noProof/>
+        <w:rtl/>
+      </w:rPr>
+      <mc:AlternateContent>
+        <mc:Choice Requires="wps">
+          <w:drawing>
+            <wp:anchor distT="45720" distB="45720" distL="114300" distR="114300" simplePos="0" relativeHeight="251662336" behindDoc="0" locked="0" layoutInCell="1" allowOverlap="1" wp14:anchorId="5E01D4D6" wp14:editId="12946018">
+              <wp:simplePos x="0" y="0"/>
+              <wp:positionH relativeFrom="margin">
+                <wp:posOffset>927100</wp:posOffset>
+              </wp:positionH>
+              <wp:positionV relativeFrom="paragraph">
+                <wp:posOffset>464087</wp:posOffset>
+              </wp:positionV>
+              <wp:extent cx="4792345" cy="393065"/>
+              <wp:effectExtent l="0" t="0" r="0" b="0"/>
+              <wp:wrapSquare wrapText="bothSides"/>
+              <wp:docPr id="2138136230" name="مربع نص 2"/>
+              <wp:cNvGraphicFramePr>
+                <a:graphicFrameLocks xmlns:a="http://schemas.openxmlformats.org/drawingml/2006/main"/>
+              </wp:cNvGraphicFramePr>
+              <a:graphic xmlns:a="http://schemas.openxmlformats.org/drawingml/2006/main">
+                <a:graphicData uri="http://schemas.microsoft.com/office/word/2010/wordprocessingShape">
+                  <wps:wsp>
+                    <wps:cNvSpPr txBox="1">
+                      <a:spLocks noChangeArrowheads="1"/>
+                    </wps:cNvSpPr>
+                    <wps:spPr bwMode="auto">
+                      <a:xfrm flipH="1">
+                        <a:off x="0" y="0"/>
+                        <a:ext cx="4792345" cy="393065"/>
+                      </a:xfrm>
+                      <a:prstGeom prst="rect">
+                        <a:avLst/>
+                      </a:prstGeom>
+                      <a:noFill/>
+                      <a:ln w="9525">
+                        <a:noFill/>
+                        <a:miter lim="800000"/>
+                        <a:headEnd/>
+                        <a:tailEnd/>
+                      </a:ln>
+                    </wps:spPr>
+                    <wps:txbx>
+                      <w:txbxContent>
+                        <w:p>
+                          <w:pPr>
+                            <w:jc w:val="center"/>
+                            <w:rPr>
+                              <w:rFonts w:ascii="Helvetica Neue W23 for SKY Reg" w:hAnsi="Helvetica Neue W23 for SKY Reg"/>
+                              <w:color w:val="FFFFFF" w:themeColor="background1"/>
+                              <w:rtl/>
+                            </w:rPr>
+                          </w:pPr>
+                          <w:r>
+                            <w:rPr>
+                              <w:rFonts w:ascii="Helvetica Neue W23 for SKY Reg" w:hAnsi="Helvetica Neue W23 for SKY Reg" w:hint="cs"/>
+                              <w:color w:val="FFFFFF" w:themeColor="background1"/>
+                              <w:rtl/>
+                            </w:rPr>
+                            <w:t>خطة أعمال الموجه الطلابي للاختبارا</w:t>
+                          </w:r>
+                          <w:r>
+                            <w:rPr>
+                              <w:rFonts w:ascii="Helvetica Neue W23 for SKY Reg" w:hAnsi="Helvetica Neue W23 for SKY Reg" w:hint="eastAsia"/>
+                              <w:color w:val="FFFFFF" w:themeColor="background1"/>
+                              <w:rtl/>
+                            </w:rPr>
+                            <w:t>ت</w:t>
+                          </w:r>
+                          <w:r>
+                            <w:rPr>
+                              <w:rFonts w:ascii="Helvetica Neue W23 for SKY Reg" w:hAnsi="Helvetica Neue W23 for SKY Reg" w:hint="cs"/>
+                              <w:color w:val="FFFFFF" w:themeColor="background1"/>
+                              <w:rtl/>
+                            </w:rPr>
+                            <w:t xml:space="preserve"> النهائية</w:t>
+                          </w:r>
+                          <w:r>
+                            <w:rPr>
+                              <w:rFonts w:ascii="Helvetica Neue W23 for SKY Reg" w:hAnsi="Helvetica Neue W23 for SKY Reg" w:hint="cs"/>
+                              <w:color w:val="FFFFFF" w:themeColor="background1"/>
+                              <w:rtl/>
+                            </w:rPr>
+                            <w:t xml:space="preserve"> للفصل الدراسي الثاني</w:t>
+                          </w:r>
+                          <w:r>
+                            <w:rPr>
+                              <w:rFonts w:ascii="Helvetica Neue W23 for SKY Reg" w:hAnsi="Helvetica Neue W23 for SKY Reg"/>
+                              <w:color w:val="FFFFFF" w:themeColor="background1"/>
+                              <w:rtl/>
+                            </w:rPr>
+                            <w:t xml:space="preserve"> 1446هـ</w:t>
+                          </w:r>
+                        </w:p>
+                      </w:txbxContent>
+                    </wps:txbx>
+                    <wps:bodyPr rot="0" vert="horz" wrap="square" lIns="91440" tIns="45720" rIns="91440" bIns="45720" anchor="t" anchorCtr="0">
+                      <a:noAutofit/>
+                    </wps:bodyPr>
+                  </wps:wsp>
+                </a:graphicData>
+              </a:graphic>
+              <wp14:sizeRelH relativeFrom="margin">
+                <wp14:pctWidth>0</wp14:pctWidth>
+              </wp14:sizeRelH>
+              <wp14:sizeRelV relativeFrom="margin">
+                <wp14:pctHeight>0</wp14:pctHeight>
+              </wp14:sizeRelV>
+            </wp:anchor>
+          </w:drawing>
+        </mc:Choice>
+        <mc:Fallback>
+          <w:pict>
+            <v:shapetype w14:anchorId="5E01D4D6" id="_x0000_t202" coordsize="21600,21600" o:spt="202" path="m,l,21600r21600,l21600,xe">
+              <v:stroke joinstyle="miter"/>
+              <v:path gradientshapeok="t" o:connecttype="rect"/>
+            </v:shapetype>
+            <v:shape id="_x0000_s1034" type="#_x0000_t202" style="position:absolute;left:0;text-align:left;margin-left:73pt;margin-top:36.55pt;width:377.35pt;height:30.95pt;flip:x;z-index:251662336;visibility:visible;mso-wrap-style:square;mso-width-percent:0;mso-height-percent:0;mso-wrap-distance-left:9pt;mso-wrap-distance-top:3.6pt;mso-wrap-distance-right:9pt;mso-wrap-distance-bottom:3.6pt;mso-position-horizontal:absolute;mso-position-horizontal-relative:margin;mso-position-vertical:absolute;mso-position-vertical-relative:text;mso-width-percent:0;mso-height-percent:0;mso-width-relative:margin;mso-height-relative:margin;v-text-anchor:top" o:gfxdata="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" filled="f" stroked="f">
+              <v:textbox>
+                <w:txbxContent>
+                  <w:p>
+                    <w:pPr>
+                      <w:jc w:val="center"/>
+                      <w:rPr>
+                        <w:rFonts w:ascii="Helvetica Neue W23 for SKY Reg" w:hAnsi="Helvetica Neue W23 for SKY Reg"/>
+                        <w:color w:val="FFFFFF" w:themeColor="background1"/>
+                        <w:rtl/>
+                      </w:rPr>
+                    </w:pPr>
+                    <w:r>
+                      <w:rPr>
+                        <w:rFonts w:ascii="Helvetica Neue W23 for SKY Reg" w:hAnsi="Helvetica Neue W23 for SKY Reg" w:hint="cs"/>
+                        <w:color w:val="FFFFFF" w:themeColor="background1"/>
+                        <w:rtl/>
+                      </w:rPr>
+                      <w:t>خطة أعمال الموجه الطلابي للاختبارا</w:t>
+                    </w:r>
+                    <w:r>
+                      <w:rPr>
+                        <w:rFonts w:ascii="Helvetica Neue W23 for SKY Reg" w:hAnsi="Helvetica Neue W23 for SKY Reg" w:hint="eastAsia"/>
+                        <w:color w:val="FFFFFF" w:themeColor="background1"/>
+                        <w:rtl/>
+                      </w:rPr>
+                      <w:t>ت</w:t>
+                    </w:r>
+                    <w:r>
+                      <w:rPr>
+                        <w:rFonts w:ascii="Helvetica Neue W23 for SKY Reg" w:hAnsi="Helvetica Neue W23 for SKY Reg" w:hint="cs"/>
+                        <w:color w:val="FFFFFF" w:themeColor="background1"/>
+                        <w:rtl/>
+                      </w:rPr>
+                      <w:t xml:space="preserve"> النهائية</w:t>
+                    </w:r>
+                    <w:r>
+                      <w:rPr>
+                        <w:rFonts w:ascii="Helvetica Neue W23 for SKY Reg" w:hAnsi="Helvetica Neue W23 for SKY Reg" w:hint="cs"/>
+                        <w:color w:val="FFFFFF" w:themeColor="background1"/>
+                        <w:rtl/>
+                      </w:rPr>
+                      <w:t xml:space="preserve"> للفصل الدراسي الثاني</w:t>
+                    </w:r>
+                    <w:r>
+                      <w:rPr>
+                        <w:rFonts w:ascii="Helvetica Neue W23 for SKY Reg" w:hAnsi="Helvetica Neue W23 for SKY Reg"/>
+                        <w:color w:val="FFFFFF" w:themeColor="background1"/>
+                        <w:rtl/>
+                      </w:rPr>
+                      <w:t xml:space="preserve"> 1446هـ</w:t>
+                    </w:r>
+                  </w:p>
+                </w:txbxContent>
+              </v:textbox>
+              <w10:wrap type="square" anchorx="margin"/>
+            </v:shape>
+          </w:pict>
+        </mc:Fallback>
+      </mc:AlternateContent>
+    </w:r>
+    <w:r>
+      <w:rPr>
+        <w:noProof/>
+      </w:rPr>
+      <w:drawing>
+        <wp:anchor distT="0" distB="0" distL="114300" distR="114300" simplePos="0" relativeHeight="251661312" behindDoc="0" locked="0" layoutInCell="1" allowOverlap="1" wp14:anchorId="77051B4E" wp14:editId="47E20886">
+          <wp:simplePos x="0" y="0"/>
+          <wp:positionH relativeFrom="column">
+            <wp:posOffset>-659765</wp:posOffset>
+          </wp:positionH>
+          <wp:positionV relativeFrom="paragraph">
+            <wp:posOffset>387985</wp:posOffset>
+          </wp:positionV>
+          <wp:extent cx="7755890" cy="552450"/>
+          <wp:effectExtent l="0" t="0" r="0" b="0"/>
+          <wp:wrapNone/>
+          <wp:docPr id="936446529" name="صورة 2"/>
+          <wp:cNvGraphicFramePr>
+            <a:graphicFrameLocks xmlns:a="http://schemas.openxmlformats.org/drawingml/2006/main" noChangeAspect="1"/>
+          </wp:cNvGraphicFramePr>
+          <a:graphic xmlns:a="http://schemas.openxmlformats.org/drawingml/2006/main">
+            <a:graphicData uri="http://schemas.openxmlformats.org/drawingml/2006/picture">
+              <pic:pic xmlns:pic="http://schemas.openxmlformats.org/drawingml/2006/picture">
+                <pic:nvPicPr>
+                  <pic:cNvPr id="847072154" name="صورة 847072154"/>
+                  <pic:cNvPicPr/>
+                </pic:nvPicPr>
+                <pic:blipFill>
+                  <a:blip r:embed="rId1">
+                    <a:extLst>
+                      <a:ext uri="{28A0092B-C50C-407E-A947-70E740481C1C}">
+                        <a14:useLocalDpi xmlns:a14="http://schemas.microsoft.com/office/drawing/2010/main" val="0"/>
+                      </a:ext>
+                    </a:extLst>
+                  </a:blip>
+                  <a:stretch>
+                    <a:fillRect/>
+                  </a:stretch>
+                </pic:blipFill>
+                <pic:spPr>
+                  <a:xfrm>
+                    <a:off x="0" y="0"/>
+                    <a:ext cx="7755890" cy="552450"/>
+                  </a:xfrm>
+                  <a:prstGeom prst="rect">
+                    <a:avLst/>
+                  </a:prstGeom>
+                </pic:spPr>
+              </pic:pic>
+            </a:graphicData>
+          </a:graphic>
+          <wp14:sizeRelH relativeFrom="page">
+            <wp14:pctWidth>0</wp14:pctWidth>
+          </wp14:sizeRelH>
+          <wp14:sizeRelV relativeFrom="page">
+            <wp14:pctHeight>0</wp14:pctHeight>
+          </wp14:sizeRelV>
+        </wp:anchor>
+      </w:drawing>
+    </w:r>
+    <w:r>
+      <w:rPr>
+        <w:noProof/>
+      </w:rPr>
+      <mc:AlternateContent>
+        <mc:Choice Requires="wps">
+          <w:drawing>
+            <wp:anchor distT="0" distB="0" distL="114300" distR="114300" simplePos="0" relativeHeight="251651072" behindDoc="0" locked="0" layoutInCell="1" allowOverlap="1" wp14:anchorId="38704C47" wp14:editId="7ED41397">
+              <wp:simplePos x="0" y="0"/>
+              <wp:positionH relativeFrom="column">
+                <wp:posOffset>-708025</wp:posOffset>
+              </wp:positionH>
+              <wp:positionV relativeFrom="paragraph">
+                <wp:posOffset>229235</wp:posOffset>
+              </wp:positionV>
+              <wp:extent cx="6819900" cy="577850"/>
+              <wp:effectExtent l="0" t="0" r="19050" b="12700"/>
+              <wp:wrapNone/>
+              <wp:docPr id="2138136231" name="مستطيل: زوايا مستديرة 10"/>
+              <wp:cNvGraphicFramePr/>
+              <a:graphic xmlns:a="http://schemas.openxmlformats.org/drawingml/2006/main">
+                <a:graphicData uri="http://schemas.microsoft.com/office/word/2010/wordprocessingShape">
+                  <wps:wsp>
+                    <wps:cNvSpPr/>
+                    <wps:spPr>
+                      <a:xfrm>
+                        <a:off x="0" y="0"/>
+                        <a:ext cx="6819900" cy="577850"/>
+                      </a:xfrm>
+                      <a:prstGeom prst="roundRect">
+                        <a:avLst>
+                          <a:gd name="adj" fmla="val 50000"/>
+                        </a:avLst>
+                      </a:prstGeom>
+                      <a:solidFill>
+                        <a:schemeClr val="bg1"/>
+                      </a:solidFill>
+                      <a:ln>
+                        <a:solidFill>
+                          <a:srgbClr val="3D7EB9"/>
+                        </a:solidFill>
+                      </a:ln>
+                    </wps:spPr>
+                    <wps:style>
+                      <a:lnRef idx="2">
+                        <a:schemeClr val="accent1">
+                          <a:shade val="15000"/>
+                        </a:schemeClr>
+                      </a:lnRef>
+                      <a:fillRef idx="1">
+                        <a:schemeClr val="accent1"/>
+                      </a:fillRef>
+                      <a:effectRef idx="0">
+                        <a:schemeClr val="accent1"/>
+                      </a:effectRef>
+                      <a:fontRef idx="minor">
+                        <a:schemeClr val="lt1"/>
+                      </a:fontRef>
+                    </wps:style>
+                    <wps:bodyPr rot="0" spcFirstLastPara="0" vertOverflow="overflow" horzOverflow="overflow" vert="horz" wrap="square" lIns="91440" tIns="45720" rIns="91440" bIns="45720" numCol="1" spcCol="0" rtlCol="1" fromWordArt="0" anchor="ctr" anchorCtr="0" forceAA="0" compatLnSpc="1">
+                      <a:prstTxWarp prst="textNoShape">
+                        <a:avLst/>
+                      </a:prstTxWarp>
+                      <a:noAutofit/>
+                    </wps:bodyPr>
+                  </wps:wsp>
+                </a:graphicData>
+              </a:graphic>
+              <wp14:sizeRelV relativeFrom="margin">
+                <wp14:pctHeight>0</wp14:pctHeight>
+              </wp14:sizeRelV>
+            </wp:anchor>
+          </w:drawing>
+        </mc:Choice>
+        <mc:Fallback>
+          <w:pict>
+            <v:roundrect w14:anchorId="7F4889DB" id="مستطيل: زوايا مستديرة 10" o:spid="_x0000_s1026" style="position:absolute;left:0;text-align:left;margin-left:-55.75pt;margin-top:18.05pt;width:537pt;height:45.5pt;z-index:251686911;visibility:visible;mso-wrap-style:square;mso-height-percent:0;mso-wrap-distance-left:9pt;mso-wrap-distance-top:0;mso-wrap-distance-right:9pt;mso-wrap-distance-bottom:0;mso-position-horizontal:absolute;mso-position-horizontal-relative:text;mso-position-vertical:absolute;mso-position-vertical-relative:text;mso-height-percent:0;mso-height-relative:margin;v-text-anchor:middle" arcsize=".5" o:gfxdata="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" fillcolor="white [3212]" strokecolor="#3d7eb9" strokeweight="1pt">
+              <v:stroke joinstyle="miter"/>
+            </v:roundrect>
+          </w:pict>
+        </mc:Fallback>
+      </mc:AlternateContent>
+    </w:r>
+  </w:p>
+</w:ftr>
+</file>
+
+<file path=word/footer3.xml><?xml version="1.0" encoding="utf-8"?>
+<w:ftr xmlns:wpc="http://schemas.microsoft.com/office/word/2010/wordprocessingCanvas" xmlns:cx="http://schemas.microsoft.com/office/drawing/2014/chartex" xmlns:cx1="http://schemas.microsoft.com/office/drawing/2015/9/8/chartex" xmlns:cx2="http://schemas.microsoft.com/office/drawing/2015/10/21/chartex" xmlns:cx3="http://schemas.microsoft.com/office/drawing/2016/5/9/chartex" xmlns:cx4="http://schemas.microsoft.com/office/drawing/2016/5/10/chartex" xmlns:cx5="http://schemas.microsoft.com/office/drawing/2016/5/11/chartex" xmlns:cx6="http://schemas.microsoft.com/office/drawing/2016/5/12/chartex" xmlns:cx7="http://schemas.microsoft.com/office/drawing/2016/5/13/chartex" xmlns:cx8="http://schemas.microsoft.com/office/drawing/2016/5/14/chartex" xmlns:mc="http://schemas.openxmlformats.org/markup-compatibility/2006" xmlns:aink="http://schemas.microsoft.com/office/drawing/2016/ink" xmlns:am3d="http://schemas.microsoft.com/office/drawing/2017/model3d" xmlns:o="urn:schemas-microsoft-com:office:office" xmlns:oel="http://schemas.microsoft.com/office/2019/extlst" xmlns:r="http://schemas.openxmlformats.org/officeDocument/2006/relationships" xmlns:m="http://schemas.openxmlformats.org/officeDocument/2006/math" xmlns:v="urn:schemas-microsoft-com:vml" xmlns:wp14="http://schemas.microsoft.com/office/word/2010/wordprocessingDrawing" xmlns:wp="http://schemas.openxmlformats.org/drawingml/2006/wordprocessingDrawing" xmlns:w10="urn:schemas-microsoft-com:office:word" xmlns:w="http://schemas.openxmlformats.org/wordprocessingml/2006/main" xmlns:w14="http://schemas.microsoft.com/office/word/2010/wordml" xmlns:w15="http://schemas.microsoft.com/office/word/2012/wordml" xmlns:w16cei="http://schemas.microsoft.com/office/word/2026/wordml/cei" xmlns:w16cex="http://schemas.microsoft.com/office/word/2018/wordml/cex" xmlns:w16cid="http://schemas.microsoft.com/office/word/2016/wordml/cid" xmlns:w16="http://schemas.microsoft.com/office/word/2018/wordml" xmlns:w16du="http://schemas.microsoft.com/office/word/2023/wordml/word16du" xmlns:w16sdtdh="http://schemas.microsoft.com/office/word/2020/wordml/sdtdatahash" xmlns:w16sdtfl="http://schemas.microsoft.com/office/word/2024/wordml/sdtformatlock" xmlns:w16se="http://schemas.microsoft.com/office/word/2015/wordml/symex" xmlns:wpg="http://schemas.microsoft.com/office/word/2010/wordprocessingGroup" xmlns:wpi="http://schemas.microsoft.com/office/word/2010/wordprocessingInk" xmlns:wne="http://schemas.microsoft.com/office/word/2006/wordml" xmlns:wps="http://schemas.microsoft.com/office/word/2010/wordprocessingShape" mc:Ignorable="w14 w15 w16se w16cid w16 w16cex w16sdtdh w16sdtfl w16du wp14">
+  <w:p>
+    <w:pPr>
+      <w:pStyle w:val="a4"/>
+    </w:pPr>
+  </w:p>
+</w:ftr>
+</file>
+
+<file path=word/footer4.xml><?xml version="1.0" encoding="utf-8"?>
+<w:ftr xmlns:wpc="http://schemas.microsoft.com/office/word/2010/wordprocessingCanvas" xmlns:cx="http://schemas.microsoft.com/office/drawing/2014/chartex" xmlns:cx1="http://schemas.microsoft.com/office/drawing/2015/9/8/chartex" xmlns:cx2="http://schemas.microsoft.com/office/drawing/2015/10/21/chartex" xmlns:cx3="http://schemas.microsoft.com/office/drawing/2016/5/9/chartex" xmlns:cx4="http://schemas.microsoft.com/office/drawing/2016/5/10/chartex" xmlns:cx5="http://schemas.microsoft.com/office/drawing/2016/5/11/chartex" xmlns:cx6="http://schemas.microsoft.com/office/drawing/2016/5/12/chartex" xmlns:cx7="http://schemas.microsoft.com/office/drawing/2016/5/13/chartex" xmlns:cx8="http://schemas.microsoft.com/office/drawing/2016/5/14/chartex" xmlns:mc="http://schemas.openxmlformats.org/markup-compatibility/2006" xmlns:aink="http://schemas.microsoft.com/office/drawing/2016/ink" xmlns:am3d="http://schemas.microsoft.com/office/drawing/2017/model3d" xmlns:o="urn:schemas-microsoft-com:office:office" xmlns:oel="http://schemas.microsoft.com/office/2019/extlst" xmlns:r="http://schemas.openxmlformats.org/officeDocument/2006/relationships" xmlns:m="http://schemas.openxmlformats.org/officeDocument/2006/math" xmlns:v="urn:schemas-microsoft-com:vml" xmlns:wp14="http://schemas.microsoft.com/office/word/2010/wordprocessingDrawing" xmlns:wp="http://schemas.openxmlformats.org/drawingml/2006/wordprocessingDrawing" xmlns:w10="urn:schemas-microsoft-com:office:word" xmlns:w="http://schemas.openxmlformats.org/wordprocessingml/2006/main" xmlns:w14="http://schemas.microsoft.com/office/word/2010/wordml" xmlns:w15="http://schemas.microsoft.com/office/word/2012/wordml" xmlns:w16cei="http://schemas.microsoft.com/office/word/2026/wordml/cei" xmlns:w16cex="http://schemas.microsoft.com/office/word/2018/wordml/cex" xmlns:w16cid="http://schemas.microsoft.com/office/word/2016/wordml/cid" xmlns:w16="http://schemas.microsoft.com/office/word/2018/wordml" xmlns:w16du="http://schemas.microsoft.com/office/word/2023/wordml/word16du" xmlns:w16sdtdh="http://schemas.microsoft.com/office/word/2020/wordml/sdtdatahash" xmlns:w16sdtfl="http://schemas.microsoft.com/office/word/2024/wordml/sdtformatlock" xmlns:w16se="http://schemas.microsoft.com/office/word/2015/wordml/symex" xmlns:wpg="http://schemas.microsoft.com/office/word/2010/wordprocessingGroup" xmlns:wpi="http://schemas.microsoft.com/office/word/2010/wordprocessingInk" xmlns:wne="http://schemas.microsoft.com/office/word/2006/wordml" xmlns:wps="http://schemas.microsoft.com/office/word/2010/wordprocessingShape" mc:Ignorable="w14 w15 w16se w16cid w16 w16cex w16sdtdh w16sdtfl w16du wp14">
   <w:p>
     <w:pPr>
       <w:pStyle w:val="ab"/>
@@ -2218,7 +4033,7 @@
       <mc:AlternateContent>
         <mc:Choice Requires="wps">
           <w:drawing>
-            <wp:anchor distT="0" distB="0" distL="114300" distR="114300" simplePos="0" relativeHeight="251657216" behindDoc="0" locked="0" layoutInCell="1" allowOverlap="1" wp14:anchorId="013D7D1B" wp14:editId="0C69BA25">
+            <wp:anchor distT="0" distB="0" distL="114300" distR="114300" simplePos="0" relativeHeight="251658240" behindDoc="0" locked="0" layoutInCell="1" allowOverlap="1" wp14:anchorId="013D7D1B" wp14:editId="0C69BA25">
               <wp:simplePos x="0" y="0"/>
               <wp:positionH relativeFrom="column">
                 <wp:posOffset>-1029335</wp:posOffset>
@@ -2299,7 +4114,7 @@
         <w:noProof/>
       </w:rPr>
       <w:drawing>
-        <wp:anchor distT="0" distB="0" distL="114300" distR="114300" simplePos="0" relativeHeight="251658240" behindDoc="0" locked="0" layoutInCell="1" allowOverlap="1" wp14:anchorId="7EAFD756" wp14:editId="1BD6B742">
+        <wp:anchor distT="0" distB="0" distL="114300" distR="114300" simplePos="0" relativeHeight="251659264" behindDoc="0" locked="0" layoutInCell="1" allowOverlap="1" wp14:anchorId="7EAFD756" wp14:editId="1BD6B742">
           <wp:simplePos x="0" y="0"/>
           <wp:positionH relativeFrom="margin">
             <wp:align>center</wp:align>
@@ -2367,7 +4182,7 @@
       <mc:AlternateContent>
         <mc:Choice Requires="wps">
           <w:drawing>
-            <wp:anchor distT="45720" distB="45720" distL="114300" distR="114300" simplePos="0" relativeHeight="251659264" behindDoc="0" locked="0" layoutInCell="1" allowOverlap="1" wp14:anchorId="0E7082BF" wp14:editId="6E5FDA50">
+            <wp:anchor distT="45720" distB="45720" distL="114300" distR="114300" simplePos="0" relativeHeight="251660288" behindDoc="0" locked="0" layoutInCell="1" allowOverlap="1" wp14:anchorId="0E7082BF" wp14:editId="6E5FDA50">
               <wp:simplePos x="0" y="0"/>
               <wp:positionH relativeFrom="margin">
                 <wp:align>center</wp:align>
@@ -2491,7 +4306,7 @@
               <v:stroke joinstyle="miter"/>
               <v:path gradientshapeok="t" o:connecttype="rect"/>
             </v:shapetype>
-            <v:shape id="_x0000_s1030" type="#_x0000_t202" style="position:absolute;left:0;text-align:left;margin-left:0;margin-top:11.3pt;width:349pt;height:37.5pt;flip:x;z-index:251659264;visibility:visible;mso-wrap-style:square;mso-width-percent:0;mso-height-percent:0;mso-wrap-distance-left:9pt;mso-wrap-distance-top:3.6pt;mso-wrap-distance-right:9pt;mso-wrap-distance-bottom:3.6pt;mso-position-horizontal:center;mso-position-horizontal-relative:margin;mso-position-vertical:absolute;mso-position-vertical-relative:text;mso-width-percent:0;mso-height-percent:0;mso-width-relative:margin;mso-height-relative:margin;v-text-anchor:top" o:gfxdata="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" filled="f" stroked="f">
+            <v:shape id="_x0000_s1038" type="#_x0000_t202" style="position:absolute;left:0;text-align:left;margin-left:0;margin-top:11.3pt;width:349pt;height:37.5pt;flip:x;z-index:251660288;visibility:visible;mso-wrap-style:square;mso-width-percent:0;mso-height-percent:0;mso-wrap-distance-left:9pt;mso-wrap-distance-top:3.6pt;mso-wrap-distance-right:9pt;mso-wrap-distance-bottom:3.6pt;mso-position-horizontal:center;mso-position-horizontal-relative:margin;mso-position-vertical:absolute;mso-position-vertical-relative:text;mso-width-percent:0;mso-height-percent:0;mso-width-relative:margin;mso-height-relative:margin;v-text-anchor:top" o:gfxdata="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" filled="f" stroked="f">
               <v:textbox>
                 <w:txbxContent>
                   <w:p>
@@ -2569,7 +4384,7 @@
 </file>
 
 <file path=word/footnotes.xml><?xml version="1.0" encoding="utf-8"?>
-<w:footnotes xmlns:wpc="http://schemas.microsoft.com/office/word/2010/wordprocessingCanvas" xmlns:cx="http://schemas.microsoft.com/office/drawing/2014/chartex" xmlns:cx1="http://schemas.microsoft.com/office/drawing/2015/9/8/chartex" xmlns:cx2="http://schemas.microsoft.com/office/drawing/2015/10/21/chartex" xmlns:cx3="http://schemas.microsoft.com/office/drawing/2016/5/9/chartex" xmlns:cx4="http://schemas.microsoft.com/office/drawing/2016/5/10/chartex" xmlns:cx5="http://schemas.microsoft.com/office/drawing/2016/5/11/chartex" xmlns:cx6="http://schemas.microsoft.com/office/drawing/2016/5/12/chartex" xmlns:cx7="http://schemas.microsoft.com/office/drawing/2016/5/13/chartex" xmlns:cx8="http://schemas.microsoft.com/office/drawing/2016/5/14/chartex" xmlns:mc="http://schemas.openxmlformats.org/markup-compatibility/2006" xmlns:aink="http://schemas.microsoft.com/office/drawing/2016/ink" xmlns:am3d="http://schemas.microsoft.com/office/drawing/2017/model3d" xmlns:o="urn:schemas-microsoft-com:office:office" xmlns:oel="http://schemas.microsoft.com/office/2019/extlst" xmlns:r="http://schemas.openxmlformats.org/officeDocument/2006/relationships" xmlns:m="http://schemas.openxmlformats.org/officeDocument/2006/math" xmlns:v="urn:schemas-microsoft-com:vml" xmlns:wp14="http://schemas.microsoft.com/office/word/2010/wordprocessingDrawing" xmlns:wp="http://schemas.openxmlformats.org/drawingml/2006/wordprocessingDrawing" xmlns:w10="urn:schemas-microsoft-com:office:word" xmlns:w="http://schemas.openxmlformats.org/wordprocessingml/2006/main" xmlns:w14="http://schemas.microsoft.com/office/word/2010/wordml" xmlns:w15="http://schemas.microsoft.com/office/word/2012/wordml" xmlns:w16cex="http://schemas.microsoft.com/office/word/2018/wordml/cex" xmlns:w16cid="http://schemas.microsoft.com/office/word/2016/wordml/cid" xmlns:w16="http://schemas.microsoft.com/office/word/2018/wordml" xmlns:w16du="http://schemas.microsoft.com/office/word/2023/wordml/word16du" xmlns:w16sdtdh="http://schemas.microsoft.com/office/word/2020/wordml/sdtdatahash" xmlns:w16sdtfl="http://schemas.microsoft.com/office/word/2024/wordml/sdtformatlock" xmlns:w16se="http://schemas.microsoft.com/office/word/2015/wordml/symex" xmlns:wpg="http://schemas.microsoft.com/office/word/2010/wordprocessingGroup" xmlns:wpi="http://schemas.microsoft.com/office/word/2010/wordprocessingInk" xmlns:wne="http://schemas.microsoft.com/office/word/2006/wordml" xmlns:wps="http://schemas.microsoft.com/office/word/2010/wordprocessingShape" mc:Ignorable="w14 w15 w16se w16cid w16 w16cex w16sdtdh w16sdtfl w16du wp14">
+<w:footnotes xmlns:wpc="http://schemas.microsoft.com/office/word/2010/wordprocessingCanvas" xmlns:cx="http://schemas.microsoft.com/office/drawing/2014/chartex" xmlns:cx1="http://schemas.microsoft.com/office/drawing/2015/9/8/chartex" xmlns:cx2="http://schemas.microsoft.com/office/drawing/2015/10/21/chartex" xmlns:cx3="http://schemas.microsoft.com/office/drawing/2016/5/9/chartex" xmlns:cx4="http://schemas.microsoft.com/office/drawing/2016/5/10/chartex" xmlns:cx5="http://schemas.microsoft.com/office/drawing/2016/5/11/chartex" xmlns:cx6="http://schemas.microsoft.com/office/drawing/2016/5/12/chartex" xmlns:cx7="http://schemas.microsoft.com/office/drawing/2016/5/13/chartex" xmlns:cx8="http://schemas.microsoft.com/office/drawing/2016/5/14/chartex" xmlns:mc="http://schemas.openxmlformats.org/markup-compatibility/2006" xmlns:aink="http://schemas.microsoft.com/office/drawing/2016/ink" xmlns:am3d="http://schemas.microsoft.com/office/drawing/2017/model3d" xmlns:o="urn:schemas-microsoft-com:office:office" xmlns:oel="http://schemas.microsoft.com/office/2019/extlst" xmlns:r="http://schemas.openxmlformats.org/officeDocument/2006/relationships" xmlns:m="http://schemas.openxmlformats.org/officeDocument/2006/math" xmlns:v="urn:schemas-microsoft-com:vml" xmlns:wp14="http://schemas.microsoft.com/office/word/2010/wordprocessingDrawing" xmlns:wp="http://schemas.openxmlformats.org/drawingml/2006/wordprocessingDrawing" xmlns:w10="urn:schemas-microsoft-com:office:word" xmlns:w="http://schemas.openxmlformats.org/wordprocessingml/2006/main" xmlns:w14="http://schemas.microsoft.com/office/word/2010/wordml" xmlns:w15="http://schemas.microsoft.com/office/word/2012/wordml" xmlns:w16cei="http://schemas.microsoft.com/office/word/2026/wordml/cei" xmlns:w16cex="http://schemas.microsoft.com/office/word/2018/wordml/cex" xmlns:w16cid="http://schemas.microsoft.com/office/word/2016/wordml/cid" xmlns:w16="http://schemas.microsoft.com/office/word/2018/wordml" xmlns:w16du="http://schemas.microsoft.com/office/word/2023/wordml/word16du" xmlns:w16sdtdh="http://schemas.microsoft.com/office/word/2020/wordml/sdtdatahash" xmlns:w16sdtfl="http://schemas.microsoft.com/office/word/2024/wordml/sdtformatlock" xmlns:w16se="http://schemas.microsoft.com/office/word/2015/wordml/symex" xmlns:wpg="http://schemas.microsoft.com/office/word/2010/wordprocessingGroup" xmlns:wpi="http://schemas.microsoft.com/office/word/2010/wordprocessingInk" xmlns:wne="http://schemas.microsoft.com/office/word/2006/wordml" xmlns:wps="http://schemas.microsoft.com/office/word/2010/wordprocessingShape" mc:Ignorable="w14 w15 w16se w16cid w16 w16cex w16sdtdh w16sdtfl w16du wp14">
   <w:footnote w:type="separator" w:id="-1">
     <w:p>
       <w:pPr>
@@ -2594,7 +4409,787 @@
 </file>
 
 <file path=word/header1.xml><?xml version="1.0" encoding="utf-8"?>
-<w:hdr xmlns:wpc="http://schemas.microsoft.com/office/word/2010/wordprocessingCanvas" xmlns:cx="http://schemas.microsoft.com/office/drawing/2014/chartex" xmlns:cx1="http://schemas.microsoft.com/office/drawing/2015/9/8/chartex" xmlns:cx2="http://schemas.microsoft.com/office/drawing/2015/10/21/chartex" xmlns:cx3="http://schemas.microsoft.com/office/drawing/2016/5/9/chartex" xmlns:cx4="http://schemas.microsoft.com/office/drawing/2016/5/10/chartex" xmlns:cx5="http://schemas.microsoft.com/office/drawing/2016/5/11/chartex" xmlns:cx6="http://schemas.microsoft.com/office/drawing/2016/5/12/chartex" xmlns:cx7="http://schemas.microsoft.com/office/drawing/2016/5/13/chartex" xmlns:cx8="http://schemas.microsoft.com/office/drawing/2016/5/14/chartex" xmlns:mc="http://schemas.openxmlformats.org/markup-compatibility/2006" xmlns:aink="http://schemas.microsoft.com/office/drawing/2016/ink" xmlns:am3d="http://schemas.microsoft.com/office/drawing/2017/model3d" xmlns:o="urn:schemas-microsoft-com:office:office" xmlns:oel="http://schemas.microsoft.com/office/2019/extlst" xmlns:r="http://schemas.openxmlformats.org/officeDocument/2006/relationships" xmlns:m="http://schemas.openxmlformats.org/officeDocument/2006/math" xmlns:v="urn:schemas-microsoft-com:vml" xmlns:wp14="http://schemas.microsoft.com/office/word/2010/wordprocessingDrawing" xmlns:wp="http://schemas.openxmlformats.org/drawingml/2006/wordprocessingDrawing" xmlns:w10="urn:schemas-microsoft-com:office:word" xmlns:w="http://schemas.openxmlformats.org/wordprocessingml/2006/main" xmlns:w14="http://schemas.microsoft.com/office/word/2010/wordml" xmlns:w15="http://schemas.microsoft.com/office/word/2012/wordml" xmlns:w16cex="http://schemas.microsoft.com/office/word/2018/wordml/cex" xmlns:w16cid="http://schemas.microsoft.com/office/word/2016/wordml/cid" xmlns:w16="http://schemas.microsoft.com/office/word/2018/wordml" xmlns:w16du="http://schemas.microsoft.com/office/word/2023/wordml/word16du" xmlns:w16sdtdh="http://schemas.microsoft.com/office/word/2020/wordml/sdtdatahash" xmlns:w16sdtfl="http://schemas.microsoft.com/office/word/2024/wordml/sdtformatlock" xmlns:w16se="http://schemas.microsoft.com/office/word/2015/wordml/symex" xmlns:wpg="http://schemas.microsoft.com/office/word/2010/wordprocessingGroup" xmlns:wpi="http://schemas.microsoft.com/office/word/2010/wordprocessingInk" xmlns:wne="http://schemas.microsoft.com/office/word/2006/wordml" xmlns:wps="http://schemas.microsoft.com/office/word/2010/wordprocessingShape" mc:Ignorable="w14 w15 w16se w16cid w16 w16cex w16sdtdh w16sdtfl w16du wp14">
+<w:hdr xmlns:wpc="http://schemas.microsoft.com/office/word/2010/wordprocessingCanvas" xmlns:cx="http://schemas.microsoft.com/office/drawing/2014/chartex" xmlns:cx1="http://schemas.microsoft.com/office/drawing/2015/9/8/chartex" xmlns:cx2="http://schemas.microsoft.com/office/drawing/2015/10/21/chartex" xmlns:cx3="http://schemas.microsoft.com/office/drawing/2016/5/9/chartex" xmlns:cx4="http://schemas.microsoft.com/office/drawing/2016/5/10/chartex" xmlns:cx5="http://schemas.microsoft.com/office/drawing/2016/5/11/chartex" xmlns:cx6="http://schemas.microsoft.com/office/drawing/2016/5/12/chartex" xmlns:cx7="http://schemas.microsoft.com/office/drawing/2016/5/13/chartex" xmlns:cx8="http://schemas.microsoft.com/office/drawing/2016/5/14/chartex" xmlns:mc="http://schemas.openxmlformats.org/markup-compatibility/2006" xmlns:aink="http://schemas.microsoft.com/office/drawing/2016/ink" xmlns:am3d="http://schemas.microsoft.com/office/drawing/2017/model3d" xmlns:o="urn:schemas-microsoft-com:office:office" xmlns:oel="http://schemas.microsoft.com/office/2019/extlst" xmlns:r="http://schemas.openxmlformats.org/officeDocument/2006/relationships" xmlns:m="http://schemas.openxmlformats.org/officeDocument/2006/math" xmlns:v="urn:schemas-microsoft-com:vml" xmlns:wp14="http://schemas.microsoft.com/office/word/2010/wordprocessingDrawing" xmlns:wp="http://schemas.openxmlformats.org/drawingml/2006/wordprocessingDrawing" xmlns:w10="urn:schemas-microsoft-com:office:word" xmlns:w="http://schemas.openxmlformats.org/wordprocessingml/2006/main" xmlns:w14="http://schemas.microsoft.com/office/word/2010/wordml" xmlns:w15="http://schemas.microsoft.com/office/word/2012/wordml" xmlns:w16cei="http://schemas.microsoft.com/office/word/2026/wordml/cei" xmlns:w16cex="http://schemas.microsoft.com/office/word/2018/wordml/cex" xmlns:w16cid="http://schemas.microsoft.com/office/word/2016/wordml/cid" xmlns:w16="http://schemas.microsoft.com/office/word/2018/wordml" xmlns:w16du="http://schemas.microsoft.com/office/word/2023/wordml/word16du" xmlns:w16sdtdh="http://schemas.microsoft.com/office/word/2020/wordml/sdtdatahash" xmlns:w16sdtfl="http://schemas.microsoft.com/office/word/2024/wordml/sdtformatlock" xmlns:w16se="http://schemas.microsoft.com/office/word/2015/wordml/symex" xmlns:wpg="http://schemas.microsoft.com/office/word/2010/wordprocessingGroup" xmlns:wpi="http://schemas.microsoft.com/office/word/2010/wordprocessingInk" xmlns:wne="http://schemas.microsoft.com/office/word/2006/wordml" xmlns:wps="http://schemas.microsoft.com/office/word/2010/wordprocessingShape" mc:Ignorable="w14 w15 w16se w16cid w16 w16cex w16sdtdh w16sdtfl w16du wp14">
+  <w:p>
+    <w:pPr>
+      <w:pStyle w:val="a3"/>
+    </w:pPr>
+  </w:p>
+</w:hdr>
+</file>
+
+<file path=word/header2.xml><?xml version="1.0" encoding="utf-8"?>
+<w:hdr xmlns:wpc="http://schemas.microsoft.com/office/word/2010/wordprocessingCanvas" xmlns:cx="http://schemas.microsoft.com/office/drawing/2014/chartex" xmlns:cx1="http://schemas.microsoft.com/office/drawing/2015/9/8/chartex" xmlns:cx2="http://schemas.microsoft.com/office/drawing/2015/10/21/chartex" xmlns:cx3="http://schemas.microsoft.com/office/drawing/2016/5/9/chartex" xmlns:cx4="http://schemas.microsoft.com/office/drawing/2016/5/10/chartex" xmlns:cx5="http://schemas.microsoft.com/office/drawing/2016/5/11/chartex" xmlns:cx6="http://schemas.microsoft.com/office/drawing/2016/5/12/chartex" xmlns:cx7="http://schemas.microsoft.com/office/drawing/2016/5/13/chartex" xmlns:cx8="http://schemas.microsoft.com/office/drawing/2016/5/14/chartex" xmlns:mc="http://schemas.openxmlformats.org/markup-compatibility/2006" xmlns:aink="http://schemas.microsoft.com/office/drawing/2016/ink" xmlns:am3d="http://schemas.microsoft.com/office/drawing/2017/model3d" xmlns:o="urn:schemas-microsoft-com:office:office" xmlns:oel="http://schemas.microsoft.com/office/2019/extlst" xmlns:r="http://schemas.openxmlformats.org/officeDocument/2006/relationships" xmlns:m="http://schemas.openxmlformats.org/officeDocument/2006/math" xmlns:v="urn:schemas-microsoft-com:vml" xmlns:wp14="http://schemas.microsoft.com/office/word/2010/wordprocessingDrawing" xmlns:wp="http://schemas.openxmlformats.org/drawingml/2006/wordprocessingDrawing" xmlns:w10="urn:schemas-microsoft-com:office:word" xmlns:w="http://schemas.openxmlformats.org/wordprocessingml/2006/main" xmlns:w14="http://schemas.microsoft.com/office/word/2010/wordml" xmlns:w15="http://schemas.microsoft.com/office/word/2012/wordml" xmlns:w16cei="http://schemas.microsoft.com/office/word/2026/wordml/cei" xmlns:w16cex="http://schemas.microsoft.com/office/word/2018/wordml/cex" xmlns:w16cid="http://schemas.microsoft.com/office/word/2016/wordml/cid" xmlns:w16="http://schemas.microsoft.com/office/word/2018/wordml" xmlns:w16du="http://schemas.microsoft.com/office/word/2023/wordml/word16du" xmlns:w16sdtdh="http://schemas.microsoft.com/office/word/2020/wordml/sdtdatahash" xmlns:w16sdtfl="http://schemas.microsoft.com/office/word/2024/wordml/sdtformatlock" xmlns:w16se="http://schemas.microsoft.com/office/word/2015/wordml/symex" xmlns:wpg="http://schemas.microsoft.com/office/word/2010/wordprocessingGroup" xmlns:wpi="http://schemas.microsoft.com/office/word/2010/wordprocessingInk" xmlns:wne="http://schemas.microsoft.com/office/word/2006/wordml" xmlns:wps="http://schemas.microsoft.com/office/word/2010/wordprocessingShape" mc:Ignorable="w14 w15 w16se w16cid w16 w16cex w16sdtdh w16sdtfl w16du wp14">
+  <w:p>
+    <w:pPr>
+      <w:pStyle w:val="a3"/>
+    </w:pPr>
+    <w:r>
+      <w:rPr>
+        <w:noProof/>
+      </w:rPr>
+      <w:drawing>
+        <wp:anchor distT="0" distB="0" distL="114300" distR="114300" simplePos="0" relativeHeight="251653120" behindDoc="0" locked="0" layoutInCell="1" allowOverlap="1" wp14:anchorId="621FC535" wp14:editId="3BDBF3C1">
+          <wp:simplePos x="0" y="0"/>
+          <wp:positionH relativeFrom="column">
+            <wp:posOffset>-466522</wp:posOffset>
+          </wp:positionH>
+          <wp:positionV relativeFrom="paragraph">
+            <wp:posOffset>-904875</wp:posOffset>
+          </wp:positionV>
+          <wp:extent cx="7591425" cy="1870710"/>
+          <wp:effectExtent l="0" t="0" r="9525" b="0"/>
+          <wp:wrapNone/>
+          <wp:docPr id="739964429" name="صورة 1"/>
+          <wp:cNvGraphicFramePr>
+            <a:graphicFrameLocks xmlns:a="http://schemas.openxmlformats.org/drawingml/2006/main" noChangeAspect="1"/>
+          </wp:cNvGraphicFramePr>
+          <a:graphic xmlns:a="http://schemas.openxmlformats.org/drawingml/2006/main">
+            <a:graphicData uri="http://schemas.openxmlformats.org/drawingml/2006/picture">
+              <pic:pic xmlns:pic="http://schemas.openxmlformats.org/drawingml/2006/picture">
+                <pic:nvPicPr>
+                  <pic:cNvPr id="1419424049" name="صورة 1419424049"/>
+                  <pic:cNvPicPr/>
+                </pic:nvPicPr>
+                <pic:blipFill>
+                  <a:blip r:embed="rId1">
+                    <a:extLst>
+                      <a:ext uri="{28A0092B-C50C-407E-A947-70E740481C1C}">
+                        <a14:useLocalDpi xmlns:a14="http://schemas.microsoft.com/office/drawing/2010/main" val="0"/>
+                      </a:ext>
+                    </a:extLst>
+                  </a:blip>
+                  <a:stretch>
+                    <a:fillRect/>
+                  </a:stretch>
+                </pic:blipFill>
+                <pic:spPr>
+                  <a:xfrm>
+                    <a:off x="0" y="0"/>
+                    <a:ext cx="7591425" cy="1870710"/>
+                  </a:xfrm>
+                  <a:prstGeom prst="rect">
+                    <a:avLst/>
+                  </a:prstGeom>
+                </pic:spPr>
+              </pic:pic>
+            </a:graphicData>
+          </a:graphic>
+          <wp14:sizeRelH relativeFrom="margin">
+            <wp14:pctWidth>0</wp14:pctWidth>
+          </wp14:sizeRelH>
+          <wp14:sizeRelV relativeFrom="margin">
+            <wp14:pctHeight>0</wp14:pctHeight>
+          </wp14:sizeRelV>
+        </wp:anchor>
+      </w:drawing>
+    </w:r>
+    <w:r>
+      <w:rPr>
+        <w:noProof/>
+        <w:rtl/>
+      </w:rPr>
+      <mc:AlternateContent>
+        <mc:Choice Requires="wps">
+          <w:drawing>
+            <wp:anchor distT="45720" distB="45720" distL="114300" distR="114300" simplePos="0" relativeHeight="251663360" behindDoc="0" locked="0" layoutInCell="1" allowOverlap="1" wp14:anchorId="185366E4" wp14:editId="1DC87310">
+              <wp:simplePos x="0" y="0"/>
+              <wp:positionH relativeFrom="column">
+                <wp:posOffset>1194239</wp:posOffset>
+              </wp:positionH>
+              <wp:positionV relativeFrom="paragraph">
+                <wp:posOffset>-412066</wp:posOffset>
+              </wp:positionV>
+              <wp:extent cx="2494280" cy="773430"/>
+              <wp:effectExtent l="0" t="0" r="0" b="0"/>
+              <wp:wrapSquare wrapText="bothSides"/>
+              <wp:docPr id="2138136228" name="مربع نص 1722858123"/>
+              <wp:cNvGraphicFramePr>
+                <a:graphicFrameLocks xmlns:a="http://schemas.openxmlformats.org/drawingml/2006/main"/>
+              </wp:cNvGraphicFramePr>
+              <a:graphic xmlns:a="http://schemas.openxmlformats.org/drawingml/2006/main">
+                <a:graphicData uri="http://schemas.microsoft.com/office/word/2010/wordprocessingShape">
+                  <wps:wsp>
+                    <wps:cNvSpPr txBox="1">
+                      <a:spLocks noChangeArrowheads="1"/>
+                    </wps:cNvSpPr>
+                    <wps:spPr bwMode="auto">
+                      <a:xfrm flipH="1">
+                        <a:off x="0" y="0"/>
+                        <a:ext cx="2494280" cy="773430"/>
+                      </a:xfrm>
+                      <a:prstGeom prst="rect">
+                        <a:avLst/>
+                      </a:prstGeom>
+                      <a:noFill/>
+                      <a:ln w="9525">
+                        <a:noFill/>
+                        <a:miter lim="800000"/>
+                        <a:headEnd/>
+                        <a:tailEnd/>
+                      </a:ln>
+                    </wps:spPr>
+                    <wps:txbx>
+                      <w:txbxContent>
+                        <w:p>
+                          <w:pPr>
+                            <w:spacing w:after="0" w:line="168" w:lineRule="auto"/>
+                            <w:jc w:val="both"/>
+                            <w:rPr>
+                              <w:rFonts w:ascii="Helvetica Neue W23 for SKY Reg" w:hAnsi="Helvetica Neue W23 for SKY Reg"/>
+                              <w:color w:val="FFFFFF" w:themeColor="background1"/>
+                              <w:sz w:val="32"/>
+                              <w:szCs w:val="32"/>
+                              <w:rtl/>
+                            </w:rPr>
+                          </w:pPr>
+                          <w:r>
+                            <w:rPr>
+                              <w:rFonts w:ascii="Helvetica Neue W23 for SKY Reg" w:hAnsi="Helvetica Neue W23 for SKY Reg"/>
+                              <w:color w:val="FFFFFF" w:themeColor="background1"/>
+                              <w:sz w:val="32"/>
+                              <w:szCs w:val="32"/>
+                              <w:rtl/>
+                            </w:rPr>
+                            <w:t>الإدارة العامة للتعليم</w:t>
+                          </w:r>
+                          <w:r>
+                            <w:rPr>
+                              <w:rFonts w:ascii="Helvetica Neue W23 for SKY Reg" w:hAnsi="Helvetica Neue W23 for SKY Reg" w:hint="cs"/>
+                              <w:color w:val="FFFFFF" w:themeColor="background1"/>
+                              <w:sz w:val="32"/>
+                              <w:szCs w:val="32"/>
+                              <w:rtl/>
+                            </w:rPr>
+                            <w:t xml:space="preserve"> </w:t>
+                          </w:r>
+                        </w:p>
+                        <w:p>
+                          <w:pPr>
+                            <w:spacing w:after="0" w:line="168" w:lineRule="auto"/>
+                            <w:jc w:val="both"/>
+                            <w:rPr>
+                              <w:rFonts w:ascii="Helvetica Neue W23 for SKY Reg" w:hAnsi="Helvetica Neue W23 for SKY Reg"/>
+                              <w:color w:val="04A9A6"/>
+                              <w:sz w:val="14"/>
+                              <w:szCs w:val="14"/>
+                              <w:rtl/>
+                            </w:rPr>
+                          </w:pPr>
+                        </w:p>
+                        <w:p>
+                          <w:pPr>
+                            <w:spacing w:after="0" w:line="168" w:lineRule="auto"/>
+                            <w:jc w:val="both"/>
+                            <w:rPr>
+                              <w:rFonts w:ascii="Helvetica Neue W23 for SKY Reg" w:hAnsi="Helvetica Neue W23 for SKY Reg"/>
+                              <w:color w:val="04A9A6"/>
+                              <w:sz w:val="32"/>
+                              <w:szCs w:val="32"/>
+                            </w:rPr>
+                          </w:pPr>
+                          <w:r>
+                            <w:rPr>
+                              <w:rFonts w:ascii="Helvetica Neue W23 for SKY Reg" w:hAnsi="Helvetica Neue W23 for SKY Reg"/>
+                              <w:color w:val="04A9A6"/>
+                              <w:sz w:val="32"/>
+                              <w:szCs w:val="32"/>
+                              <w:rtl/>
+                            </w:rPr>
+                            <w:t>مكتب التعليم</w:t>
+                          </w:r>
+                          <w:r>
+                            <w:rPr>
+                              <w:rFonts w:ascii="Helvetica Neue W23 for SKY Reg" w:hAnsi="Helvetica Neue W23 for SKY Reg" w:hint="cs"/>
+                              <w:color w:val="04A9A6"/>
+                              <w:sz w:val="32"/>
+                              <w:szCs w:val="32"/>
+                              <w:rtl/>
+                            </w:rPr>
+                            <w:t xml:space="preserve"> </w:t>
+                          </w:r>
+                        </w:p>
+                        <w:p>
+                          <w:pPr>
+                            <w:spacing w:after="0" w:line="168" w:lineRule="auto"/>
+                            <w:jc w:val="both"/>
+                            <w:rPr>
+                              <w:rFonts w:ascii="Helvetica Neue W23 for SKY Reg" w:hAnsi="Helvetica Neue W23 for SKY Reg"/>
+                              <w:color w:val="04A9A6"/>
+                              <w:sz w:val="32"/>
+                              <w:szCs w:val="32"/>
+                            </w:rPr>
+                          </w:pPr>
+                        </w:p>
+                      </w:txbxContent>
+                    </wps:txbx>
+                    <wps:bodyPr rot="0" vert="horz" wrap="square" lIns="91440" tIns="45720" rIns="91440" bIns="45720" anchor="t" anchorCtr="0">
+                      <a:noAutofit/>
+                    </wps:bodyPr>
+                  </wps:wsp>
+                </a:graphicData>
+              </a:graphic>
+              <wp14:sizeRelH relativeFrom="margin">
+                <wp14:pctWidth>0</wp14:pctWidth>
+              </wp14:sizeRelH>
+              <wp14:sizeRelV relativeFrom="margin">
+                <wp14:pctHeight>0</wp14:pctHeight>
+              </wp14:sizeRelV>
+            </wp:anchor>
+          </w:drawing>
+        </mc:Choice>
+        <mc:Fallback>
+          <w:pict>
+            <v:shapetype w14:anchorId="185366E4" id="_x0000_t202" coordsize="21600,21600" o:spt="202" path="m,l,21600r21600,l21600,xe">
+              <v:stroke joinstyle="miter"/>
+              <v:path gradientshapeok="t" o:connecttype="rect"/>
+            </v:shapetype>
+            <v:shape id="مربع نص 1722858123" o:spid="_x0000_s1032" type="#_x0000_t202" style="position:absolute;left:0;text-align:left;margin-left:94.05pt;margin-top:-32.45pt;width:196.4pt;height:60.9pt;flip:x;z-index:251663360;visibility:visible;mso-wrap-style:square;mso-width-percent:0;mso-height-percent:0;mso-wrap-distance-left:9pt;mso-wrap-distance-top:3.6pt;mso-wrap-distance-right:9pt;mso-wrap-distance-bottom:3.6pt;mso-position-horizontal:absolute;mso-position-horizontal-relative:text;mso-position-vertical:absolute;mso-position-vertical-relative:text;mso-width-percent:0;mso-height-percent:0;mso-width-relative:margin;mso-height-relative:margin;v-text-anchor:top" o:gfxdata="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" filled="f" stroked="f">
+              <v:textbox>
+                <w:txbxContent>
+                  <w:p>
+                    <w:pPr>
+                      <w:spacing w:after="0" w:line="168" w:lineRule="auto"/>
+                      <w:jc w:val="both"/>
+                      <w:rPr>
+                        <w:rFonts w:ascii="Helvetica Neue W23 for SKY Reg" w:hAnsi="Helvetica Neue W23 for SKY Reg"/>
+                        <w:color w:val="FFFFFF" w:themeColor="background1"/>
+                        <w:sz w:val="32"/>
+                        <w:szCs w:val="32"/>
+                        <w:rtl/>
+                      </w:rPr>
+                    </w:pPr>
+                    <w:r>
+                      <w:rPr>
+                        <w:rFonts w:ascii="Helvetica Neue W23 for SKY Reg" w:hAnsi="Helvetica Neue W23 for SKY Reg"/>
+                        <w:color w:val="FFFFFF" w:themeColor="background1"/>
+                        <w:sz w:val="32"/>
+                        <w:szCs w:val="32"/>
+                        <w:rtl/>
+                      </w:rPr>
+                      <w:t>الإدارة العامة للتعليم</w:t>
+                    </w:r>
+                    <w:r>
+                      <w:rPr>
+                        <w:rFonts w:ascii="Helvetica Neue W23 for SKY Reg" w:hAnsi="Helvetica Neue W23 for SKY Reg" w:hint="cs"/>
+                        <w:color w:val="FFFFFF" w:themeColor="background1"/>
+                        <w:sz w:val="32"/>
+                        <w:szCs w:val="32"/>
+                        <w:rtl/>
+                      </w:rPr>
+                      <w:t xml:space="preserve"> </w:t>
+                    </w:r>
+                  </w:p>
+                  <w:p>
+                    <w:pPr>
+                      <w:spacing w:after="0" w:line="168" w:lineRule="auto"/>
+                      <w:jc w:val="both"/>
+                      <w:rPr>
+                        <w:rFonts w:ascii="Helvetica Neue W23 for SKY Reg" w:hAnsi="Helvetica Neue W23 for SKY Reg"/>
+                        <w:color w:val="04A9A6"/>
+                        <w:sz w:val="14"/>
+                        <w:szCs w:val="14"/>
+                        <w:rtl/>
+                      </w:rPr>
+                    </w:pPr>
+                  </w:p>
+                  <w:p>
+                    <w:pPr>
+                      <w:spacing w:after="0" w:line="168" w:lineRule="auto"/>
+                      <w:jc w:val="both"/>
+                      <w:rPr>
+                        <w:rFonts w:ascii="Helvetica Neue W23 for SKY Reg" w:hAnsi="Helvetica Neue W23 for SKY Reg"/>
+                        <w:color w:val="04A9A6"/>
+                        <w:sz w:val="32"/>
+                        <w:szCs w:val="32"/>
+                      </w:rPr>
+                    </w:pPr>
+                    <w:r>
+                      <w:rPr>
+                        <w:rFonts w:ascii="Helvetica Neue W23 for SKY Reg" w:hAnsi="Helvetica Neue W23 for SKY Reg"/>
+                        <w:color w:val="04A9A6"/>
+                        <w:sz w:val="32"/>
+                        <w:szCs w:val="32"/>
+                        <w:rtl/>
+                      </w:rPr>
+                      <w:t>مكتب التعليم</w:t>
+                    </w:r>
+                    <w:r>
+                      <w:rPr>
+                        <w:rFonts w:ascii="Helvetica Neue W23 for SKY Reg" w:hAnsi="Helvetica Neue W23 for SKY Reg" w:hint="cs"/>
+                        <w:color w:val="04A9A6"/>
+                        <w:sz w:val="32"/>
+                        <w:szCs w:val="32"/>
+                        <w:rtl/>
+                      </w:rPr>
+                      <w:t xml:space="preserve"> </w:t>
+                    </w:r>
+                  </w:p>
+                  <w:p>
+                    <w:pPr>
+                      <w:spacing w:after="0" w:line="168" w:lineRule="auto"/>
+                      <w:jc w:val="both"/>
+                      <w:rPr>
+                        <w:rFonts w:ascii="Helvetica Neue W23 for SKY Reg" w:hAnsi="Helvetica Neue W23 for SKY Reg"/>
+                        <w:color w:val="04A9A6"/>
+                        <w:sz w:val="32"/>
+                        <w:szCs w:val="32"/>
+                      </w:rPr>
+                    </w:pPr>
+                  </w:p>
+                </w:txbxContent>
+              </v:textbox>
+              <w10:wrap type="square"/>
+            </v:shape>
+          </w:pict>
+        </mc:Fallback>
+      </mc:AlternateContent>
+    </w:r>
+  </w:p>
+  <w:p>
+    <w:pPr>
+      <w:pStyle w:val="a3"/>
+    </w:pPr>
+  </w:p>
+  <w:p>
+    <w:pPr>
+      <w:pStyle w:val="a3"/>
+    </w:pPr>
+    <w:r>
+      <w:rPr>
+        <w:noProof/>
+        <w:rtl/>
+      </w:rPr>
+      <mc:AlternateContent>
+        <mc:Choice Requires="wps">
+          <w:drawing>
+            <wp:anchor distT="45720" distB="45720" distL="114300" distR="114300" simplePos="0" relativeHeight="251664384" behindDoc="0" locked="0" layoutInCell="1" allowOverlap="1" wp14:anchorId="6A7D9C0A" wp14:editId="22AF1F9C">
+              <wp:simplePos x="0" y="0"/>
+              <wp:positionH relativeFrom="page">
+                <wp:posOffset>2002155</wp:posOffset>
+              </wp:positionH>
+              <wp:positionV relativeFrom="paragraph">
+                <wp:posOffset>105947</wp:posOffset>
+              </wp:positionV>
+              <wp:extent cx="3556000" cy="465455"/>
+              <wp:effectExtent l="0" t="0" r="0" b="0"/>
+              <wp:wrapSquare wrapText="bothSides"/>
+              <wp:docPr id="2138136229" name="مربع نص 1958827686"/>
+              <wp:cNvGraphicFramePr>
+                <a:graphicFrameLocks xmlns:a="http://schemas.openxmlformats.org/drawingml/2006/main"/>
+              </wp:cNvGraphicFramePr>
+              <a:graphic xmlns:a="http://schemas.openxmlformats.org/drawingml/2006/main">
+                <a:graphicData uri="http://schemas.microsoft.com/office/word/2010/wordprocessingShape">
+                  <wps:wsp>
+                    <wps:cNvSpPr txBox="1">
+                      <a:spLocks noChangeArrowheads="1"/>
+                    </wps:cNvSpPr>
+                    <wps:spPr bwMode="auto">
+                      <a:xfrm flipH="1">
+                        <a:off x="0" y="0"/>
+                        <a:ext cx="3556000" cy="465455"/>
+                      </a:xfrm>
+                      <a:prstGeom prst="rect">
+                        <a:avLst/>
+                      </a:prstGeom>
+                      <a:noFill/>
+                      <a:ln w="9525">
+                        <a:noFill/>
+                        <a:miter lim="800000"/>
+                        <a:headEnd/>
+                        <a:tailEnd/>
+                      </a:ln>
+                    </wps:spPr>
+                    <wps:txbx>
+                      <w:txbxContent>
+                        <w:p>
+                          <w:pPr>
+                            <w:spacing w:after="0" w:line="240" w:lineRule="auto"/>
+                            <w:rPr>
+                              <w:rFonts w:ascii="Helvetica Neue W23 for SKY Reg" w:hAnsi="Helvetica Neue W23 for SKY Reg"/>
+                              <w:color w:val="FFFFFF" w:themeColor="background1"/>
+                              <w:sz w:val="32"/>
+                              <w:szCs w:val="32"/>
+                            </w:rPr>
+                          </w:pPr>
+                          <w:r>
+                            <w:rPr>
+                              <w:rFonts w:ascii="Helvetica Neue W23 for SKY Reg" w:hAnsi="Helvetica Neue W23 for SKY Reg"/>
+                              <w:color w:val="FFFFFF" w:themeColor="background1"/>
+                              <w:sz w:val="32"/>
+                              <w:szCs w:val="32"/>
+                              <w:rtl/>
+                            </w:rPr>
+                            <w:t>مدرسة</w:t>
+                          </w:r>
+                          <w:r>
+                            <w:rPr>
+                              <w:rFonts w:ascii="Helvetica Neue W23 for SKY Reg" w:hAnsi="Helvetica Neue W23 for SKY Reg" w:hint="cs"/>
+                              <w:color w:val="FFFFFF" w:themeColor="background1"/>
+                              <w:sz w:val="32"/>
+                              <w:szCs w:val="32"/>
+                              <w:rtl/>
+                            </w:rPr>
+                            <w:t xml:space="preserve"> </w:t>
+                          </w:r>
+                        </w:p>
+                        <w:p>
+                          <w:pPr>
+                            <w:spacing w:after="0" w:line="240" w:lineRule="auto"/>
+                            <w:rPr>
+                              <w:rFonts w:ascii="Helvetica Neue W23 for SKY Reg" w:hAnsi="Helvetica Neue W23 for SKY Reg"/>
+                              <w:color w:val="FFFFFF" w:themeColor="background1"/>
+                              <w:sz w:val="32"/>
+                              <w:szCs w:val="32"/>
+                            </w:rPr>
+                          </w:pPr>
+                        </w:p>
+                      </w:txbxContent>
+                    </wps:txbx>
+                    <wps:bodyPr rot="0" vert="horz" wrap="square" lIns="91440" tIns="45720" rIns="91440" bIns="45720" anchor="t" anchorCtr="0">
+                      <a:noAutofit/>
+                    </wps:bodyPr>
+                  </wps:wsp>
+                </a:graphicData>
+              </a:graphic>
+              <wp14:sizeRelH relativeFrom="margin">
+                <wp14:pctWidth>0</wp14:pctWidth>
+              </wp14:sizeRelH>
+              <wp14:sizeRelV relativeFrom="margin">
+                <wp14:pctHeight>0</wp14:pctHeight>
+              </wp14:sizeRelV>
+            </wp:anchor>
+          </w:drawing>
+        </mc:Choice>
+        <mc:Fallback>
+          <w:pict>
+            <v:shape w14:anchorId="6A7D9C0A" id="مربع نص 1958827686" o:spid="_x0000_s1033" type="#_x0000_t202" style="position:absolute;left:0;text-align:left;margin-left:157.65pt;margin-top:8.35pt;width:280pt;height:36.65pt;flip:x;z-index:251664384;visibility:visible;mso-wrap-style:square;mso-width-percent:0;mso-height-percent:0;mso-wrap-distance-left:9pt;mso-wrap-distance-top:3.6pt;mso-wrap-distance-right:9pt;mso-wrap-distance-bottom:3.6pt;mso-position-horizontal:absolute;mso-position-horizontal-relative:page;mso-position-vertical:absolute;mso-position-vertical-relative:text;mso-width-percent:0;mso-height-percent:0;mso-width-relative:margin;mso-height-relative:margin;v-text-anchor:top" o:gfxdata="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" filled="f" stroked="f">
+              <v:textbox>
+                <w:txbxContent>
+                  <w:p>
+                    <w:pPr>
+                      <w:spacing w:after="0" w:line="240" w:lineRule="auto"/>
+                      <w:rPr>
+                        <w:rFonts w:ascii="Helvetica Neue W23 for SKY Reg" w:hAnsi="Helvetica Neue W23 for SKY Reg"/>
+                        <w:color w:val="FFFFFF" w:themeColor="background1"/>
+                        <w:sz w:val="32"/>
+                        <w:szCs w:val="32"/>
+                      </w:rPr>
+                    </w:pPr>
+                    <w:r>
+                      <w:rPr>
+                        <w:rFonts w:ascii="Helvetica Neue W23 for SKY Reg" w:hAnsi="Helvetica Neue W23 for SKY Reg"/>
+                        <w:color w:val="FFFFFF" w:themeColor="background1"/>
+                        <w:sz w:val="32"/>
+                        <w:szCs w:val="32"/>
+                        <w:rtl/>
+                      </w:rPr>
+                      <w:t>مدرسة</w:t>
+                    </w:r>
+                    <w:r>
+                      <w:rPr>
+                        <w:rFonts w:ascii="Helvetica Neue W23 for SKY Reg" w:hAnsi="Helvetica Neue W23 for SKY Reg" w:hint="cs"/>
+                        <w:color w:val="FFFFFF" w:themeColor="background1"/>
+                        <w:sz w:val="32"/>
+                        <w:szCs w:val="32"/>
+                        <w:rtl/>
+                      </w:rPr>
+                      <w:t xml:space="preserve"> </w:t>
+                    </w:r>
+                  </w:p>
+                  <w:p>
+                    <w:pPr>
+                      <w:spacing w:after="0" w:line="240" w:lineRule="auto"/>
+                      <w:rPr>
+                        <w:rFonts w:ascii="Helvetica Neue W23 for SKY Reg" w:hAnsi="Helvetica Neue W23 for SKY Reg"/>
+                        <w:color w:val="FFFFFF" w:themeColor="background1"/>
+                        <w:sz w:val="32"/>
+                        <w:szCs w:val="32"/>
+                      </w:rPr>
+                    </w:pPr>
+                  </w:p>
+                </w:txbxContent>
+              </v:textbox>
+              <w10:wrap type="square" anchorx="page"/>
+            </v:shape>
+          </w:pict>
+        </mc:Fallback>
+      </mc:AlternateContent>
+    </w:r>
+  </w:p>
+  <w:p>
+    <w:pPr>
+      <w:pStyle w:val="a3"/>
+      <w:rPr>
+        <w:rtl/>
+      </w:rPr>
+    </w:pPr>
+  </w:p>
+  <w:p>
+    <w:pPr>
+      <w:pStyle w:val="a3"/>
+      <w:rPr>
+        <w:rtl/>
+      </w:rPr>
+    </w:pPr>
+  </w:p>
+  <w:p>
+    <w:pPr>
+      <w:pStyle w:val="a3"/>
+    </w:pPr>
+  </w:p>
+</w:hdr>
+</file>
+
+<file path=word/header3.xml><?xml version="1.0" encoding="utf-8"?>
+<w:hdr xmlns:wpc="http://schemas.microsoft.com/office/word/2010/wordprocessingCanvas" xmlns:cx="http://schemas.microsoft.com/office/drawing/2014/chartex" xmlns:cx1="http://schemas.microsoft.com/office/drawing/2015/9/8/chartex" xmlns:cx2="http://schemas.microsoft.com/office/drawing/2015/10/21/chartex" xmlns:cx3="http://schemas.microsoft.com/office/drawing/2016/5/9/chartex" xmlns:cx4="http://schemas.microsoft.com/office/drawing/2016/5/10/chartex" xmlns:cx5="http://schemas.microsoft.com/office/drawing/2016/5/11/chartex" xmlns:cx6="http://schemas.microsoft.com/office/drawing/2016/5/12/chartex" xmlns:cx7="http://schemas.microsoft.com/office/drawing/2016/5/13/chartex" xmlns:cx8="http://schemas.microsoft.com/office/drawing/2016/5/14/chartex" xmlns:mc="http://schemas.openxmlformats.org/markup-compatibility/2006" xmlns:aink="http://schemas.microsoft.com/office/drawing/2016/ink" xmlns:am3d="http://schemas.microsoft.com/office/drawing/2017/model3d" xmlns:o="urn:schemas-microsoft-com:office:office" xmlns:oel="http://schemas.microsoft.com/office/2019/extlst" xmlns:r="http://schemas.openxmlformats.org/officeDocument/2006/relationships" xmlns:m="http://schemas.openxmlformats.org/officeDocument/2006/math" xmlns:v="urn:schemas-microsoft-com:vml" xmlns:wp14="http://schemas.microsoft.com/office/word/2010/wordprocessingDrawing" xmlns:wp="http://schemas.openxmlformats.org/drawingml/2006/wordprocessingDrawing" xmlns:w10="urn:schemas-microsoft-com:office:word" xmlns:w="http://schemas.openxmlformats.org/wordprocessingml/2006/main" xmlns:w14="http://schemas.microsoft.com/office/word/2010/wordml" xmlns:w15="http://schemas.microsoft.com/office/word/2012/wordml" xmlns:w16cei="http://schemas.microsoft.com/office/word/2026/wordml/cei" xmlns:w16cex="http://schemas.microsoft.com/office/word/2018/wordml/cex" xmlns:w16cid="http://schemas.microsoft.com/office/word/2016/wordml/cid" xmlns:w16="http://schemas.microsoft.com/office/word/2018/wordml" xmlns:w16du="http://schemas.microsoft.com/office/word/2023/wordml/word16du" xmlns:w16sdtdh="http://schemas.microsoft.com/office/word/2020/wordml/sdtdatahash" xmlns:w16sdtfl="http://schemas.microsoft.com/office/word/2024/wordml/sdtformatlock" xmlns:w16se="http://schemas.microsoft.com/office/word/2015/wordml/symex" xmlns:wpg="http://schemas.microsoft.com/office/word/2010/wordprocessingGroup" xmlns:wpi="http://schemas.microsoft.com/office/word/2010/wordprocessingInk" xmlns:wne="http://schemas.microsoft.com/office/word/2006/wordml" xmlns:wps="http://schemas.microsoft.com/office/word/2010/wordprocessingShape" mc:Ignorable="w14 w15 w16se w16cid w16 w16cex w16sdtdh w16sdtfl w16du wp14">
+  <w:p>
+    <w:pPr>
+      <w:pStyle w:val="a3"/>
+      <w:rPr>
+        <w:rtl/>
+      </w:rPr>
+    </w:pPr>
+    <w:r>
+      <w:rPr>
+        <w:noProof/>
+      </w:rPr>
+      <w:drawing>
+        <wp:anchor distT="0" distB="0" distL="114300" distR="114300" simplePos="0" relativeHeight="251657216" behindDoc="1" locked="0" layoutInCell="1" allowOverlap="1" wp14:anchorId="67221C13" wp14:editId="411B1E32">
+          <wp:simplePos x="0" y="0"/>
+          <wp:positionH relativeFrom="page">
+            <wp:posOffset>4216711</wp:posOffset>
+          </wp:positionH>
+          <wp:positionV relativeFrom="paragraph">
+            <wp:posOffset>-392268</wp:posOffset>
+          </wp:positionV>
+          <wp:extent cx="1431290" cy="805180"/>
+          <wp:effectExtent l="0" t="0" r="0" b="0"/>
+          <wp:wrapTight wrapText="bothSides">
+            <wp:wrapPolygon edited="0">
+              <wp:start x="0" y="0"/>
+              <wp:lineTo x="0" y="20953"/>
+              <wp:lineTo x="21274" y="20953"/>
+              <wp:lineTo x="21274" y="0"/>
+              <wp:lineTo x="0" y="0"/>
+            </wp:wrapPolygon>
+          </wp:wrapTight>
+          <wp:docPr id="315843564" name="صورة 7"/>
+          <wp:cNvGraphicFramePr>
+            <a:graphicFrameLocks xmlns:a="http://schemas.openxmlformats.org/drawingml/2006/main" noChangeAspect="1"/>
+          </wp:cNvGraphicFramePr>
+          <a:graphic xmlns:a="http://schemas.openxmlformats.org/drawingml/2006/main">
+            <a:graphicData uri="http://schemas.openxmlformats.org/drawingml/2006/picture">
+              <pic:pic xmlns:pic="http://schemas.openxmlformats.org/drawingml/2006/picture">
+                <pic:nvPicPr>
+                  <pic:cNvPr id="315843564" name="صورة 315843564"/>
+                  <pic:cNvPicPr/>
+                </pic:nvPicPr>
+                <pic:blipFill rotWithShape="1">
+                  <a:blip r:embed="rId1">
+                    <a:extLst>
+                      <a:ext uri="{28A0092B-C50C-407E-A947-70E740481C1C}">
+                        <a14:useLocalDpi xmlns:a14="http://schemas.microsoft.com/office/drawing/2010/main" val="0"/>
+                      </a:ext>
+                    </a:extLst>
+                  </a:blip>
+                  <a:srcRect l="6350" t="11861" r="7243" b="19954"/>
+                  <a:stretch/>
+                </pic:blipFill>
+                <pic:spPr bwMode="auto">
+                  <a:xfrm>
+                    <a:off x="0" y="0"/>
+                    <a:ext cx="1431290" cy="805180"/>
+                  </a:xfrm>
+                  <a:prstGeom prst="rect">
+                    <a:avLst/>
+                  </a:prstGeom>
+                  <a:ln>
+                    <a:noFill/>
+                  </a:ln>
+                  <a:extLst>
+                    <a:ext uri="{53640926-AAD7-44D8-BBD7-CCE9431645EC}">
+                      <a14:shadowObscured xmlns:a14="http://schemas.microsoft.com/office/drawing/2010/main"/>
+                    </a:ext>
+                  </a:extLst>
+                </pic:spPr>
+              </pic:pic>
+            </a:graphicData>
+          </a:graphic>
+          <wp14:sizeRelH relativeFrom="margin">
+            <wp14:pctWidth>0</wp14:pctWidth>
+          </wp14:sizeRelH>
+          <wp14:sizeRelV relativeFrom="margin">
+            <wp14:pctHeight>0</wp14:pctHeight>
+          </wp14:sizeRelV>
+        </wp:anchor>
+      </w:drawing>
+    </w:r>
+  </w:p>
+  <w:p>
+    <w:pPr>
+      <w:pStyle w:val="a3"/>
+    </w:pPr>
+  </w:p>
+  <w:p>
+    <w:pPr>
+      <w:pStyle w:val="a3"/>
+    </w:pPr>
+    <w:r>
+      <w:rPr>
+        <w:noProof/>
+        <w:rtl/>
+      </w:rPr>
+      <mc:AlternateContent>
+        <mc:Choice Requires="wps">
+          <w:drawing>
+            <wp:anchor distT="45720" distB="45720" distL="114300" distR="114300" simplePos="0" relativeHeight="251652096" behindDoc="0" locked="0" layoutInCell="1" allowOverlap="1" wp14:anchorId="28B798F6" wp14:editId="68905B93">
+              <wp:simplePos x="0" y="0"/>
+              <wp:positionH relativeFrom="column">
+                <wp:posOffset>1883410</wp:posOffset>
+              </wp:positionH>
+              <wp:positionV relativeFrom="paragraph">
+                <wp:posOffset>140970</wp:posOffset>
+              </wp:positionV>
+              <wp:extent cx="2912745" cy="424815"/>
+              <wp:effectExtent l="0" t="0" r="0" b="0"/>
+              <wp:wrapSquare wrapText="bothSides"/>
+              <wp:docPr id="16" name="مربع نص 16"/>
+              <wp:cNvGraphicFramePr>
+                <a:graphicFrameLocks xmlns:a="http://schemas.openxmlformats.org/drawingml/2006/main"/>
+              </wp:cNvGraphicFramePr>
+              <a:graphic xmlns:a="http://schemas.openxmlformats.org/drawingml/2006/main">
+                <a:graphicData uri="http://schemas.microsoft.com/office/word/2010/wordprocessingShape">
+                  <wps:wsp>
+                    <wps:cNvSpPr txBox="1">
+                      <a:spLocks noChangeArrowheads="1"/>
+                    </wps:cNvSpPr>
+                    <wps:spPr bwMode="auto">
+                      <a:xfrm flipH="1">
+                        <a:off x="0" y="0"/>
+                        <a:ext cx="2912745" cy="424815"/>
+                      </a:xfrm>
+                      <a:prstGeom prst="rect">
+                        <a:avLst/>
+                      </a:prstGeom>
+                      <a:noFill/>
+                      <a:ln w="9525">
+                        <a:noFill/>
+                        <a:miter lim="800000"/>
+                        <a:headEnd/>
+                        <a:tailEnd/>
+                      </a:ln>
+                    </wps:spPr>
+                    <wps:txbx>
+                      <w:txbxContent>
+                        <w:p>
+                          <w:pPr>
+                            <w:spacing w:after="0" w:line="240" w:lineRule="auto"/>
+                            <w:jc w:val="center"/>
+                            <w:rPr>
+                              <w:rFonts w:ascii="Helvetica Neue W23 for SKY Reg" w:hAnsi="Helvetica Neue W23 for SKY Reg"/>
+                              <w:color w:val="FFFFFF" w:themeColor="background1"/>
+                              <w:sz w:val="32"/>
+                              <w:szCs w:val="32"/>
+                            </w:rPr>
+                          </w:pPr>
+                          <w:r>
+                            <w:rPr>
+                              <w:rFonts w:ascii="Helvetica Neue W23 for SKY Reg" w:hAnsi="Helvetica Neue W23 for SKY Reg"/>
+                              <w:color w:val="FFFFFF" w:themeColor="background1"/>
+                              <w:sz w:val="32"/>
+                              <w:szCs w:val="32"/>
+                              <w:rtl/>
+                            </w:rPr>
+                            <w:t>{{schoolDisplayName}}</w:t>
+                          </w:r>
+                        </w:p>
+                      </w:txbxContent>
+                    </wps:txbx>
+                    <wps:bodyPr rot="0" vert="horz" wrap="square" lIns="91440" tIns="45720" rIns="91440" bIns="45720" anchor="t" anchorCtr="0">
+                      <a:noAutofit/>
+                    </wps:bodyPr>
+                  </wps:wsp>
+                </a:graphicData>
+              </a:graphic>
+              <wp14:sizeRelH relativeFrom="margin">
+                <wp14:pctWidth>0</wp14:pctWidth>
+              </wp14:sizeRelH>
+              <wp14:sizeRelV relativeFrom="margin">
+                <wp14:pctHeight>0</wp14:pctHeight>
+              </wp14:sizeRelV>
+            </wp:anchor>
+          </w:drawing>
+        </mc:Choice>
+        <mc:Fallback>
+          <w:pict>
+            <v:shapetype w14:anchorId="28B798F6" id="_x0000_t202" coordsize="21600,21600" o:spt="202" path="m,l,21600r21600,l21600,xe">
+              <v:stroke joinstyle="miter"/>
+              <v:path gradientshapeok="t" o:connecttype="rect"/>
+            </v:shapetype>
+            <v:shape id="مربع نص 16" o:spid="_x0000_s1035" type="#_x0000_t202" style="position:absolute;left:0;text-align:left;margin-left:148.3pt;margin-top:11.1pt;width:229.35pt;height:33.45pt;flip:x;z-index:251652096;visibility:visible;mso-wrap-style:square;mso-width-percent:0;mso-height-percent:0;mso-wrap-distance-left:9pt;mso-wrap-distance-top:3.6pt;mso-wrap-distance-right:9pt;mso-wrap-distance-bottom:3.6pt;mso-position-horizontal:absolute;mso-position-horizontal-relative:text;mso-position-vertical:absolute;mso-position-vertical-relative:text;mso-width-percent:0;mso-height-percent:0;mso-width-relative:margin;mso-height-relative:margin;v-text-anchor:top" o:gfxdata="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" filled="f" stroked="f">
+              <v:textbox>
+                <w:txbxContent>
+                  <w:p>
+                    <w:pPr>
+                      <w:spacing w:after="0" w:line="240" w:lineRule="auto"/>
+                      <w:jc w:val="center"/>
+                      <w:rPr>
+                        <w:rFonts w:ascii="Helvetica Neue W23 for SKY Reg" w:hAnsi="Helvetica Neue W23 for SKY Reg"/>
+                        <w:color w:val="FFFFFF" w:themeColor="background1"/>
+                        <w:sz w:val="32"/>
+                        <w:szCs w:val="32"/>
+                      </w:rPr>
+                    </w:pPr>
+                    <w:r>
+                      <w:rPr>
+                        <w:rFonts w:ascii="Helvetica Neue W23 for SKY Reg" w:hAnsi="Helvetica Neue W23 for SKY Reg"/>
+                        <w:color w:val="FFFFFF" w:themeColor="background1"/>
+                        <w:sz w:val="32"/>
+                        <w:szCs w:val="32"/>
+                        <w:rtl/>
+                      </w:rPr>
+                      <w:t>{{schoolDisplayName}}</w:t>
+                    </w:r>
+                  </w:p>
+                </w:txbxContent>
+              </v:textbox>
+              <w10:wrap type="square"/>
+            </v:shape>
+          </w:pict>
+        </mc:Fallback>
+      </mc:AlternateContent>
+    </w:r>
+  </w:p>
+  <w:p>
+    <w:pPr>
+      <w:pStyle w:val="a3"/>
+      <w:rPr>
+        <w:rtl/>
+      </w:rPr>
+    </w:pPr>
+  </w:p>
+  <w:p>
+    <w:pPr>
+      <w:pStyle w:val="a3"/>
+      <w:rPr>
+        <w:rtl/>
+      </w:rPr>
+    </w:pPr>
+  </w:p>
+  <w:p>
+    <w:pPr>
+      <w:pStyle w:val="a3"/>
+      <w:rPr>
+        <w:rtl/>
+      </w:rPr>
+    </w:pPr>
+  </w:p>
+</w:hdr>
+</file>
+
+<file path=word/header4.xml><?xml version="1.0" encoding="utf-8"?>
+<w:hdr xmlns:wpc="http://schemas.microsoft.com/office/word/2010/wordprocessingCanvas" xmlns:cx="http://schemas.microsoft.com/office/drawing/2014/chartex" xmlns:cx1="http://schemas.microsoft.com/office/drawing/2015/9/8/chartex" xmlns:cx2="http://schemas.microsoft.com/office/drawing/2015/10/21/chartex" xmlns:cx3="http://schemas.microsoft.com/office/drawing/2016/5/9/chartex" xmlns:cx4="http://schemas.microsoft.com/office/drawing/2016/5/10/chartex" xmlns:cx5="http://schemas.microsoft.com/office/drawing/2016/5/11/chartex" xmlns:cx6="http://schemas.microsoft.com/office/drawing/2016/5/12/chartex" xmlns:cx7="http://schemas.microsoft.com/office/drawing/2016/5/13/chartex" xmlns:cx8="http://schemas.microsoft.com/office/drawing/2016/5/14/chartex" xmlns:mc="http://schemas.openxmlformats.org/markup-compatibility/2006" xmlns:aink="http://schemas.microsoft.com/office/drawing/2016/ink" xmlns:am3d="http://schemas.microsoft.com/office/drawing/2017/model3d" xmlns:o="urn:schemas-microsoft-com:office:office" xmlns:oel="http://schemas.microsoft.com/office/2019/extlst" xmlns:r="http://schemas.openxmlformats.org/officeDocument/2006/relationships" xmlns:m="http://schemas.openxmlformats.org/officeDocument/2006/math" xmlns:v="urn:schemas-microsoft-com:vml" xmlns:wp14="http://schemas.microsoft.com/office/word/2010/wordprocessingDrawing" xmlns:wp="http://schemas.openxmlformats.org/drawingml/2006/wordprocessingDrawing" xmlns:w10="urn:schemas-microsoft-com:office:word" xmlns:w="http://schemas.openxmlformats.org/wordprocessingml/2006/main" xmlns:w14="http://schemas.microsoft.com/office/word/2010/wordml" xmlns:w15="http://schemas.microsoft.com/office/word/2012/wordml" xmlns:w16cei="http://schemas.microsoft.com/office/word/2026/wordml/cei" xmlns:w16cex="http://schemas.microsoft.com/office/word/2018/wordml/cex" xmlns:w16cid="http://schemas.microsoft.com/office/word/2016/wordml/cid" xmlns:w16="http://schemas.microsoft.com/office/word/2018/wordml" xmlns:w16du="http://schemas.microsoft.com/office/word/2023/wordml/word16du" xmlns:w16sdtdh="http://schemas.microsoft.com/office/word/2020/wordml/sdtdatahash" xmlns:w16sdtfl="http://schemas.microsoft.com/office/word/2024/wordml/sdtformatlock" xmlns:w16se="http://schemas.microsoft.com/office/word/2015/wordml/symex" xmlns:wpg="http://schemas.microsoft.com/office/word/2010/wordprocessingGroup" xmlns:wpi="http://schemas.microsoft.com/office/word/2010/wordprocessingInk" xmlns:wne="http://schemas.microsoft.com/office/word/2006/wordml" xmlns:wps="http://schemas.microsoft.com/office/word/2010/wordprocessingShape" mc:Ignorable="w14 w15 w16se w16cid w16 w16cex w16sdtdh w16sdtfl w16du wp14">
   <w:p>
     <w:pPr>
       <w:pStyle w:val="aa"/>
@@ -2783,7 +5378,7 @@
               <v:stroke joinstyle="miter"/>
               <v:path gradientshapeok="t" o:connecttype="rect"/>
             </v:shapetype>
-            <v:shape id="مربع نص 1722858123" o:spid="_x0000_s1028" type="#_x0000_t202" style="position:absolute;margin-left:0;margin-top:.35pt;width:262.25pt;height:66pt;flip:x;z-index:251656192;visibility:visible;mso-wrap-style:square;mso-width-percent:0;mso-height-percent:0;mso-wrap-distance-left:9pt;mso-wrap-distance-top:3.6pt;mso-wrap-distance-right:9pt;mso-wrap-distance-bottom:3.6pt;mso-position-horizontal:left;mso-position-horizontal-relative:margin;mso-position-vertical:absolute;mso-position-vertical-relative:text;mso-width-percent:0;mso-height-percent:0;mso-width-relative:margin;mso-height-relative:margin;v-text-anchor:middle" o:gfxdata="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" filled="f" stroked="f">
+            <v:shape id="_x0000_s1036" type="#_x0000_t202" style="position:absolute;margin-left:0;margin-top:.35pt;width:262.25pt;height:66pt;flip:x;z-index:251656192;visibility:visible;mso-wrap-style:square;mso-width-percent:0;mso-height-percent:0;mso-wrap-distance-left:9pt;mso-wrap-distance-top:3.6pt;mso-wrap-distance-right:9pt;mso-wrap-distance-bottom:3.6pt;mso-position-horizontal:left;mso-position-horizontal-relative:margin;mso-position-vertical:absolute;mso-position-vertical-relative:text;mso-width-percent:0;mso-height-percent:0;mso-width-relative:margin;mso-height-relative:margin;v-text-anchor:middle" o:gfxdata="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" filled="f" stroked="f">
               <v:textbox inset="4pt,2pt,4pt,2pt">
                 <w:txbxContent>
                   <w:p>
@@ -3107,7 +5702,7 @@
         </mc:Choice>
         <mc:Fallback>
           <w:pict>
-            <v:shape w14:anchorId="6CCA5EC2" id="مربع نص 1958827686" o:spid="_x0000_s1029" type="#_x0000_t202" style="position:absolute;left:0;text-align:left;margin-left:0;margin-top:38pt;width:193.4pt;height:36pt;flip:x;z-index:251655168;visibility:visible;mso-wrap-style:square;mso-width-percent:0;mso-height-percent:0;mso-wrap-distance-left:9pt;mso-wrap-distance-top:3.6pt;mso-wrap-distance-right:9pt;mso-wrap-distance-bottom:3.6pt;mso-position-horizontal:center;mso-position-horizontal-relative:margin;mso-position-vertical:absolute;mso-position-vertical-relative:text;mso-width-percent:0;mso-height-percent:0;mso-width-relative:margin;mso-height-relative:margin;v-text-anchor:top" o:gfxdata="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" filled="f" stroked="f">
+            <v:shape w14:anchorId="6CCA5EC2" id="_x0000_s1037" type="#_x0000_t202" style="position:absolute;left:0;text-align:left;margin-left:0;margin-top:38pt;width:193.4pt;height:36pt;flip:x;z-index:251655168;visibility:visible;mso-wrap-style:square;mso-width-percent:0;mso-height-percent:0;mso-wrap-distance-left:9pt;mso-wrap-distance-top:3.6pt;mso-wrap-distance-right:9pt;mso-wrap-distance-bottom:3.6pt;mso-position-horizontal:center;mso-position-horizontal-relative:margin;mso-position-vertical:absolute;mso-position-vertical-relative:text;mso-width-percent:0;mso-height-percent:0;mso-width-relative:margin;mso-height-relative:margin;v-text-anchor:top" o:gfxdata="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" filled="f" stroked="f">
               <v:textbox>
                 <w:txbxContent>
                   <w:p>
@@ -3187,7 +5782,7 @@
 </file>
 
 <file path=word/numbering.xml><?xml version="1.0" encoding="utf-8"?>
-<w:numbering xmlns:wpc="http://schemas.microsoft.com/office/word/2010/wordprocessingCanvas" xmlns:cx="http://schemas.microsoft.com/office/drawing/2014/chartex" xmlns:cx1="http://schemas.microsoft.com/office/drawing/2015/9/8/chartex" xmlns:cx2="http://schemas.microsoft.com/office/drawing/2015/10/21/chartex" xmlns:cx3="http://schemas.microsoft.com/office/drawing/2016/5/9/chartex" xmlns:cx4="http://schemas.microsoft.com/office/drawing/2016/5/10/chartex" xmlns:cx5="http://schemas.microsoft.com/office/drawing/2016/5/11/chartex" xmlns:cx6="http://schemas.microsoft.com/office/drawing/2016/5/12/chartex" xmlns:cx7="http://schemas.microsoft.com/office/drawing/2016/5/13/chartex" xmlns:cx8="http://schemas.microsoft.com/office/drawing/2016/5/14/chartex" xmlns:mc="http://schemas.openxmlformats.org/markup-compatibility/2006" xmlns:aink="http://schemas.microsoft.com/office/drawing/2016/ink" xmlns:am3d="http://schemas.microsoft.com/office/drawing/2017/model3d" xmlns:o="urn:schemas-microsoft-com:office:office" xmlns:oel="http://schemas.microsoft.com/office/2019/extlst" xmlns:r="http://schemas.openxmlformats.org/officeDocument/2006/relationships" xmlns:m="http://schemas.openxmlformats.org/officeDocument/2006/math" xmlns:v="urn:schemas-microsoft-com:vml" xmlns:wp14="http://schemas.microsoft.com/office/word/2010/wordprocessingDrawing" xmlns:wp="http://schemas.openxmlformats.org/drawingml/2006/wordprocessingDrawing" xmlns:w10="urn:schemas-microsoft-com:office:word" xmlns:w="http://schemas.openxmlformats.org/wordprocessingml/2006/main" xmlns:w14="http://schemas.microsoft.com/office/word/2010/wordml" xmlns:w15="http://schemas.microsoft.com/office/word/2012/wordml" xmlns:w16cex="http://schemas.microsoft.com/office/word/2018/wordml/cex" xmlns:w16cid="http://schemas.microsoft.com/office/word/2016/wordml/cid" xmlns:w16="http://schemas.microsoft.com/office/word/2018/wordml" xmlns:w16du="http://schemas.microsoft.com/office/word/2023/wordml/word16du" xmlns:w16sdtdh="http://schemas.microsoft.com/office/word/2020/wordml/sdtdatahash" xmlns:w16sdtfl="http://schemas.microsoft.com/office/word/2024/wordml/sdtformatlock" xmlns:w16se="http://schemas.microsoft.com/office/word/2015/wordml/symex" xmlns:wpg="http://schemas.microsoft.com/office/word/2010/wordprocessingGroup" xmlns:wpi="http://schemas.microsoft.com/office/word/2010/wordprocessingInk" xmlns:wne="http://schemas.microsoft.com/office/word/2006/wordml" xmlns:wps="http://schemas.microsoft.com/office/word/2010/wordprocessingShape" mc:Ignorable="w14 w15 w16se w16cid w16 w16cex w16sdtdh w16sdtfl w16du wp14">
+<w:numbering xmlns:wpc="http://schemas.microsoft.com/office/word/2010/wordprocessingCanvas" xmlns:cx="http://schemas.microsoft.com/office/drawing/2014/chartex" xmlns:cx1="http://schemas.microsoft.com/office/drawing/2015/9/8/chartex" xmlns:cx2="http://schemas.microsoft.com/office/drawing/2015/10/21/chartex" xmlns:cx3="http://schemas.microsoft.com/office/drawing/2016/5/9/chartex" xmlns:cx4="http://schemas.microsoft.com/office/drawing/2016/5/10/chartex" xmlns:cx5="http://schemas.microsoft.com/office/drawing/2016/5/11/chartex" xmlns:cx6="http://schemas.microsoft.com/office/drawing/2016/5/12/chartex" xmlns:cx7="http://schemas.microsoft.com/office/drawing/2016/5/13/chartex" xmlns:cx8="http://schemas.microsoft.com/office/drawing/2016/5/14/chartex" xmlns:mc="http://schemas.openxmlformats.org/markup-compatibility/2006" xmlns:aink="http://schemas.microsoft.com/office/drawing/2016/ink" xmlns:am3d="http://schemas.microsoft.com/office/drawing/2017/model3d" xmlns:o="urn:schemas-microsoft-com:office:office" xmlns:oel="http://schemas.microsoft.com/office/2019/extlst" xmlns:r="http://schemas.openxmlformats.org/officeDocument/2006/relationships" xmlns:m="http://schemas.openxmlformats.org/officeDocument/2006/math" xmlns:v="urn:schemas-microsoft-com:vml" xmlns:wp14="http://schemas.microsoft.com/office/word/2010/wordprocessingDrawing" xmlns:wp="http://schemas.openxmlformats.org/drawingml/2006/wordprocessingDrawing" xmlns:w10="urn:schemas-microsoft-com:office:word" xmlns:w="http://schemas.openxmlformats.org/wordprocessingml/2006/main" xmlns:w14="http://schemas.microsoft.com/office/word/2010/wordml" xmlns:w15="http://schemas.microsoft.com/office/word/2012/wordml" xmlns:w16cei="http://schemas.microsoft.com/office/word/2026/wordml/cei" xmlns:w16cex="http://schemas.microsoft.com/office/word/2018/wordml/cex" xmlns:w16cid="http://schemas.microsoft.com/office/word/2016/wordml/cid" xmlns:w16="http://schemas.microsoft.com/office/word/2018/wordml" xmlns:w16du="http://schemas.microsoft.com/office/word/2023/wordml/word16du" xmlns:w16sdtdh="http://schemas.microsoft.com/office/word/2020/wordml/sdtdatahash" xmlns:w16sdtfl="http://schemas.microsoft.com/office/word/2024/wordml/sdtformatlock" xmlns:w16se="http://schemas.microsoft.com/office/word/2015/wordml/symex" xmlns:wpg="http://schemas.microsoft.com/office/word/2010/wordprocessingGroup" xmlns:wpi="http://schemas.microsoft.com/office/word/2010/wordprocessingInk" xmlns:wne="http://schemas.microsoft.com/office/word/2006/wordml" xmlns:wps="http://schemas.microsoft.com/office/word/2010/wordprocessingShape" mc:Ignorable="w14 w15 w16se w16cid w16 w16cex w16sdtdh w16sdtfl w16du wp14">
   <w:abstractNum w:abstractNumId="0" w15:restartNumberingAfterBreak="0">
     <w:nsid w:val="2DE31344"/>
     <w:multiLevelType w:val="multilevel"/>
@@ -4966,6 +7561,67 @@
       </w:tblBorders>
     </w:tblPr>
   </w:style>
+  <w:style w:type="paragraph" w:customStyle="1" w:styleId="MOE-Cover-Body">
+    <w:name w:val="MOE-Cover-Body"/>
+    <w:uiPriority w:val="1"/>
+    <w:qFormat/>
+    <w:pPr>
+      <w:bidi/>
+      <w:spacing w:after="0" w:line="240" w:lineRule="auto"/>
+      <w:jc w:val="right"/>
+    </w:pPr>
+    <w:rPr>
+      <w:rFonts w:ascii="Helvetica Neue W23 for SKY Reg" w:eastAsia="Helvetica Neue W23 for SKY Reg" w:hAnsi="Helvetica Neue W23 for SKY Reg" w:cs="Helvetica Neue W23 for SKY Reg"/>
+      <w:color w:val="0B3946"/>
+    </w:rPr>
+  </w:style>
+  <w:style w:type="paragraph" w:customStyle="1" w:styleId="MOE-Cover-Title">
+    <w:name w:val="MOE-Cover-Title"/>
+    <w:basedOn w:val="MOE-Cover-Body"/>
+    <w:next w:val="MOE-Cover-Subtitle"/>
+    <w:uiPriority w:val="1"/>
+    <w:qFormat/>
+    <w:pPr>
+      <w:jc w:val="center"/>
+    </w:pPr>
+    <w:rPr>
+      <w:b/>
+      <w:bCs/>
+      <w:color w:val="C1B489"/>
+      <w:sz w:val="72"/>
+      <w:szCs w:val="72"/>
+    </w:rPr>
+  </w:style>
+  <w:style w:type="paragraph" w:customStyle="1" w:styleId="MOE-Cover-Subtitle">
+    <w:name w:val="MOE-Cover-Subtitle"/>
+    <w:basedOn w:val="MOE-Cover-Body"/>
+    <w:next w:val="MOE-Cover-Body"/>
+    <w:uiPriority w:val="1"/>
+    <w:qFormat/>
+    <w:pPr>
+      <w:jc w:val="center"/>
+    </w:pPr>
+    <w:rPr>
+      <w:b/>
+      <w:bCs/>
+      <w:color w:val="C1B489"/>
+      <w:sz w:val="36"/>
+      <w:szCs w:val="36"/>
+    </w:rPr>
+  </w:style>
+  <w:style w:type="paragraph" w:customStyle="1" w:styleId="MOE-Cover-NoSpacing">
+    <w:name w:val="MOE-Cover-NoSpacing"/>
+    <w:uiPriority w:val="1"/>
+    <w:qFormat/>
+    <w:rsid w:val="002B4419"/>
+    <w:pPr>
+      <w:bidi/>
+      <w:spacing w:after="0" w:line="240" w:lineRule="auto"/>
+    </w:pPr>
+    <w:rPr>
+      <w:rFonts w:eastAsiaTheme="minorEastAsia"/>
+    </w:rPr>
+  </w:style>
 </w:styles>
 </file>
 

</xml_diff>